<commit_message>
Adicionado link de Diagrama de Contexto
Adicionado o link para Diagrama de Contexto - Eduverse.png, abaixo de sua imagem no documento em "1.3 Diagrama de Contexto (C4 Nível 1)".
</commit_message>
<xml_diff>
--- a/docs/Documento de Arquitetura - EduVerse.docx
+++ b/docs/Documento de Arquitetura - EduVerse.docx
@@ -919,15 +919,37 @@
         <w:jc w:val="center"/>
         <w:rPr>
           <w:color w:val="000000"/>
-          <w:sz w:val="24"/>
-        </w:rPr>
-      </w:pPr>
-      <w:r>
-        <w:rPr>
-          <w:color w:val="000000"/>
-          <w:sz w:val="24"/>
+          <w:sz w:val="16"/>
+          <w:szCs w:val="16"/>
+        </w:rPr>
+      </w:pPr>
+      <w:r>
+        <w:rPr>
+          <w:b/>
+          <w:bCs/>
+          <w:color w:val="000000"/>
+          <w:sz w:val="16"/>
+          <w:szCs w:val="16"/>
         </w:rPr>
         <w:t>Disponível em:</w:t>
+      </w:r>
+      <w:r>
+        <w:rPr>
+          <w:b/>
+          <w:bCs/>
+          <w:color w:val="000000"/>
+          <w:sz w:val="16"/>
+          <w:szCs w:val="16"/>
+        </w:rPr>
+        <w:t xml:space="preserve"> </w:t>
+      </w:r>
+      <w:r>
+        <w:rPr>
+          <w:color w:val="000000"/>
+          <w:sz w:val="16"/>
+          <w:szCs w:val="16"/>
+        </w:rPr>
+        <w:t>https://github.com/BraionDLucca/Mini-Projeto-O-Arquiteto-Decisor/blob/main/diagrams/Diagrama%20de%20Contexto/Diagrama%20de%20Contexto%20-%20EduVerse.png</w:t>
       </w:r>
     </w:p>
     <w:p>
@@ -2893,23 +2915,7 @@
             <w:sz w:val="24"/>
             <w:u w:val="single"/>
           </w:rPr>
-          <w:t>https://adr.git</w:t>
-        </w:r>
-        <w:r>
-          <w:rPr>
-            <w:color w:val="0563C1"/>
-            <w:sz w:val="24"/>
-            <w:u w:val="single"/>
-          </w:rPr>
-          <w:t>h</w:t>
-        </w:r>
-        <w:r>
-          <w:rPr>
-            <w:color w:val="0563C1"/>
-            <w:sz w:val="24"/>
-            <w:u w:val="single"/>
-          </w:rPr>
-          <w:t>ub.io/</w:t>
+          <w:t>https://adr.github.io/</w:t>
         </w:r>
       </w:hyperlink>
     </w:p>

</xml_diff>

<commit_message>
Preenchido Ciclo 2, adicionados Diagrama de Containers e ADR_002
- Preenchida seção "Ciclo 2" do "Documento de Arquitetura - EduVerse", e adicionados "Diagrama de Containers - EduVerse.png" e "ADR_002.md"

- Deletado arquivo .drawio, somente imagens de diagramas serão inseridas de agora em diante

- Nova pasta /diagrams/C4 Model armazenará diagramas C4
</commit_message>
<xml_diff>
--- a/docs/Documento de Arquitetura - EduVerse.docx
+++ b/docs/Documento de Arquitetura - EduVerse.docx
@@ -444,7 +444,7 @@
         <w:pStyle w:val="PargrafodaLista"/>
         <w:numPr>
           <w:ilvl w:val="0"/>
-          <w:numId w:val="2"/>
+          <w:numId w:val="24"/>
         </w:numPr>
         <w:spacing w:after="80" w:line="360" w:lineRule="auto"/>
         <w:jc w:val="both"/>
@@ -464,7 +464,7 @@
         <w:pStyle w:val="PargrafodaLista"/>
         <w:numPr>
           <w:ilvl w:val="0"/>
-          <w:numId w:val="2"/>
+          <w:numId w:val="24"/>
         </w:numPr>
         <w:spacing w:after="80" w:line="360" w:lineRule="auto"/>
         <w:jc w:val="both"/>
@@ -537,7 +537,7 @@
         <w:pStyle w:val="PargrafodaLista"/>
         <w:numPr>
           <w:ilvl w:val="0"/>
-          <w:numId w:val="2"/>
+          <w:numId w:val="23"/>
         </w:numPr>
         <w:spacing w:after="80" w:line="360" w:lineRule="auto"/>
         <w:jc w:val="both"/>
@@ -557,7 +557,7 @@
         <w:pStyle w:val="PargrafodaLista"/>
         <w:numPr>
           <w:ilvl w:val="0"/>
-          <w:numId w:val="2"/>
+          <w:numId w:val="23"/>
         </w:numPr>
         <w:spacing w:after="80" w:line="360" w:lineRule="auto"/>
         <w:jc w:val="both"/>
@@ -597,7 +597,7 @@
         <w:pStyle w:val="PargrafodaLista"/>
         <w:numPr>
           <w:ilvl w:val="0"/>
-          <w:numId w:val="2"/>
+          <w:numId w:val="23"/>
         </w:numPr>
         <w:spacing w:after="80" w:line="360" w:lineRule="auto"/>
         <w:jc w:val="both"/>
@@ -617,7 +617,7 @@
         <w:pStyle w:val="PargrafodaLista"/>
         <w:numPr>
           <w:ilvl w:val="0"/>
-          <w:numId w:val="2"/>
+          <w:numId w:val="23"/>
         </w:numPr>
         <w:spacing w:after="80" w:line="360" w:lineRule="auto"/>
         <w:jc w:val="both"/>
@@ -637,7 +637,7 @@
         <w:pStyle w:val="PargrafodaLista"/>
         <w:numPr>
           <w:ilvl w:val="0"/>
-          <w:numId w:val="2"/>
+          <w:numId w:val="23"/>
         </w:numPr>
         <w:spacing w:after="80" w:line="360" w:lineRule="auto"/>
         <w:jc w:val="both"/>
@@ -1686,15 +1686,16 @@
     <w:p>
       <w:pPr>
         <w:spacing w:after="60"/>
+        <w:jc w:val="center"/>
       </w:pPr>
       <w:r>
         <w:rPr>
           <w:noProof/>
         </w:rPr>
         <w:drawing>
-          <wp:inline distT="0" distB="0" distL="0" distR="0" wp14:anchorId="26BB5B42" wp14:editId="6CDC8473">
-            <wp:extent cx="5579745" cy="3988535"/>
-            <wp:effectExtent l="0" t="0" r="1905" b="0"/>
+          <wp:inline distT="0" distB="0" distL="0" distR="0" wp14:anchorId="26BB5B42" wp14:editId="09102D2E">
+            <wp:extent cx="5547286" cy="3965331"/>
+            <wp:effectExtent l="0" t="0" r="0" b="0"/>
             <wp:docPr id="1" name="Imagem 1"/>
             <wp:cNvGraphicFramePr>
               <a:graphicFrameLocks xmlns:a="http://schemas.openxmlformats.org/drawingml/2006/main" noChangeAspect="1"/>
@@ -1715,7 +1716,7 @@
                   <pic:spPr>
                     <a:xfrm>
                       <a:off x="0" y="0"/>
-                      <a:ext cx="5579745" cy="3988535"/>
+                      <a:ext cx="5620947" cy="4017986"/>
                     </a:xfrm>
                     <a:prstGeom prst="rect">
                       <a:avLst/>
@@ -2006,35 +2007,32 @@
     </w:p>
     <w:p>
       <w:pPr>
-        <w:spacing w:after="60"/>
-      </w:pPr>
-      <w:r>
-        <w:rPr>
-          <w:rFonts w:ascii="Calibri" w:eastAsia="Calibri" w:hAnsi="Calibri" w:cs="Calibri"/>
-          <w:color w:val="444444"/>
-        </w:rPr>
-        <w:t>Preencher e entregar no AVA ao final do Ciclo 2.</w:t>
-      </w:r>
-    </w:p>
-    <w:p>
-      <w:pPr>
-        <w:spacing w:after="24"/>
-      </w:pPr>
-    </w:p>
-    <w:p>
-      <w:pPr>
         <w:pBdr>
           <w:bottom w:val="single" w:sz="8" w:space="4" w:color="000000"/>
         </w:pBdr>
         <w:spacing w:before="240" w:after="60"/>
-      </w:pPr>
-      <w:r>
         <w:rPr>
           <w:rFonts w:ascii="Courier New" w:eastAsia="Courier New" w:hAnsi="Courier New" w:cs="Courier New"/>
           <w:color w:val="444444"/>
           <w:sz w:val="22"/>
           <w:szCs w:val="22"/>
         </w:rPr>
+      </w:pPr>
+    </w:p>
+    <w:p>
+      <w:pPr>
+        <w:pBdr>
+          <w:bottom w:val="single" w:sz="8" w:space="4" w:color="000000"/>
+        </w:pBdr>
+        <w:spacing w:before="240" w:after="60"/>
+      </w:pPr>
+      <w:r>
+        <w:rPr>
+          <w:rFonts w:ascii="Courier New" w:eastAsia="Courier New" w:hAnsi="Courier New" w:cs="Courier New"/>
+          <w:color w:val="444444"/>
+          <w:sz w:val="22"/>
+          <w:szCs w:val="22"/>
+        </w:rPr>
         <w:t xml:space="preserve">2.1 </w:t>
       </w:r>
       <w:r>
@@ -2053,6 +2051,58 @@
       <w:pPr>
         <w:spacing w:after="12"/>
       </w:pPr>
+    </w:p>
+    <w:p>
+      <w:pPr>
+        <w:spacing w:after="24"/>
+        <w:jc w:val="center"/>
+      </w:pPr>
+      <w:r>
+        <w:rPr>
+          <w:noProof/>
+        </w:rPr>
+        <w:drawing>
+          <wp:inline distT="0" distB="0" distL="0" distR="0" wp14:anchorId="16F72F8C" wp14:editId="3D5555F9">
+            <wp:extent cx="5566908" cy="4791456"/>
+            <wp:effectExtent l="0" t="0" r="0" b="0"/>
+            <wp:docPr id="5" name="Imagem 5"/>
+            <wp:cNvGraphicFramePr>
+              <a:graphicFrameLocks xmlns:a="http://schemas.openxmlformats.org/drawingml/2006/main" noChangeAspect="1"/>
+            </wp:cNvGraphicFramePr>
+            <a:graphic xmlns:a="http://schemas.openxmlformats.org/drawingml/2006/main">
+              <a:graphicData uri="http://schemas.openxmlformats.org/drawingml/2006/picture">
+                <pic:pic xmlns:pic="http://schemas.openxmlformats.org/drawingml/2006/picture">
+                  <pic:nvPicPr>
+                    <pic:cNvPr id="5" name="Imagem 5"/>
+                    <pic:cNvPicPr/>
+                  </pic:nvPicPr>
+                  <pic:blipFill>
+                    <a:blip r:embed="rId13" cstate="print">
+                      <a:extLst>
+                        <a:ext uri="{28A0092B-C50C-407E-A947-70E740481C1C}">
+                          <a14:useLocalDpi xmlns:a14="http://schemas.microsoft.com/office/drawing/2010/main" val="0"/>
+                        </a:ext>
+                      </a:extLst>
+                    </a:blip>
+                    <a:stretch>
+                      <a:fillRect/>
+                    </a:stretch>
+                  </pic:blipFill>
+                  <pic:spPr>
+                    <a:xfrm>
+                      <a:off x="0" y="0"/>
+                      <a:ext cx="5585160" cy="4807165"/>
+                    </a:xfrm>
+                    <a:prstGeom prst="rect">
+                      <a:avLst/>
+                    </a:prstGeom>
+                  </pic:spPr>
+                </pic:pic>
+              </a:graphicData>
+            </a:graphic>
+          </wp:inline>
+        </w:drawing>
+      </w:r>
     </w:p>
     <w:p>
       <w:pPr>
@@ -2063,72 +2113,7 @@
         <w:spacing w:before="120" w:after="120"/>
       </w:pPr>
       <w:r>
-        <w:rPr>
-          <w:rFonts w:ascii="Calibri" w:eastAsia="Calibri" w:hAnsi="Calibri" w:cs="Calibri"/>
-          <w:caps/>
-          <w:color w:val="444444"/>
-          <w:sz w:val="18"/>
-          <w:szCs w:val="18"/>
-        </w:rPr>
-        <w:t>[</w:t>
-      </w:r>
-      <w:proofErr w:type="gramStart"/>
-      <w:r>
-        <w:rPr>
-          <w:rFonts w:ascii="Calibri" w:eastAsia="Calibri" w:hAnsi="Calibri" w:cs="Calibri"/>
-          <w:caps/>
-          <w:color w:val="444444"/>
-          <w:sz w:val="18"/>
-          <w:szCs w:val="18"/>
-        </w:rPr>
-        <w:t xml:space="preserve">PENDENTE]  </w:t>
-      </w:r>
-      <w:r>
-        <w:rPr>
-          <w:rFonts w:ascii="Georgia" w:eastAsia="Georgia" w:hAnsi="Georgia" w:cs="Georgia"/>
-          <w:i/>
-          <w:iCs/>
-          <w:color w:val="CC0000"/>
-          <w:sz w:val="22"/>
-          <w:szCs w:val="22"/>
-        </w:rPr>
-        <w:t>Insira</w:t>
-      </w:r>
-      <w:proofErr w:type="gramEnd"/>
-      <w:r>
-        <w:rPr>
-          <w:rFonts w:ascii="Georgia" w:eastAsia="Georgia" w:hAnsi="Georgia" w:cs="Georgia"/>
-          <w:i/>
-          <w:iCs/>
-          <w:color w:val="CC0000"/>
-          <w:sz w:val="22"/>
-          <w:szCs w:val="22"/>
-        </w:rPr>
-        <w:t xml:space="preserve"> aqui a imagem do seu Diagrama de Containers (C4 Nível 2). Este diagrama deve detalhar a estrutura interna do sistema, mostrando os principais containers (aplicações, bancos de dados, filas, etc.) e suas interações. Recomendado: Salvar o diagrama em /</w:t>
-      </w:r>
-      <w:proofErr w:type="spellStart"/>
-      <w:r>
-        <w:rPr>
-          <w:rFonts w:ascii="Georgia" w:eastAsia="Georgia" w:hAnsi="Georgia" w:cs="Georgia"/>
-          <w:i/>
-          <w:iCs/>
-          <w:color w:val="CC0000"/>
-          <w:sz w:val="22"/>
-          <w:szCs w:val="22"/>
-        </w:rPr>
-        <w:t>diagrams</w:t>
-      </w:r>
-      <w:proofErr w:type="spellEnd"/>
-      <w:r>
-        <w:rPr>
-          <w:rFonts w:ascii="Georgia" w:eastAsia="Georgia" w:hAnsi="Georgia" w:cs="Georgia"/>
-          <w:i/>
-          <w:iCs/>
-          <w:color w:val="CC0000"/>
-          <w:sz w:val="22"/>
-          <w:szCs w:val="22"/>
-        </w:rPr>
-        <w:t xml:space="preserve"> no GitHub e referenciar o link da imagem aqui.</w:t>
+        <w:t xml:space="preserve">Fonte: Elaborado pelo autor (2026). Disponível em: </w:t>
       </w:r>
     </w:p>
     <w:p>
@@ -2166,8 +2151,1291 @@
     </w:p>
     <w:p>
       <w:pPr>
-        <w:spacing w:after="12"/>
-      </w:pPr>
+        <w:spacing w:after="80" w:line="360" w:lineRule="auto"/>
+        <w:jc w:val="both"/>
+      </w:pPr>
+      <w:r>
+        <w:rPr>
+          <w:rFonts w:ascii="Georgia" w:eastAsia="Georgia" w:hAnsi="Georgia" w:cs="Georgia"/>
+          <w:color w:val="000000"/>
+          <w:sz w:val="23"/>
+          <w:szCs w:val="23"/>
+        </w:rPr>
+        <w:t>Foi escolhida a arquitetura monolítica modular por conta de sua baixa complexidade, maior produtividade de desenvolvimento e menos código inicial sem impedir evolução para arquiteturas mais distribuídas no futuro.</w:t>
+      </w:r>
+    </w:p>
+    <w:p>
+      <w:r>
+        <w:br w:type="page"/>
+      </w:r>
+    </w:p>
+    <w:p>
+      <w:pPr>
+        <w:pBdr>
+          <w:bottom w:val="thick" w:sz="10" w:space="4" w:color="000000"/>
+        </w:pBdr>
+        <w:spacing w:before="280" w:after="120" w:line="300" w:lineRule="auto"/>
+      </w:pPr>
+      <w:r>
+        <w:rPr>
+          <w:rFonts w:ascii="Courier New" w:eastAsia="Courier New" w:hAnsi="Courier New" w:cs="Courier New"/>
+          <w:color w:val="555555"/>
+          <w:sz w:val="22"/>
+          <w:szCs w:val="22"/>
+        </w:rPr>
+        <w:lastRenderedPageBreak/>
+        <w:t xml:space="preserve">2.2.1 </w:t>
+      </w:r>
+      <w:r>
+        <w:rPr>
+          <w:rFonts w:ascii="Georgia" w:eastAsia="Georgia" w:hAnsi="Georgia" w:cs="Georgia"/>
+          <w:b/>
+          <w:bCs/>
+          <w:color w:val="000000"/>
+          <w:sz w:val="24"/>
+          <w:szCs w:val="24"/>
+        </w:rPr>
+        <w:t>Trade-</w:t>
+      </w:r>
+      <w:proofErr w:type="spellStart"/>
+      <w:r>
+        <w:rPr>
+          <w:rFonts w:ascii="Georgia" w:eastAsia="Georgia" w:hAnsi="Georgia" w:cs="Georgia"/>
+          <w:b/>
+          <w:bCs/>
+          <w:color w:val="000000"/>
+          <w:sz w:val="24"/>
+          <w:szCs w:val="24"/>
+        </w:rPr>
+        <w:t>offs</w:t>
+      </w:r>
+      <w:proofErr w:type="spellEnd"/>
+      <w:r>
+        <w:rPr>
+          <w:rFonts w:ascii="Georgia" w:eastAsia="Georgia" w:hAnsi="Georgia" w:cs="Georgia"/>
+          <w:b/>
+          <w:bCs/>
+          <w:color w:val="000000"/>
+          <w:sz w:val="24"/>
+          <w:szCs w:val="24"/>
+        </w:rPr>
+        <w:t xml:space="preserve"> — Prós</w:t>
+      </w:r>
+    </w:p>
+    <w:p>
+      <w:pPr>
+        <w:spacing w:after="80"/>
+      </w:pPr>
+    </w:p>
+    <w:p>
+      <w:pPr>
+        <w:pStyle w:val="PargrafodaLista"/>
+        <w:numPr>
+          <w:ilvl w:val="0"/>
+          <w:numId w:val="18"/>
+        </w:numPr>
+        <w:spacing w:before="40" w:after="40" w:line="360" w:lineRule="auto"/>
+        <w:jc w:val="both"/>
+      </w:pPr>
+      <w:r>
+        <w:rPr>
+          <w:rFonts w:ascii="Georgia" w:eastAsia="Georgia" w:hAnsi="Georgia" w:cs="Georgia"/>
+          <w:color w:val="000000"/>
+          <w:sz w:val="23"/>
+          <w:szCs w:val="23"/>
+        </w:rPr>
+        <w:t>Executa chamadas internas no mesmo processo, evitando comunicação via rede.</w:t>
+      </w:r>
+    </w:p>
+    <w:p>
+      <w:pPr>
+        <w:pStyle w:val="PargrafodaLista"/>
+        <w:numPr>
+          <w:ilvl w:val="0"/>
+          <w:numId w:val="18"/>
+        </w:numPr>
+        <w:spacing w:before="40" w:after="40" w:line="360" w:lineRule="auto"/>
+        <w:jc w:val="both"/>
+      </w:pPr>
+      <w:r>
+        <w:rPr>
+          <w:rFonts w:ascii="Georgia" w:eastAsia="Georgia" w:hAnsi="Georgia" w:cs="Georgia"/>
+          <w:color w:val="000000"/>
+          <w:sz w:val="23"/>
+          <w:szCs w:val="23"/>
+        </w:rPr>
+        <w:t>Possibilita isolar módulos críticos para futura extração ou otimização.</w:t>
+      </w:r>
+    </w:p>
+    <w:p>
+      <w:pPr>
+        <w:pStyle w:val="PargrafodaLista"/>
+        <w:numPr>
+          <w:ilvl w:val="0"/>
+          <w:numId w:val="18"/>
+        </w:numPr>
+        <w:spacing w:before="40" w:after="40" w:line="360" w:lineRule="auto"/>
+        <w:jc w:val="both"/>
+      </w:pPr>
+      <w:r>
+        <w:rPr>
+          <w:rFonts w:ascii="Georgia" w:eastAsia="Georgia" w:hAnsi="Georgia" w:cs="Georgia"/>
+          <w:color w:val="000000"/>
+          <w:sz w:val="23"/>
+          <w:szCs w:val="23"/>
+        </w:rPr>
+        <w:t>Baixa complexidade inicial melhora legibilidade e entendimento do sistema.</w:t>
+      </w:r>
+    </w:p>
+    <w:p>
+      <w:pPr>
+        <w:spacing w:after="80"/>
+      </w:pPr>
+    </w:p>
+    <w:p>
+      <w:pPr>
+        <w:pBdr>
+          <w:bottom w:val="thick" w:sz="10" w:space="4" w:color="000000"/>
+        </w:pBdr>
+        <w:spacing w:before="280" w:after="120" w:line="300" w:lineRule="auto"/>
+      </w:pPr>
+      <w:r>
+        <w:rPr>
+          <w:rFonts w:ascii="Courier New" w:eastAsia="Courier New" w:hAnsi="Courier New" w:cs="Courier New"/>
+          <w:color w:val="555555"/>
+          <w:sz w:val="22"/>
+          <w:szCs w:val="22"/>
+        </w:rPr>
+        <w:t xml:space="preserve">2.2.2 </w:t>
+      </w:r>
+      <w:r>
+        <w:rPr>
+          <w:rFonts w:ascii="Georgia" w:eastAsia="Georgia" w:hAnsi="Georgia" w:cs="Georgia"/>
+          <w:b/>
+          <w:bCs/>
+          <w:color w:val="000000"/>
+          <w:sz w:val="24"/>
+          <w:szCs w:val="24"/>
+        </w:rPr>
+        <w:t>Trade-</w:t>
+      </w:r>
+      <w:proofErr w:type="spellStart"/>
+      <w:r>
+        <w:rPr>
+          <w:rFonts w:ascii="Georgia" w:eastAsia="Georgia" w:hAnsi="Georgia" w:cs="Georgia"/>
+          <w:b/>
+          <w:bCs/>
+          <w:color w:val="000000"/>
+          <w:sz w:val="24"/>
+          <w:szCs w:val="24"/>
+        </w:rPr>
+        <w:t>offs</w:t>
+      </w:r>
+      <w:proofErr w:type="spellEnd"/>
+      <w:r>
+        <w:rPr>
+          <w:rFonts w:ascii="Georgia" w:eastAsia="Georgia" w:hAnsi="Georgia" w:cs="Georgia"/>
+          <w:b/>
+          <w:bCs/>
+          <w:color w:val="000000"/>
+          <w:sz w:val="24"/>
+          <w:szCs w:val="24"/>
+        </w:rPr>
+        <w:t xml:space="preserve"> — Contras</w:t>
+      </w:r>
+    </w:p>
+    <w:p>
+      <w:pPr>
+        <w:spacing w:after="80"/>
+      </w:pPr>
+    </w:p>
+    <w:p>
+      <w:pPr>
+        <w:pStyle w:val="PargrafodaLista"/>
+        <w:numPr>
+          <w:ilvl w:val="0"/>
+          <w:numId w:val="20"/>
+        </w:numPr>
+        <w:spacing w:before="40" w:after="40" w:line="360" w:lineRule="auto"/>
+        <w:jc w:val="both"/>
+      </w:pPr>
+      <w:r>
+        <w:rPr>
+          <w:rFonts w:ascii="Georgia" w:eastAsia="Georgia" w:hAnsi="Georgia" w:cs="Georgia"/>
+          <w:color w:val="000000"/>
+          <w:sz w:val="23"/>
+          <w:szCs w:val="23"/>
+        </w:rPr>
+        <w:t xml:space="preserve">O padrão exige disciplina arquitetural rigorosa para evitar a degradação em uma "big </w:t>
+      </w:r>
+      <w:proofErr w:type="spellStart"/>
+      <w:r>
+        <w:rPr>
+          <w:rFonts w:ascii="Georgia" w:eastAsia="Georgia" w:hAnsi="Georgia" w:cs="Georgia"/>
+          <w:color w:val="000000"/>
+          <w:sz w:val="23"/>
+          <w:szCs w:val="23"/>
+        </w:rPr>
+        <w:t>ball</w:t>
+      </w:r>
+      <w:proofErr w:type="spellEnd"/>
+      <w:r>
+        <w:rPr>
+          <w:rFonts w:ascii="Georgia" w:eastAsia="Georgia" w:hAnsi="Georgia" w:cs="Georgia"/>
+          <w:color w:val="000000"/>
+          <w:sz w:val="23"/>
+          <w:szCs w:val="23"/>
+        </w:rPr>
+        <w:t xml:space="preserve"> of </w:t>
+      </w:r>
+      <w:proofErr w:type="spellStart"/>
+      <w:r>
+        <w:rPr>
+          <w:rFonts w:ascii="Georgia" w:eastAsia="Georgia" w:hAnsi="Georgia" w:cs="Georgia"/>
+          <w:color w:val="000000"/>
+          <w:sz w:val="23"/>
+          <w:szCs w:val="23"/>
+        </w:rPr>
+        <w:t>mud</w:t>
+      </w:r>
+      <w:proofErr w:type="spellEnd"/>
+      <w:r>
+        <w:rPr>
+          <w:rFonts w:ascii="Georgia" w:eastAsia="Georgia" w:hAnsi="Georgia" w:cs="Georgia"/>
+          <w:color w:val="000000"/>
+          <w:sz w:val="23"/>
+          <w:szCs w:val="23"/>
+        </w:rPr>
+        <w:t>".</w:t>
+      </w:r>
+    </w:p>
+    <w:p>
+      <w:pPr>
+        <w:pStyle w:val="PargrafodaLista"/>
+        <w:numPr>
+          <w:ilvl w:val="0"/>
+          <w:numId w:val="20"/>
+        </w:numPr>
+        <w:spacing w:before="40" w:after="40" w:line="360" w:lineRule="auto"/>
+        <w:jc w:val="both"/>
+      </w:pPr>
+      <w:r>
+        <w:rPr>
+          <w:rFonts w:ascii="Georgia" w:eastAsia="Georgia" w:hAnsi="Georgia" w:cs="Georgia"/>
+          <w:color w:val="000000"/>
+          <w:sz w:val="23"/>
+          <w:szCs w:val="23"/>
+        </w:rPr>
+        <w:t>A escalabilidade é limitada ao nível do sistema como um todo, não sendo possível escalar módulos de forma independente.</w:t>
+      </w:r>
+    </w:p>
+    <w:p>
+      <w:pPr>
+        <w:pStyle w:val="PargrafodaLista"/>
+        <w:numPr>
+          <w:ilvl w:val="0"/>
+          <w:numId w:val="20"/>
+        </w:numPr>
+        <w:spacing w:before="40" w:after="40" w:line="360" w:lineRule="auto"/>
+        <w:jc w:val="both"/>
+      </w:pPr>
+      <w:r>
+        <w:rPr>
+          <w:rFonts w:ascii="Georgia" w:eastAsia="Georgia" w:hAnsi="Georgia" w:cs="Georgia"/>
+          <w:color w:val="000000"/>
+          <w:sz w:val="23"/>
+          <w:szCs w:val="23"/>
+        </w:rPr>
+        <w:t>O acoplamento pode aumentar ao longo do tempo caso não sejam aplicadas boas práticas de modularização.</w:t>
+      </w:r>
+    </w:p>
+    <w:p>
+      <w:pPr>
+        <w:spacing w:after="80"/>
+      </w:pPr>
+    </w:p>
+    <w:p>
+      <w:pPr>
+        <w:pBdr>
+          <w:bottom w:val="thick" w:sz="10" w:space="4" w:color="000000"/>
+        </w:pBdr>
+        <w:spacing w:before="280" w:after="120" w:line="300" w:lineRule="auto"/>
+      </w:pPr>
+      <w:r>
+        <w:rPr>
+          <w:rFonts w:ascii="Courier New" w:eastAsia="Courier New" w:hAnsi="Courier New" w:cs="Courier New"/>
+          <w:color w:val="555555"/>
+          <w:sz w:val="22"/>
+          <w:szCs w:val="22"/>
+        </w:rPr>
+        <w:t xml:space="preserve">2.2.3 </w:t>
+      </w:r>
+      <w:r>
+        <w:rPr>
+          <w:rFonts w:ascii="Georgia" w:eastAsia="Georgia" w:hAnsi="Georgia" w:cs="Georgia"/>
+          <w:b/>
+          <w:bCs/>
+          <w:color w:val="000000"/>
+          <w:sz w:val="24"/>
+          <w:szCs w:val="24"/>
+        </w:rPr>
+        <w:t>Relação com os RNFs Priorizados</w:t>
+      </w:r>
+    </w:p>
+    <w:p>
+      <w:pPr>
+        <w:spacing w:after="80"/>
+      </w:pPr>
+    </w:p>
+    <w:p>
+      <w:pPr>
+        <w:spacing w:after="80" w:line="360" w:lineRule="auto"/>
+        <w:jc w:val="both"/>
+      </w:pPr>
+      <w:r>
+        <w:rPr>
+          <w:rFonts w:ascii="Georgia" w:eastAsia="Georgia" w:hAnsi="Georgia" w:cs="Georgia"/>
+          <w:color w:val="000000"/>
+          <w:sz w:val="23"/>
+          <w:szCs w:val="23"/>
+        </w:rPr>
+        <w:t xml:space="preserve">Sua baixa curva de aprendizado e simplicidade permitirá fácil entendimento e manutenção do sistema, além da introdução de novos desenvolvedores sem muitas complicações. Além disso é possível aplicar práticas de outras arquiteturas, como a hexagonal ou de </w:t>
+      </w:r>
+      <w:proofErr w:type="spellStart"/>
+      <w:r>
+        <w:rPr>
+          <w:rFonts w:ascii="Georgia" w:eastAsia="Georgia" w:hAnsi="Georgia" w:cs="Georgia"/>
+          <w:color w:val="000000"/>
+          <w:sz w:val="23"/>
+          <w:szCs w:val="23"/>
+        </w:rPr>
+        <w:t>microsserviços</w:t>
+      </w:r>
+      <w:proofErr w:type="spellEnd"/>
+      <w:r>
+        <w:rPr>
+          <w:rFonts w:ascii="Georgia" w:eastAsia="Georgia" w:hAnsi="Georgia" w:cs="Georgia"/>
+          <w:color w:val="000000"/>
+          <w:sz w:val="23"/>
+          <w:szCs w:val="23"/>
+        </w:rPr>
+        <w:t>, em módulos isolados, permitindo otimização e isolamento lógico de partes críticas. Também apresenta mais performance em comparação com outras arquiteturas pois evita comunicação via rede e camadas extras, executando chamadas diretas dentro do mesmo processo, reduzindo latência e overhead.</w:t>
+      </w:r>
+    </w:p>
+    <w:p>
+      <w:pPr>
+        <w:spacing w:after="80"/>
+      </w:pPr>
+    </w:p>
+    <w:p>
+      <w:pPr>
+        <w:spacing w:after="80" w:line="360" w:lineRule="auto"/>
+        <w:jc w:val="both"/>
+      </w:pPr>
+      <w:r>
+        <w:rPr>
+          <w:rFonts w:ascii="Georgia" w:eastAsia="Georgia" w:hAnsi="Georgia" w:cs="Georgia"/>
+          <w:color w:val="000000"/>
+          <w:sz w:val="23"/>
+          <w:szCs w:val="23"/>
+        </w:rPr>
+        <w:t xml:space="preserve">Mesmo seus benefícios sendo extremamente relevantes para os estágios iniciais do EduVerse, é reconhecido que o funcionamento desse padrão exige disciplina rigorosa para que o sistema não se torne uma "big </w:t>
+      </w:r>
+      <w:proofErr w:type="spellStart"/>
+      <w:r>
+        <w:rPr>
+          <w:rFonts w:ascii="Georgia" w:eastAsia="Georgia" w:hAnsi="Georgia" w:cs="Georgia"/>
+          <w:color w:val="000000"/>
+          <w:sz w:val="23"/>
+          <w:szCs w:val="23"/>
+        </w:rPr>
+        <w:t>ball</w:t>
+      </w:r>
+      <w:proofErr w:type="spellEnd"/>
+      <w:r>
+        <w:rPr>
+          <w:rFonts w:ascii="Georgia" w:eastAsia="Georgia" w:hAnsi="Georgia" w:cs="Georgia"/>
+          <w:color w:val="000000"/>
+          <w:sz w:val="23"/>
+          <w:szCs w:val="23"/>
+        </w:rPr>
+        <w:t xml:space="preserve"> of </w:t>
+      </w:r>
+      <w:proofErr w:type="spellStart"/>
+      <w:r>
+        <w:rPr>
+          <w:rFonts w:ascii="Georgia" w:eastAsia="Georgia" w:hAnsi="Georgia" w:cs="Georgia"/>
+          <w:color w:val="000000"/>
+          <w:sz w:val="23"/>
+          <w:szCs w:val="23"/>
+        </w:rPr>
+        <w:t>mud</w:t>
+      </w:r>
+      <w:proofErr w:type="spellEnd"/>
+      <w:r>
+        <w:rPr>
+          <w:rFonts w:ascii="Georgia" w:eastAsia="Georgia" w:hAnsi="Georgia" w:cs="Georgia"/>
+          <w:color w:val="000000"/>
+          <w:sz w:val="23"/>
+          <w:szCs w:val="23"/>
+        </w:rPr>
+        <w:t xml:space="preserve">". Para contornar isso podem ser aplicadas diversas táticas e metodologias, como </w:t>
+      </w:r>
+      <w:proofErr w:type="spellStart"/>
+      <w:r>
+        <w:rPr>
+          <w:rFonts w:ascii="Georgia" w:eastAsia="Georgia" w:hAnsi="Georgia" w:cs="Georgia"/>
+          <w:color w:val="000000"/>
+          <w:sz w:val="23"/>
+          <w:szCs w:val="23"/>
+        </w:rPr>
+        <w:t>Behaviour</w:t>
+      </w:r>
+      <w:proofErr w:type="spellEnd"/>
+      <w:r>
+        <w:rPr>
+          <w:rFonts w:ascii="Georgia" w:eastAsia="Georgia" w:hAnsi="Georgia" w:cs="Georgia"/>
+          <w:color w:val="000000"/>
+          <w:sz w:val="23"/>
+          <w:szCs w:val="23"/>
+        </w:rPr>
+        <w:t xml:space="preserve"> </w:t>
+      </w:r>
+      <w:proofErr w:type="spellStart"/>
+      <w:r>
+        <w:rPr>
+          <w:rFonts w:ascii="Georgia" w:eastAsia="Georgia" w:hAnsi="Georgia" w:cs="Georgia"/>
+          <w:color w:val="000000"/>
+          <w:sz w:val="23"/>
+          <w:szCs w:val="23"/>
+        </w:rPr>
+        <w:t>Driven</w:t>
+      </w:r>
+      <w:proofErr w:type="spellEnd"/>
+      <w:r>
+        <w:rPr>
+          <w:rFonts w:ascii="Georgia" w:eastAsia="Georgia" w:hAnsi="Georgia" w:cs="Georgia"/>
+          <w:color w:val="000000"/>
+          <w:sz w:val="23"/>
+          <w:szCs w:val="23"/>
+        </w:rPr>
+        <w:t xml:space="preserve"> </w:t>
+      </w:r>
+      <w:proofErr w:type="spellStart"/>
+      <w:r>
+        <w:rPr>
+          <w:rFonts w:ascii="Georgia" w:eastAsia="Georgia" w:hAnsi="Georgia" w:cs="Georgia"/>
+          <w:color w:val="000000"/>
+          <w:sz w:val="23"/>
+          <w:szCs w:val="23"/>
+        </w:rPr>
+        <w:t>Development</w:t>
+      </w:r>
+      <w:proofErr w:type="spellEnd"/>
+      <w:r>
+        <w:rPr>
+          <w:rFonts w:ascii="Georgia" w:eastAsia="Georgia" w:hAnsi="Georgia" w:cs="Georgia"/>
+          <w:color w:val="000000"/>
+          <w:sz w:val="23"/>
+          <w:szCs w:val="23"/>
+        </w:rPr>
+        <w:t xml:space="preserve"> (BDD) para reforçar metas de qualidade (</w:t>
+      </w:r>
+      <w:proofErr w:type="spellStart"/>
+      <w:r>
+        <w:rPr>
+          <w:rFonts w:ascii="Georgia" w:eastAsia="Georgia" w:hAnsi="Georgia" w:cs="Georgia"/>
+          <w:color w:val="000000"/>
+          <w:sz w:val="23"/>
+          <w:szCs w:val="23"/>
+        </w:rPr>
+        <w:t>Definition</w:t>
+      </w:r>
+      <w:proofErr w:type="spellEnd"/>
+      <w:r>
+        <w:rPr>
+          <w:rFonts w:ascii="Georgia" w:eastAsia="Georgia" w:hAnsi="Georgia" w:cs="Georgia"/>
+          <w:color w:val="000000"/>
+          <w:sz w:val="23"/>
+          <w:szCs w:val="23"/>
+        </w:rPr>
+        <w:t xml:space="preserve"> of </w:t>
+      </w:r>
+      <w:proofErr w:type="spellStart"/>
+      <w:r>
+        <w:rPr>
+          <w:rFonts w:ascii="Georgia" w:eastAsia="Georgia" w:hAnsi="Georgia" w:cs="Georgia"/>
+          <w:color w:val="000000"/>
+          <w:sz w:val="23"/>
+          <w:szCs w:val="23"/>
+        </w:rPr>
+        <w:t>Done</w:t>
+      </w:r>
+      <w:proofErr w:type="spellEnd"/>
+      <w:r>
+        <w:rPr>
+          <w:rFonts w:ascii="Georgia" w:eastAsia="Georgia" w:hAnsi="Georgia" w:cs="Georgia"/>
+          <w:color w:val="000000"/>
+          <w:sz w:val="23"/>
+          <w:szCs w:val="23"/>
+        </w:rPr>
+        <w:t xml:space="preserve">), contratos de padrões de projeto por meio de um artefato SQAP, </w:t>
+      </w:r>
+      <w:proofErr w:type="spellStart"/>
+      <w:r>
+        <w:rPr>
+          <w:rFonts w:ascii="Georgia" w:eastAsia="Georgia" w:hAnsi="Georgia" w:cs="Georgia"/>
+          <w:color w:val="000000"/>
+          <w:sz w:val="23"/>
+          <w:szCs w:val="23"/>
+        </w:rPr>
+        <w:t>Defect</w:t>
+      </w:r>
+      <w:proofErr w:type="spellEnd"/>
+      <w:r>
+        <w:rPr>
+          <w:rFonts w:ascii="Georgia" w:eastAsia="Georgia" w:hAnsi="Georgia" w:cs="Georgia"/>
+          <w:color w:val="000000"/>
+          <w:sz w:val="23"/>
+          <w:szCs w:val="23"/>
+        </w:rPr>
+        <w:t xml:space="preserve"> </w:t>
+      </w:r>
+      <w:proofErr w:type="spellStart"/>
+      <w:r>
+        <w:rPr>
+          <w:rFonts w:ascii="Georgia" w:eastAsia="Georgia" w:hAnsi="Georgia" w:cs="Georgia"/>
+          <w:color w:val="000000"/>
+          <w:sz w:val="23"/>
+          <w:szCs w:val="23"/>
+        </w:rPr>
+        <w:t>Prevention</w:t>
+      </w:r>
+      <w:proofErr w:type="spellEnd"/>
+      <w:r>
+        <w:rPr>
+          <w:rFonts w:ascii="Georgia" w:eastAsia="Georgia" w:hAnsi="Georgia" w:cs="Georgia"/>
+          <w:color w:val="000000"/>
+          <w:sz w:val="23"/>
+          <w:szCs w:val="23"/>
+        </w:rPr>
+        <w:t xml:space="preserve"> </w:t>
+      </w:r>
+      <w:proofErr w:type="spellStart"/>
+      <w:r>
+        <w:rPr>
+          <w:rFonts w:ascii="Georgia" w:eastAsia="Georgia" w:hAnsi="Georgia" w:cs="Georgia"/>
+          <w:color w:val="000000"/>
+          <w:sz w:val="23"/>
+          <w:szCs w:val="23"/>
+        </w:rPr>
+        <w:t>Process</w:t>
+      </w:r>
+      <w:proofErr w:type="spellEnd"/>
+      <w:r>
+        <w:rPr>
+          <w:rFonts w:ascii="Georgia" w:eastAsia="Georgia" w:hAnsi="Georgia" w:cs="Georgia"/>
+          <w:color w:val="000000"/>
+          <w:sz w:val="23"/>
+          <w:szCs w:val="23"/>
+        </w:rPr>
+        <w:t xml:space="preserve"> (DPP) junto de ciclo PDCA para melhoria contínua, entre outras.</w:t>
+      </w:r>
+      <w:r>
+        <w:rPr>
+          <w:rFonts w:ascii="Georgia" w:eastAsia="Georgia" w:hAnsi="Georgia" w:cs="Georgia"/>
+          <w:color w:val="000000"/>
+          <w:sz w:val="23"/>
+          <w:szCs w:val="23"/>
+        </w:rPr>
+        <w:br w:type="page"/>
+      </w:r>
+    </w:p>
+    <w:p>
+      <w:pPr>
+        <w:pBdr>
+          <w:bottom w:val="thick" w:sz="10" w:space="4" w:color="000000"/>
+        </w:pBdr>
+        <w:spacing w:before="280" w:after="120" w:line="300" w:lineRule="auto"/>
+        <w:rPr>
+          <w:lang w:val="en-US"/>
+        </w:rPr>
+      </w:pPr>
+      <w:r>
+        <w:rPr>
+          <w:rFonts w:ascii="Courier New" w:eastAsia="Courier New" w:hAnsi="Courier New" w:cs="Courier New"/>
+          <w:color w:val="555555"/>
+          <w:sz w:val="22"/>
+          <w:szCs w:val="22"/>
+          <w:lang w:val="en-US"/>
+        </w:rPr>
+        <w:lastRenderedPageBreak/>
+        <w:t xml:space="preserve">2.3 </w:t>
+      </w:r>
+      <w:r>
+        <w:rPr>
+          <w:rFonts w:ascii="Georgia" w:eastAsia="Georgia" w:hAnsi="Georgia" w:cs="Georgia"/>
+          <w:b/>
+          <w:bCs/>
+          <w:color w:val="000000"/>
+          <w:sz w:val="24"/>
+          <w:szCs w:val="24"/>
+          <w:lang w:val="en-US"/>
+        </w:rPr>
+        <w:t>Architecture Decision Record (ADR) Principal</w:t>
+      </w:r>
+    </w:p>
+    <w:p>
+      <w:pPr>
+        <w:spacing w:after="80"/>
+        <w:rPr>
+          <w:lang w:val="en-US"/>
+        </w:rPr>
+      </w:pPr>
+    </w:p>
+    <w:p>
+      <w:pPr>
+        <w:pBdr>
+          <w:left w:val="thick" w:sz="24" w:space="8" w:color="000000"/>
+        </w:pBdr>
+        <w:shd w:val="clear" w:color="auto" w:fill="F2F2F2"/>
+        <w:spacing w:before="80" w:after="40" w:line="300" w:lineRule="auto"/>
+        <w:ind w:left="160" w:right="160"/>
+      </w:pPr>
+      <w:r>
+        <w:rPr>
+          <w:rFonts w:ascii="Courier New" w:eastAsia="Courier New" w:hAnsi="Courier New" w:cs="Courier New"/>
+          <w:b/>
+          <w:bCs/>
+          <w:color w:val="000000"/>
+          <w:sz w:val="22"/>
+          <w:szCs w:val="22"/>
+        </w:rPr>
+        <w:t>ADR 002</w:t>
+      </w:r>
+      <w:r>
+        <w:rPr>
+          <w:rFonts w:ascii="Georgia" w:eastAsia="Georgia" w:hAnsi="Georgia" w:cs="Georgia"/>
+          <w:b/>
+          <w:bCs/>
+          <w:color w:val="000000"/>
+          <w:sz w:val="23"/>
+          <w:szCs w:val="23"/>
+        </w:rPr>
+        <w:t xml:space="preserve">:  Adoção de arquitetura poliglota de persistência com MySQL, </w:t>
+      </w:r>
+      <w:proofErr w:type="spellStart"/>
+      <w:r>
+        <w:rPr>
+          <w:rFonts w:ascii="Georgia" w:eastAsia="Georgia" w:hAnsi="Georgia" w:cs="Georgia"/>
+          <w:b/>
+          <w:bCs/>
+          <w:color w:val="000000"/>
+          <w:sz w:val="23"/>
+          <w:szCs w:val="23"/>
+        </w:rPr>
+        <w:t>MongoDB</w:t>
+      </w:r>
+      <w:proofErr w:type="spellEnd"/>
+      <w:r>
+        <w:rPr>
+          <w:rFonts w:ascii="Georgia" w:eastAsia="Georgia" w:hAnsi="Georgia" w:cs="Georgia"/>
+          <w:b/>
+          <w:bCs/>
+          <w:color w:val="000000"/>
+          <w:sz w:val="23"/>
+          <w:szCs w:val="23"/>
+        </w:rPr>
+        <w:t xml:space="preserve"> e Redis no EduVerse</w:t>
+      </w:r>
+    </w:p>
+    <w:p>
+      <w:pPr>
+        <w:spacing w:after="80" w:line="360" w:lineRule="auto"/>
+        <w:jc w:val="both"/>
+        <w:rPr>
+          <w:rFonts w:ascii="Georgia" w:eastAsia="Georgia" w:hAnsi="Georgia" w:cs="Georgia"/>
+          <w:b/>
+          <w:bCs/>
+          <w:color w:val="000000"/>
+        </w:rPr>
+      </w:pPr>
+    </w:p>
+    <w:p>
+      <w:pPr>
+        <w:spacing w:after="80" w:line="360" w:lineRule="auto"/>
+        <w:jc w:val="both"/>
+        <w:rPr>
+          <w:rFonts w:ascii="Georgia" w:eastAsia="Georgia" w:hAnsi="Georgia" w:cs="Georgia"/>
+          <w:b/>
+          <w:bCs/>
+          <w:color w:val="000000"/>
+          <w:sz w:val="23"/>
+          <w:szCs w:val="23"/>
+        </w:rPr>
+      </w:pPr>
+      <w:r>
+        <w:rPr>
+          <w:rFonts w:ascii="Georgia" w:eastAsia="Georgia" w:hAnsi="Georgia" w:cs="Georgia"/>
+          <w:b/>
+          <w:bCs/>
+          <w:color w:val="000000"/>
+          <w:sz w:val="23"/>
+          <w:szCs w:val="23"/>
+        </w:rPr>
+        <w:t xml:space="preserve">Status: </w:t>
+      </w:r>
+      <w:r>
+        <w:rPr>
+          <w:rFonts w:ascii="Georgia" w:eastAsia="Georgia" w:hAnsi="Georgia" w:cs="Georgia"/>
+          <w:color w:val="000000"/>
+          <w:sz w:val="23"/>
+          <w:szCs w:val="23"/>
+        </w:rPr>
+        <w:t>Aceito</w:t>
+      </w:r>
+    </w:p>
+    <w:p>
+      <w:pPr>
+        <w:spacing w:after="80" w:line="360" w:lineRule="auto"/>
+        <w:jc w:val="both"/>
+        <w:rPr>
+          <w:rFonts w:eastAsia="Georgia"/>
+          <w:b/>
+          <w:bCs/>
+          <w:color w:val="000000"/>
+        </w:rPr>
+      </w:pPr>
+    </w:p>
+    <w:p>
+      <w:pPr>
+        <w:spacing w:after="80" w:line="360" w:lineRule="auto"/>
+        <w:jc w:val="both"/>
+      </w:pPr>
+      <w:r>
+        <w:rPr>
+          <w:rFonts w:ascii="Georgia" w:eastAsia="Georgia" w:hAnsi="Georgia" w:cs="Georgia"/>
+          <w:b/>
+          <w:bCs/>
+          <w:color w:val="000000"/>
+          <w:sz w:val="23"/>
+          <w:szCs w:val="23"/>
+        </w:rPr>
+        <w:t xml:space="preserve">Contexto: </w:t>
+      </w:r>
+      <w:r>
+        <w:rPr>
+          <w:rFonts w:ascii="Georgia" w:eastAsia="Georgia" w:hAnsi="Georgia" w:cs="Georgia"/>
+          <w:color w:val="000000"/>
+          <w:sz w:val="23"/>
+          <w:szCs w:val="23"/>
+        </w:rPr>
+        <w:t>A plataforma EduVerse precisa lidar com diferentes tipos de dados, como informações estruturadas de usuários e cursos, registros de atividades em grande volume e dados temporários para melhorar performance e experiência do usuário. A escolha do banco de dados impacta diretamente a escalabilidade, performance, manutenibilidade e flexibilidade do sistema, principalmente considerando o uso de IA para personalização e possível alto volume de acessos simultâneos.</w:t>
+      </w:r>
+    </w:p>
+    <w:p>
+      <w:pPr>
+        <w:spacing w:after="80"/>
+      </w:pPr>
+    </w:p>
+    <w:p>
+      <w:pPr>
+        <w:spacing w:after="80" w:line="360" w:lineRule="auto"/>
+        <w:jc w:val="both"/>
+      </w:pPr>
+      <w:r>
+        <w:rPr>
+          <w:rFonts w:ascii="Georgia" w:eastAsia="Georgia" w:hAnsi="Georgia" w:cs="Georgia"/>
+          <w:b/>
+          <w:bCs/>
+          <w:color w:val="000000"/>
+          <w:sz w:val="23"/>
+          <w:szCs w:val="23"/>
+        </w:rPr>
+        <w:t xml:space="preserve">Decisão: </w:t>
+      </w:r>
+      <w:r>
+        <w:rPr>
+          <w:rFonts w:ascii="Georgia" w:eastAsia="Georgia" w:hAnsi="Georgia" w:cs="Georgia"/>
+          <w:color w:val="000000"/>
+          <w:sz w:val="23"/>
+          <w:szCs w:val="23"/>
+        </w:rPr>
+        <w:t xml:space="preserve">Foi decidida a utilização dos seguintes bancos SQL e </w:t>
+      </w:r>
+      <w:proofErr w:type="spellStart"/>
+      <w:r>
+        <w:rPr>
+          <w:rFonts w:ascii="Georgia" w:eastAsia="Georgia" w:hAnsi="Georgia" w:cs="Georgia"/>
+          <w:color w:val="000000"/>
+          <w:sz w:val="23"/>
+          <w:szCs w:val="23"/>
+        </w:rPr>
+        <w:t>NoSQL</w:t>
+      </w:r>
+      <w:proofErr w:type="spellEnd"/>
+      <w:r>
+        <w:rPr>
+          <w:rFonts w:ascii="Georgia" w:eastAsia="Georgia" w:hAnsi="Georgia" w:cs="Georgia"/>
+          <w:color w:val="000000"/>
+          <w:sz w:val="23"/>
+          <w:szCs w:val="23"/>
+        </w:rPr>
+        <w:t>:</w:t>
+      </w:r>
+    </w:p>
+    <w:p>
+      <w:pPr>
+        <w:pStyle w:val="PargrafodaLista"/>
+        <w:numPr>
+          <w:ilvl w:val="0"/>
+          <w:numId w:val="22"/>
+        </w:numPr>
+        <w:spacing w:before="40" w:after="40" w:line="360" w:lineRule="auto"/>
+        <w:jc w:val="both"/>
+      </w:pPr>
+      <w:r>
+        <w:rPr>
+          <w:rFonts w:ascii="Georgia" w:eastAsia="Georgia" w:hAnsi="Georgia" w:cs="Georgia"/>
+          <w:b/>
+          <w:bCs/>
+          <w:color w:val="000000"/>
+          <w:sz w:val="23"/>
+          <w:szCs w:val="23"/>
+        </w:rPr>
+        <w:t xml:space="preserve">MySQL </w:t>
+      </w:r>
+      <w:r>
+        <w:rPr>
+          <w:rFonts w:ascii="Georgia" w:eastAsia="Georgia" w:hAnsi="Georgia" w:cs="Georgia"/>
+          <w:color w:val="000000"/>
+          <w:sz w:val="23"/>
+          <w:szCs w:val="23"/>
+        </w:rPr>
+        <w:t>para dados estruturados e transacionais do sistema (entidades principais como usuários, cursos, trilhas de aprendizado, avaliações e progresso).</w:t>
+      </w:r>
+    </w:p>
+    <w:p>
+      <w:pPr>
+        <w:pStyle w:val="PargrafodaLista"/>
+        <w:numPr>
+          <w:ilvl w:val="0"/>
+          <w:numId w:val="22"/>
+        </w:numPr>
+        <w:spacing w:before="40" w:after="40" w:line="360" w:lineRule="auto"/>
+        <w:jc w:val="both"/>
+      </w:pPr>
+      <w:proofErr w:type="spellStart"/>
+      <w:r>
+        <w:rPr>
+          <w:rFonts w:ascii="Georgia" w:eastAsia="Georgia" w:hAnsi="Georgia" w:cs="Georgia"/>
+          <w:b/>
+          <w:bCs/>
+          <w:color w:val="000000"/>
+          <w:sz w:val="23"/>
+          <w:szCs w:val="23"/>
+        </w:rPr>
+        <w:t>MongoDB</w:t>
+      </w:r>
+      <w:proofErr w:type="spellEnd"/>
+      <w:r>
+        <w:rPr>
+          <w:rFonts w:ascii="Georgia" w:eastAsia="Georgia" w:hAnsi="Georgia" w:cs="Georgia"/>
+          <w:b/>
+          <w:bCs/>
+          <w:color w:val="000000"/>
+          <w:sz w:val="23"/>
+          <w:szCs w:val="23"/>
+        </w:rPr>
+        <w:t xml:space="preserve"> </w:t>
+      </w:r>
+      <w:r>
+        <w:rPr>
+          <w:rFonts w:ascii="Georgia" w:eastAsia="Georgia" w:hAnsi="Georgia" w:cs="Georgia"/>
+          <w:color w:val="000000"/>
+          <w:sz w:val="23"/>
+          <w:szCs w:val="23"/>
+        </w:rPr>
+        <w:t xml:space="preserve">para armazenamento de logs, eventos e dados </w:t>
+      </w:r>
+      <w:proofErr w:type="spellStart"/>
+      <w:r>
+        <w:rPr>
+          <w:rFonts w:ascii="Georgia" w:eastAsia="Georgia" w:hAnsi="Georgia" w:cs="Georgia"/>
+          <w:color w:val="000000"/>
+          <w:sz w:val="23"/>
+          <w:szCs w:val="23"/>
+        </w:rPr>
+        <w:t>semi-estruturados</w:t>
+      </w:r>
+      <w:proofErr w:type="spellEnd"/>
+      <w:r>
+        <w:rPr>
+          <w:rFonts w:ascii="Georgia" w:eastAsia="Georgia" w:hAnsi="Georgia" w:cs="Georgia"/>
+          <w:color w:val="000000"/>
+          <w:sz w:val="23"/>
+          <w:szCs w:val="23"/>
+        </w:rPr>
+        <w:t xml:space="preserve"> gerados pela plataforma (como interações do usuário, telemetria e histórico de uso para análise e IA).</w:t>
+      </w:r>
+    </w:p>
+    <w:p>
+      <w:pPr>
+        <w:pStyle w:val="PargrafodaLista"/>
+        <w:numPr>
+          <w:ilvl w:val="0"/>
+          <w:numId w:val="22"/>
+        </w:numPr>
+        <w:spacing w:before="40" w:after="40" w:line="360" w:lineRule="auto"/>
+        <w:jc w:val="both"/>
+      </w:pPr>
+      <w:r>
+        <w:rPr>
+          <w:rFonts w:ascii="Georgia" w:eastAsia="Georgia" w:hAnsi="Georgia" w:cs="Georgia"/>
+          <w:b/>
+          <w:bCs/>
+          <w:color w:val="000000"/>
+          <w:sz w:val="23"/>
+          <w:szCs w:val="23"/>
+        </w:rPr>
+        <w:t xml:space="preserve">Redis </w:t>
+      </w:r>
+      <w:r>
+        <w:rPr>
+          <w:rFonts w:ascii="Georgia" w:eastAsia="Georgia" w:hAnsi="Georgia" w:cs="Georgia"/>
+          <w:color w:val="000000"/>
+          <w:sz w:val="23"/>
+          <w:szCs w:val="23"/>
+        </w:rPr>
+        <w:t>como camada de cache para otimização de performance, armazenando dados temporários como sessões de usuário, recomendações recentes e resultados frequentes de consultas.</w:t>
+      </w:r>
+    </w:p>
+    <w:p>
+      <w:pPr>
+        <w:spacing w:after="80" w:line="360" w:lineRule="auto"/>
+        <w:jc w:val="both"/>
+      </w:pPr>
+      <w:r>
+        <w:rPr>
+          <w:rFonts w:ascii="Georgia" w:eastAsia="Georgia" w:hAnsi="Georgia" w:cs="Georgia"/>
+          <w:color w:val="000000"/>
+          <w:sz w:val="23"/>
+          <w:szCs w:val="23"/>
+        </w:rPr>
+        <w:t>Essa abordagem permite aproveitar os pontos fortes de cada tecnologia, garantindo consistência onde é necessário e alta performance onde há maior volume e menor rigidez estrutural.</w:t>
+      </w:r>
+    </w:p>
+    <w:p>
+      <w:pPr>
+        <w:spacing w:after="80"/>
+      </w:pPr>
+    </w:p>
+    <w:p>
+      <w:pPr>
+        <w:spacing w:after="80" w:line="360" w:lineRule="auto"/>
+        <w:jc w:val="both"/>
+      </w:pPr>
+      <w:r>
+        <w:rPr>
+          <w:rFonts w:ascii="Georgia" w:eastAsia="Georgia" w:hAnsi="Georgia" w:cs="Georgia"/>
+          <w:b/>
+          <w:bCs/>
+          <w:color w:val="000000"/>
+          <w:sz w:val="23"/>
+          <w:szCs w:val="23"/>
+        </w:rPr>
+        <w:t>Consequências (Trade-</w:t>
+      </w:r>
+      <w:proofErr w:type="spellStart"/>
+      <w:r>
+        <w:rPr>
+          <w:rFonts w:ascii="Georgia" w:eastAsia="Georgia" w:hAnsi="Georgia" w:cs="Georgia"/>
+          <w:b/>
+          <w:bCs/>
+          <w:color w:val="000000"/>
+          <w:sz w:val="23"/>
+          <w:szCs w:val="23"/>
+        </w:rPr>
+        <w:t>offs</w:t>
+      </w:r>
+      <w:proofErr w:type="spellEnd"/>
+      <w:r>
+        <w:rPr>
+          <w:rFonts w:ascii="Georgia" w:eastAsia="Georgia" w:hAnsi="Georgia" w:cs="Georgia"/>
+          <w:b/>
+          <w:bCs/>
+          <w:color w:val="000000"/>
+          <w:sz w:val="23"/>
+          <w:szCs w:val="23"/>
+        </w:rPr>
+        <w:t>)</w:t>
+      </w:r>
+    </w:p>
+    <w:p>
+      <w:pPr>
+        <w:spacing w:after="80" w:line="360" w:lineRule="auto"/>
+        <w:jc w:val="both"/>
+      </w:pPr>
+      <w:r>
+        <w:rPr>
+          <w:rFonts w:ascii="Georgia" w:eastAsia="Georgia" w:hAnsi="Georgia" w:cs="Georgia"/>
+          <w:b/>
+          <w:bCs/>
+          <w:color w:val="000000"/>
+          <w:sz w:val="23"/>
+          <w:szCs w:val="23"/>
+        </w:rPr>
+        <w:t>Ganhos:</w:t>
+      </w:r>
+    </w:p>
+    <w:p>
+      <w:pPr>
+        <w:pStyle w:val="PargrafodaLista"/>
+        <w:numPr>
+          <w:ilvl w:val="0"/>
+          <w:numId w:val="14"/>
+        </w:numPr>
+        <w:spacing w:before="40" w:after="40" w:line="360" w:lineRule="auto"/>
+        <w:jc w:val="both"/>
+      </w:pPr>
+      <w:r>
+        <w:rPr>
+          <w:rFonts w:ascii="Georgia" w:eastAsia="Georgia" w:hAnsi="Georgia" w:cs="Georgia"/>
+          <w:color w:val="000000"/>
+          <w:sz w:val="23"/>
+          <w:szCs w:val="23"/>
+        </w:rPr>
+        <w:t>Uso de MySQL garante consistência, integridade e suporte a relacionamentos complexos entre entidades acadêmicas.</w:t>
+      </w:r>
+    </w:p>
+    <w:p>
+      <w:pPr>
+        <w:pStyle w:val="PargrafodaLista"/>
+        <w:numPr>
+          <w:ilvl w:val="0"/>
+          <w:numId w:val="14"/>
+        </w:numPr>
+        <w:spacing w:before="40" w:after="40" w:line="360" w:lineRule="auto"/>
+        <w:jc w:val="both"/>
+      </w:pPr>
+      <w:r>
+        <w:rPr>
+          <w:rFonts w:ascii="Georgia" w:eastAsia="Georgia" w:hAnsi="Georgia" w:cs="Georgia"/>
+          <w:color w:val="000000"/>
+          <w:sz w:val="23"/>
+          <w:szCs w:val="23"/>
+        </w:rPr>
+        <w:t xml:space="preserve">Uso de </w:t>
+      </w:r>
+      <w:proofErr w:type="spellStart"/>
+      <w:r>
+        <w:rPr>
+          <w:rFonts w:ascii="Georgia" w:eastAsia="Georgia" w:hAnsi="Georgia" w:cs="Georgia"/>
+          <w:color w:val="000000"/>
+          <w:sz w:val="23"/>
+          <w:szCs w:val="23"/>
+        </w:rPr>
+        <w:t>MongoDB</w:t>
+      </w:r>
+      <w:proofErr w:type="spellEnd"/>
+      <w:r>
+        <w:rPr>
+          <w:rFonts w:ascii="Georgia" w:eastAsia="Georgia" w:hAnsi="Georgia" w:cs="Georgia"/>
+          <w:color w:val="000000"/>
+          <w:sz w:val="23"/>
+          <w:szCs w:val="23"/>
+        </w:rPr>
+        <w:t xml:space="preserve"> permite alta escalabilidade para escrita de logs e flexibilidade para armazenar dados variados de interação e IA.</w:t>
+      </w:r>
+    </w:p>
+    <w:p>
+      <w:pPr>
+        <w:pStyle w:val="PargrafodaLista"/>
+        <w:numPr>
+          <w:ilvl w:val="0"/>
+          <w:numId w:val="14"/>
+        </w:numPr>
+        <w:spacing w:before="40" w:after="40" w:line="360" w:lineRule="auto"/>
+        <w:jc w:val="both"/>
+      </w:pPr>
+      <w:r>
+        <w:rPr>
+          <w:rFonts w:ascii="Georgia" w:eastAsia="Georgia" w:hAnsi="Georgia" w:cs="Georgia"/>
+          <w:color w:val="000000"/>
+          <w:sz w:val="23"/>
+          <w:szCs w:val="23"/>
+        </w:rPr>
+        <w:lastRenderedPageBreak/>
+        <w:t>Uso de Redis melhora significativamente a performance do sistema ao reduzir latência em consultas frequentes e dados repetidos.</w:t>
+      </w:r>
+    </w:p>
+    <w:p>
+      <w:pPr>
+        <w:pStyle w:val="PargrafodaLista"/>
+        <w:numPr>
+          <w:ilvl w:val="0"/>
+          <w:numId w:val="14"/>
+        </w:numPr>
+        <w:spacing w:before="40" w:after="40" w:line="360" w:lineRule="auto"/>
+        <w:jc w:val="both"/>
+      </w:pPr>
+      <w:r>
+        <w:rPr>
+          <w:rFonts w:ascii="Georgia" w:eastAsia="Georgia" w:hAnsi="Georgia" w:cs="Georgia"/>
+          <w:color w:val="000000"/>
+          <w:sz w:val="23"/>
+          <w:szCs w:val="23"/>
+        </w:rPr>
+        <w:t>Maior adequação do sistema aos requisitos de escalabilidade e performance da plataforma EduVerse.</w:t>
+      </w:r>
+    </w:p>
+    <w:p>
+      <w:pPr>
+        <w:spacing w:after="80" w:line="360" w:lineRule="auto"/>
+        <w:jc w:val="both"/>
+      </w:pPr>
+      <w:r>
+        <w:rPr>
+          <w:rFonts w:ascii="Georgia" w:eastAsia="Georgia" w:hAnsi="Georgia" w:cs="Georgia"/>
+          <w:b/>
+          <w:bCs/>
+          <w:color w:val="000000"/>
+          <w:sz w:val="23"/>
+          <w:szCs w:val="23"/>
+        </w:rPr>
+        <w:t>Perdas:</w:t>
+      </w:r>
+    </w:p>
+    <w:p>
+      <w:pPr>
+        <w:pStyle w:val="PargrafodaLista"/>
+        <w:numPr>
+          <w:ilvl w:val="0"/>
+          <w:numId w:val="15"/>
+        </w:numPr>
+        <w:spacing w:before="40" w:after="40" w:line="360" w:lineRule="auto"/>
+        <w:jc w:val="both"/>
+      </w:pPr>
+      <w:r>
+        <w:rPr>
+          <w:rFonts w:ascii="Georgia" w:eastAsia="Georgia" w:hAnsi="Georgia" w:cs="Georgia"/>
+          <w:color w:val="000000"/>
+          <w:sz w:val="23"/>
+          <w:szCs w:val="23"/>
+        </w:rPr>
+        <w:t>Maior complexidade arquitetural e operacional, exigindo mais esforço de manutenção e monitoramento.</w:t>
+      </w:r>
+    </w:p>
+    <w:p>
+      <w:pPr>
+        <w:pStyle w:val="PargrafodaLista"/>
+        <w:numPr>
+          <w:ilvl w:val="0"/>
+          <w:numId w:val="15"/>
+        </w:numPr>
+        <w:spacing w:before="40" w:after="40" w:line="360" w:lineRule="auto"/>
+        <w:jc w:val="both"/>
+      </w:pPr>
+      <w:r>
+        <w:rPr>
+          <w:rFonts w:ascii="Georgia" w:eastAsia="Georgia" w:hAnsi="Georgia" w:cs="Georgia"/>
+          <w:color w:val="000000"/>
+          <w:sz w:val="23"/>
+          <w:szCs w:val="23"/>
+        </w:rPr>
+        <w:t>Necessidade de integração e sincronização entre três tecnologias distintas.</w:t>
+      </w:r>
+    </w:p>
+    <w:p>
+      <w:pPr>
+        <w:pStyle w:val="PargrafodaLista"/>
+        <w:numPr>
+          <w:ilvl w:val="0"/>
+          <w:numId w:val="15"/>
+        </w:numPr>
+        <w:spacing w:before="40" w:after="40" w:line="360" w:lineRule="auto"/>
+        <w:jc w:val="both"/>
+      </w:pPr>
+      <w:r>
+        <w:rPr>
+          <w:rFonts w:ascii="Georgia" w:eastAsia="Georgia" w:hAnsi="Georgia" w:cs="Georgia"/>
+          <w:color w:val="000000"/>
+          <w:sz w:val="23"/>
+          <w:szCs w:val="23"/>
+        </w:rPr>
+        <w:t xml:space="preserve">Curva de aprendizado maior para a equipe de desenvolvimento e </w:t>
+      </w:r>
+      <w:proofErr w:type="spellStart"/>
+      <w:r>
+        <w:rPr>
+          <w:rFonts w:ascii="Georgia" w:eastAsia="Georgia" w:hAnsi="Georgia" w:cs="Georgia"/>
+          <w:color w:val="000000"/>
+          <w:sz w:val="23"/>
+          <w:szCs w:val="23"/>
+        </w:rPr>
+        <w:t>DevOps</w:t>
+      </w:r>
+      <w:proofErr w:type="spellEnd"/>
+      <w:r>
+        <w:rPr>
+          <w:rFonts w:ascii="Georgia" w:eastAsia="Georgia" w:hAnsi="Georgia" w:cs="Georgia"/>
+          <w:color w:val="000000"/>
+          <w:sz w:val="23"/>
+          <w:szCs w:val="23"/>
+        </w:rPr>
+        <w:t>.</w:t>
+      </w:r>
+    </w:p>
+    <w:p>
+      <w:pPr>
+        <w:spacing w:after="80"/>
+      </w:pPr>
+    </w:p>
+    <w:p>
+      <w:pPr>
+        <w:spacing w:after="80" w:line="360" w:lineRule="auto"/>
+        <w:jc w:val="both"/>
+      </w:pPr>
+      <w:r>
+        <w:rPr>
+          <w:rFonts w:ascii="Georgia" w:eastAsia="Georgia" w:hAnsi="Georgia" w:cs="Georgia"/>
+          <w:b/>
+          <w:bCs/>
+          <w:color w:val="000000"/>
+          <w:sz w:val="23"/>
+          <w:szCs w:val="23"/>
+        </w:rPr>
+        <w:t xml:space="preserve">Alternativas Consideradas: </w:t>
+      </w:r>
+      <w:r>
+        <w:rPr>
+          <w:rFonts w:ascii="Georgia" w:eastAsia="Georgia" w:hAnsi="Georgia" w:cs="Georgia"/>
+          <w:color w:val="000000"/>
+          <w:sz w:val="23"/>
+          <w:szCs w:val="23"/>
+        </w:rPr>
+        <w:t xml:space="preserve">Foi considerada a utilização exclusiva de um banco relacional (MySQL) para todo o sistema, incluindo logs e cache. No entanto, essa abordagem foi descartada devido às limitações de escalabilidade horizontal e desempenho em operações de escrita intensiva e grande volume de dados não estruturados, como logs de interação e dados gerados pela IA. Também foi considerada a adoção de um banco </w:t>
+      </w:r>
+      <w:proofErr w:type="spellStart"/>
+      <w:r>
+        <w:rPr>
+          <w:rFonts w:ascii="Georgia" w:eastAsia="Georgia" w:hAnsi="Georgia" w:cs="Georgia"/>
+          <w:color w:val="000000"/>
+          <w:sz w:val="23"/>
+          <w:szCs w:val="23"/>
+        </w:rPr>
+        <w:t>NoSQL</w:t>
+      </w:r>
+      <w:proofErr w:type="spellEnd"/>
+      <w:r>
+        <w:rPr>
+          <w:rFonts w:ascii="Georgia" w:eastAsia="Georgia" w:hAnsi="Georgia" w:cs="Georgia"/>
+          <w:color w:val="000000"/>
+          <w:sz w:val="23"/>
+          <w:szCs w:val="23"/>
+        </w:rPr>
+        <w:t xml:space="preserve"> único, mas isso comprometeria a consistência e a modelagem relacional necessária para os dados acadêmicos centrais.</w:t>
+      </w:r>
     </w:p>
     <w:p>
       <w:pPr>
@@ -2176,812 +3444,18 @@
         </w:pBdr>
         <w:shd w:val="clear" w:color="auto" w:fill="F2F2F2"/>
         <w:spacing w:before="120" w:after="120"/>
-      </w:pPr>
-      <w:r>
-        <w:rPr>
-          <w:rFonts w:ascii="Calibri" w:eastAsia="Calibri" w:hAnsi="Calibri" w:cs="Calibri"/>
-          <w:caps/>
-          <w:color w:val="444444"/>
-          <w:sz w:val="18"/>
-          <w:szCs w:val="18"/>
-        </w:rPr>
-        <w:t>[</w:t>
-      </w:r>
-      <w:proofErr w:type="gramStart"/>
-      <w:r>
-        <w:rPr>
-          <w:rFonts w:ascii="Calibri" w:eastAsia="Calibri" w:hAnsi="Calibri" w:cs="Calibri"/>
-          <w:caps/>
-          <w:color w:val="444444"/>
-          <w:sz w:val="18"/>
-          <w:szCs w:val="18"/>
-        </w:rPr>
-        <w:t xml:space="preserve">PENDENTE]  </w:t>
-      </w:r>
-      <w:r>
-        <w:rPr>
-          <w:rFonts w:ascii="Georgia" w:eastAsia="Georgia" w:hAnsi="Georgia" w:cs="Georgia"/>
-          <w:i/>
-          <w:iCs/>
-          <w:color w:val="CC0000"/>
-          <w:sz w:val="22"/>
-          <w:szCs w:val="22"/>
-        </w:rPr>
-        <w:t>Descreva</w:t>
-      </w:r>
-      <w:proofErr w:type="gramEnd"/>
-      <w:r>
-        <w:rPr>
-          <w:rFonts w:ascii="Georgia" w:eastAsia="Georgia" w:hAnsi="Georgia" w:cs="Georgia"/>
-          <w:i/>
-          <w:iCs/>
-          <w:color w:val="CC0000"/>
-          <w:sz w:val="22"/>
-          <w:szCs w:val="22"/>
-        </w:rPr>
-        <w:t xml:space="preserve"> o estilo arquitetural principal que você adotou (</w:t>
-      </w:r>
-      <w:proofErr w:type="spellStart"/>
-      <w:r>
-        <w:rPr>
-          <w:rFonts w:ascii="Georgia" w:eastAsia="Georgia" w:hAnsi="Georgia" w:cs="Georgia"/>
-          <w:i/>
-          <w:iCs/>
-          <w:color w:val="CC0000"/>
-          <w:sz w:val="22"/>
-          <w:szCs w:val="22"/>
-        </w:rPr>
-        <w:t>ex</w:t>
-      </w:r>
-      <w:proofErr w:type="spellEnd"/>
-      <w:r>
-        <w:rPr>
-          <w:rFonts w:ascii="Georgia" w:eastAsia="Georgia" w:hAnsi="Georgia" w:cs="Georgia"/>
-          <w:i/>
-          <w:iCs/>
-          <w:color w:val="CC0000"/>
-          <w:sz w:val="22"/>
-          <w:szCs w:val="22"/>
-        </w:rPr>
-        <w:t xml:space="preserve">: </w:t>
-      </w:r>
-      <w:proofErr w:type="spellStart"/>
-      <w:r>
-        <w:rPr>
-          <w:rFonts w:ascii="Georgia" w:eastAsia="Georgia" w:hAnsi="Georgia" w:cs="Georgia"/>
-          <w:i/>
-          <w:iCs/>
-          <w:color w:val="CC0000"/>
-          <w:sz w:val="22"/>
-          <w:szCs w:val="22"/>
-        </w:rPr>
-        <w:t>Microsserviços</w:t>
-      </w:r>
-      <w:proofErr w:type="spellEnd"/>
-      <w:r>
-        <w:rPr>
-          <w:rFonts w:ascii="Georgia" w:eastAsia="Georgia" w:hAnsi="Georgia" w:cs="Georgia"/>
-          <w:i/>
-          <w:iCs/>
-          <w:color w:val="CC0000"/>
-          <w:sz w:val="22"/>
-          <w:szCs w:val="22"/>
-        </w:rPr>
-        <w:t xml:space="preserve">, Monolito Modular, Hexagonal, </w:t>
-      </w:r>
-      <w:proofErr w:type="spellStart"/>
-      <w:r>
-        <w:rPr>
-          <w:rFonts w:ascii="Georgia" w:eastAsia="Georgia" w:hAnsi="Georgia" w:cs="Georgia"/>
-          <w:i/>
-          <w:iCs/>
-          <w:color w:val="CC0000"/>
-          <w:sz w:val="22"/>
-          <w:szCs w:val="22"/>
-        </w:rPr>
-        <w:t>Event-Driven</w:t>
-      </w:r>
-      <w:proofErr w:type="spellEnd"/>
-      <w:r>
-        <w:rPr>
-          <w:rFonts w:ascii="Georgia" w:eastAsia="Georgia" w:hAnsi="Georgia" w:cs="Georgia"/>
-          <w:i/>
-          <w:iCs/>
-          <w:color w:val="CC0000"/>
-          <w:sz w:val="22"/>
-          <w:szCs w:val="22"/>
-        </w:rPr>
-        <w:t>) e justifique sua escolha com pelo menos 3 trade-</w:t>
-      </w:r>
-      <w:proofErr w:type="spellStart"/>
-      <w:r>
-        <w:rPr>
-          <w:rFonts w:ascii="Georgia" w:eastAsia="Georgia" w:hAnsi="Georgia" w:cs="Georgia"/>
-          <w:i/>
-          <w:iCs/>
-          <w:color w:val="CC0000"/>
-          <w:sz w:val="22"/>
-          <w:szCs w:val="22"/>
-        </w:rPr>
-        <w:t>offs</w:t>
-      </w:r>
-      <w:proofErr w:type="spellEnd"/>
-      <w:r>
-        <w:rPr>
-          <w:rFonts w:ascii="Georgia" w:eastAsia="Georgia" w:hAnsi="Georgia" w:cs="Georgia"/>
-          <w:i/>
-          <w:iCs/>
-          <w:color w:val="CC0000"/>
-          <w:sz w:val="22"/>
-          <w:szCs w:val="22"/>
-        </w:rPr>
-        <w:t xml:space="preserve"> reais (prós e contras) em relação aos RNFs priorizados na Fase 1. Referencie o Capítulo 14 do Pressman sobre estilos arquiteturais, se pertinente.</w:t>
-      </w:r>
-    </w:p>
-    <w:p>
-      <w:pPr>
-        <w:spacing w:after="16"/>
-      </w:pPr>
-    </w:p>
-    <w:p>
-      <w:pPr>
-        <w:spacing w:before="100" w:after="60"/>
-      </w:pPr>
-      <w:proofErr w:type="gramStart"/>
-      <w:r>
-        <w:rPr>
-          <w:rFonts w:ascii="Georgia" w:eastAsia="Georgia" w:hAnsi="Georgia" w:cs="Georgia"/>
-          <w:b/>
-          <w:bCs/>
-          <w:color w:val="000000"/>
-          <w:sz w:val="24"/>
-          <w:szCs w:val="24"/>
-        </w:rPr>
-        <w:t>2.2.1  Trade</w:t>
-      </w:r>
-      <w:proofErr w:type="gramEnd"/>
-      <w:r>
-        <w:rPr>
-          <w:rFonts w:ascii="Georgia" w:eastAsia="Georgia" w:hAnsi="Georgia" w:cs="Georgia"/>
-          <w:b/>
-          <w:bCs/>
-          <w:color w:val="000000"/>
-          <w:sz w:val="24"/>
-          <w:szCs w:val="24"/>
-        </w:rPr>
-        <w:t>-</w:t>
-      </w:r>
-      <w:proofErr w:type="spellStart"/>
-      <w:r>
-        <w:rPr>
-          <w:rFonts w:ascii="Georgia" w:eastAsia="Georgia" w:hAnsi="Georgia" w:cs="Georgia"/>
-          <w:b/>
-          <w:bCs/>
-          <w:color w:val="000000"/>
-          <w:sz w:val="24"/>
-          <w:szCs w:val="24"/>
-        </w:rPr>
-        <w:t>offs</w:t>
-      </w:r>
-      <w:proofErr w:type="spellEnd"/>
-      <w:r>
-        <w:rPr>
-          <w:rFonts w:ascii="Georgia" w:eastAsia="Georgia" w:hAnsi="Georgia" w:cs="Georgia"/>
-          <w:b/>
-          <w:bCs/>
-          <w:color w:val="000000"/>
-          <w:sz w:val="24"/>
-          <w:szCs w:val="24"/>
-        </w:rPr>
-        <w:t xml:space="preserve"> — Prós</w:t>
-      </w:r>
-    </w:p>
-    <w:p>
-      <w:pPr>
-        <w:pBdr>
-          <w:left w:val="single" w:sz="16" w:space="8" w:color="000000"/>
-        </w:pBdr>
-        <w:shd w:val="clear" w:color="auto" w:fill="F2F2F2"/>
-        <w:spacing w:before="120" w:after="120"/>
-      </w:pPr>
-      <w:r>
-        <w:rPr>
-          <w:rFonts w:ascii="Calibri" w:eastAsia="Calibri" w:hAnsi="Calibri" w:cs="Calibri"/>
-          <w:caps/>
-          <w:color w:val="444444"/>
-          <w:sz w:val="18"/>
-          <w:szCs w:val="18"/>
-        </w:rPr>
-        <w:t>[</w:t>
-      </w:r>
-      <w:proofErr w:type="gramStart"/>
-      <w:r>
-        <w:rPr>
-          <w:rFonts w:ascii="Calibri" w:eastAsia="Calibri" w:hAnsi="Calibri" w:cs="Calibri"/>
-          <w:caps/>
-          <w:color w:val="444444"/>
-          <w:sz w:val="18"/>
-          <w:szCs w:val="18"/>
-        </w:rPr>
-        <w:t xml:space="preserve">PENDENTE]  </w:t>
-      </w:r>
-      <w:r>
-        <w:rPr>
-          <w:rFonts w:ascii="Georgia" w:eastAsia="Georgia" w:hAnsi="Georgia" w:cs="Georgia"/>
-          <w:i/>
-          <w:iCs/>
-          <w:color w:val="CC0000"/>
-          <w:sz w:val="22"/>
-          <w:szCs w:val="22"/>
-        </w:rPr>
-        <w:t>Descreva</w:t>
-      </w:r>
-      <w:proofErr w:type="gramEnd"/>
-      <w:r>
-        <w:rPr>
-          <w:rFonts w:ascii="Georgia" w:eastAsia="Georgia" w:hAnsi="Georgia" w:cs="Georgia"/>
-          <w:i/>
-          <w:iCs/>
-          <w:color w:val="CC0000"/>
-          <w:sz w:val="22"/>
-          <w:szCs w:val="22"/>
-        </w:rPr>
-        <w:t xml:space="preserve"> os pontos positivos do estilo escolhido em relação aos RNFs.</w:t>
-      </w:r>
-    </w:p>
-    <w:p>
-      <w:pPr>
-        <w:spacing w:after="16"/>
-      </w:pPr>
-    </w:p>
-    <w:p>
-      <w:pPr>
-        <w:spacing w:before="100" w:after="60"/>
-      </w:pPr>
-      <w:proofErr w:type="gramStart"/>
-      <w:r>
-        <w:rPr>
-          <w:rFonts w:ascii="Georgia" w:eastAsia="Georgia" w:hAnsi="Georgia" w:cs="Georgia"/>
-          <w:b/>
-          <w:bCs/>
-          <w:color w:val="000000"/>
-          <w:sz w:val="24"/>
-          <w:szCs w:val="24"/>
-        </w:rPr>
-        <w:t>2.2.2  Trade</w:t>
-      </w:r>
-      <w:proofErr w:type="gramEnd"/>
-      <w:r>
-        <w:rPr>
-          <w:rFonts w:ascii="Georgia" w:eastAsia="Georgia" w:hAnsi="Georgia" w:cs="Georgia"/>
-          <w:b/>
-          <w:bCs/>
-          <w:color w:val="000000"/>
-          <w:sz w:val="24"/>
-          <w:szCs w:val="24"/>
-        </w:rPr>
-        <w:t>-</w:t>
-      </w:r>
-      <w:proofErr w:type="spellStart"/>
-      <w:r>
-        <w:rPr>
-          <w:rFonts w:ascii="Georgia" w:eastAsia="Georgia" w:hAnsi="Georgia" w:cs="Georgia"/>
-          <w:b/>
-          <w:bCs/>
-          <w:color w:val="000000"/>
-          <w:sz w:val="24"/>
-          <w:szCs w:val="24"/>
-        </w:rPr>
-        <w:t>offs</w:t>
-      </w:r>
-      <w:proofErr w:type="spellEnd"/>
-      <w:r>
-        <w:rPr>
-          <w:rFonts w:ascii="Georgia" w:eastAsia="Georgia" w:hAnsi="Georgia" w:cs="Georgia"/>
-          <w:b/>
-          <w:bCs/>
-          <w:color w:val="000000"/>
-          <w:sz w:val="24"/>
-          <w:szCs w:val="24"/>
-        </w:rPr>
-        <w:t xml:space="preserve"> — Contras</w:t>
-      </w:r>
-    </w:p>
-    <w:p>
-      <w:pPr>
-        <w:pBdr>
-          <w:left w:val="single" w:sz="16" w:space="8" w:color="000000"/>
-        </w:pBdr>
-        <w:shd w:val="clear" w:color="auto" w:fill="F2F2F2"/>
-        <w:spacing w:before="120" w:after="120"/>
-      </w:pPr>
-      <w:r>
-        <w:rPr>
-          <w:rFonts w:ascii="Calibri" w:eastAsia="Calibri" w:hAnsi="Calibri" w:cs="Calibri"/>
-          <w:caps/>
-          <w:color w:val="444444"/>
-          <w:sz w:val="18"/>
-          <w:szCs w:val="18"/>
-        </w:rPr>
-        <w:t>[</w:t>
-      </w:r>
-      <w:proofErr w:type="gramStart"/>
-      <w:r>
-        <w:rPr>
-          <w:rFonts w:ascii="Calibri" w:eastAsia="Calibri" w:hAnsi="Calibri" w:cs="Calibri"/>
-          <w:caps/>
-          <w:color w:val="444444"/>
-          <w:sz w:val="18"/>
-          <w:szCs w:val="18"/>
-        </w:rPr>
-        <w:t xml:space="preserve">PENDENTE]  </w:t>
-      </w:r>
-      <w:r>
-        <w:rPr>
-          <w:rFonts w:ascii="Georgia" w:eastAsia="Georgia" w:hAnsi="Georgia" w:cs="Georgia"/>
-          <w:i/>
-          <w:iCs/>
-          <w:color w:val="CC0000"/>
-          <w:sz w:val="22"/>
-          <w:szCs w:val="22"/>
-        </w:rPr>
-        <w:t>Descreva</w:t>
-      </w:r>
-      <w:proofErr w:type="gramEnd"/>
-      <w:r>
-        <w:rPr>
-          <w:rFonts w:ascii="Georgia" w:eastAsia="Georgia" w:hAnsi="Georgia" w:cs="Georgia"/>
-          <w:i/>
-          <w:iCs/>
-          <w:color w:val="CC0000"/>
-          <w:sz w:val="22"/>
-          <w:szCs w:val="22"/>
-        </w:rPr>
-        <w:t xml:space="preserve"> os pontos negativos e riscos do estilo escolhido.</w:t>
-      </w:r>
-    </w:p>
-    <w:p>
-      <w:pPr>
-        <w:spacing w:after="16"/>
-      </w:pPr>
-    </w:p>
-    <w:p>
-      <w:pPr>
-        <w:spacing w:before="100" w:after="60"/>
-      </w:pPr>
-      <w:proofErr w:type="gramStart"/>
-      <w:r>
-        <w:rPr>
-          <w:rFonts w:ascii="Georgia" w:eastAsia="Georgia" w:hAnsi="Georgia" w:cs="Georgia"/>
-          <w:b/>
-          <w:bCs/>
-          <w:color w:val="000000"/>
-          <w:sz w:val="24"/>
-          <w:szCs w:val="24"/>
-        </w:rPr>
-        <w:t>2.2.3  Relação</w:t>
-      </w:r>
-      <w:proofErr w:type="gramEnd"/>
-      <w:r>
-        <w:rPr>
-          <w:rFonts w:ascii="Georgia" w:eastAsia="Georgia" w:hAnsi="Georgia" w:cs="Georgia"/>
-          <w:b/>
-          <w:bCs/>
-          <w:color w:val="000000"/>
-          <w:sz w:val="24"/>
-          <w:szCs w:val="24"/>
-        </w:rPr>
-        <w:t xml:space="preserve"> com os RNFs Priorizados</w:t>
-      </w:r>
-    </w:p>
-    <w:p>
-      <w:pPr>
-        <w:pBdr>
-          <w:left w:val="single" w:sz="16" w:space="8" w:color="000000"/>
-        </w:pBdr>
-        <w:shd w:val="clear" w:color="auto" w:fill="F2F2F2"/>
-        <w:spacing w:before="120" w:after="120"/>
-      </w:pPr>
-      <w:r>
-        <w:rPr>
-          <w:rFonts w:ascii="Calibri" w:eastAsia="Calibri" w:hAnsi="Calibri" w:cs="Calibri"/>
-          <w:caps/>
-          <w:color w:val="444444"/>
-          <w:sz w:val="18"/>
-          <w:szCs w:val="18"/>
-        </w:rPr>
-        <w:t>[</w:t>
-      </w:r>
-      <w:proofErr w:type="gramStart"/>
-      <w:r>
-        <w:rPr>
-          <w:rFonts w:ascii="Calibri" w:eastAsia="Calibri" w:hAnsi="Calibri" w:cs="Calibri"/>
-          <w:caps/>
-          <w:color w:val="444444"/>
-          <w:sz w:val="18"/>
-          <w:szCs w:val="18"/>
-        </w:rPr>
-        <w:t xml:space="preserve">PENDENTE]  </w:t>
-      </w:r>
-      <w:r>
-        <w:rPr>
-          <w:rFonts w:ascii="Georgia" w:eastAsia="Georgia" w:hAnsi="Georgia" w:cs="Georgia"/>
-          <w:i/>
-          <w:iCs/>
-          <w:color w:val="CC0000"/>
-          <w:sz w:val="22"/>
-          <w:szCs w:val="22"/>
-        </w:rPr>
-        <w:t>Explique</w:t>
-      </w:r>
-      <w:proofErr w:type="gramEnd"/>
-      <w:r>
-        <w:rPr>
-          <w:rFonts w:ascii="Georgia" w:eastAsia="Georgia" w:hAnsi="Georgia" w:cs="Georgia"/>
-          <w:i/>
-          <w:iCs/>
-          <w:color w:val="CC0000"/>
-          <w:sz w:val="22"/>
-          <w:szCs w:val="22"/>
-        </w:rPr>
-        <w:t xml:space="preserve"> como o estilo arquitetural escolhido atende (ou tensiona) cada RNF definido no Ciclo 1.</w:t>
-      </w:r>
-    </w:p>
-    <w:p>
-      <w:pPr>
-        <w:spacing w:after="24"/>
-      </w:pPr>
-    </w:p>
-    <w:p>
-      <w:pPr>
-        <w:pBdr>
-          <w:bottom w:val="single" w:sz="8" w:space="4" w:color="000000"/>
-        </w:pBdr>
-        <w:spacing w:before="240" w:after="60"/>
-      </w:pPr>
-      <w:r>
-        <w:rPr>
-          <w:rFonts w:ascii="Courier New" w:eastAsia="Courier New" w:hAnsi="Courier New" w:cs="Courier New"/>
-          <w:color w:val="444444"/>
-          <w:sz w:val="22"/>
-          <w:szCs w:val="22"/>
-        </w:rPr>
-        <w:t xml:space="preserve">2.3 </w:t>
-      </w:r>
-      <w:proofErr w:type="spellStart"/>
-      <w:r>
-        <w:rPr>
-          <w:rFonts w:ascii="Georgia" w:eastAsia="Georgia" w:hAnsi="Georgia" w:cs="Georgia"/>
-          <w:b/>
-          <w:bCs/>
-          <w:color w:val="000000"/>
-          <w:sz w:val="24"/>
-          <w:szCs w:val="24"/>
-        </w:rPr>
-        <w:t>Architecture</w:t>
-      </w:r>
-      <w:proofErr w:type="spellEnd"/>
-      <w:r>
-        <w:rPr>
-          <w:rFonts w:ascii="Georgia" w:eastAsia="Georgia" w:hAnsi="Georgia" w:cs="Georgia"/>
-          <w:b/>
-          <w:bCs/>
-          <w:color w:val="000000"/>
-          <w:sz w:val="24"/>
-          <w:szCs w:val="24"/>
-        </w:rPr>
-        <w:t xml:space="preserve"> </w:t>
-      </w:r>
-      <w:proofErr w:type="spellStart"/>
-      <w:r>
-        <w:rPr>
-          <w:rFonts w:ascii="Georgia" w:eastAsia="Georgia" w:hAnsi="Georgia" w:cs="Georgia"/>
-          <w:b/>
-          <w:bCs/>
-          <w:color w:val="000000"/>
-          <w:sz w:val="24"/>
-          <w:szCs w:val="24"/>
-        </w:rPr>
-        <w:t>Decision</w:t>
-      </w:r>
-      <w:proofErr w:type="spellEnd"/>
-      <w:r>
-        <w:rPr>
-          <w:rFonts w:ascii="Georgia" w:eastAsia="Georgia" w:hAnsi="Georgia" w:cs="Georgia"/>
-          <w:b/>
-          <w:bCs/>
-          <w:color w:val="000000"/>
-          <w:sz w:val="24"/>
-          <w:szCs w:val="24"/>
-        </w:rPr>
-        <w:t xml:space="preserve"> Record (ADR) Principal</w:t>
-      </w:r>
-    </w:p>
-    <w:p>
-      <w:pPr>
-        <w:spacing w:after="12"/>
-      </w:pPr>
-    </w:p>
-    <w:p>
-      <w:pPr>
-        <w:pBdr>
-          <w:left w:val="single" w:sz="16" w:space="8" w:color="000000"/>
-        </w:pBdr>
-        <w:shd w:val="clear" w:color="auto" w:fill="F2F2F2"/>
-        <w:spacing w:before="120" w:after="120"/>
-      </w:pPr>
-      <w:proofErr w:type="gramStart"/>
-      <w:r>
-        <w:rPr>
-          <w:rFonts w:ascii="Calibri" w:eastAsia="Calibri" w:hAnsi="Calibri" w:cs="Calibri"/>
-          <w:caps/>
-          <w:color w:val="444444"/>
-          <w:sz w:val="18"/>
-          <w:szCs w:val="18"/>
-        </w:rPr>
-        <w:t xml:space="preserve">INSTRUÇÃO  </w:t>
-      </w:r>
-      <w:r>
-        <w:rPr>
-          <w:rFonts w:ascii="Georgia" w:eastAsia="Georgia" w:hAnsi="Georgia" w:cs="Georgia"/>
-          <w:color w:val="444444"/>
-          <w:sz w:val="22"/>
-          <w:szCs w:val="22"/>
-        </w:rPr>
-        <w:t>Escolha</w:t>
-      </w:r>
-      <w:proofErr w:type="gramEnd"/>
-      <w:r>
-        <w:rPr>
-          <w:rFonts w:ascii="Georgia" w:eastAsia="Georgia" w:hAnsi="Georgia" w:cs="Georgia"/>
-          <w:color w:val="444444"/>
-          <w:sz w:val="22"/>
-          <w:szCs w:val="22"/>
-        </w:rPr>
-        <w:t xml:space="preserve"> uma decisão arquitetural crucial que você tomou nesta fase (</w:t>
-      </w:r>
-      <w:proofErr w:type="spellStart"/>
-      <w:r>
-        <w:rPr>
-          <w:rFonts w:ascii="Georgia" w:eastAsia="Georgia" w:hAnsi="Georgia" w:cs="Georgia"/>
-          <w:color w:val="444444"/>
-          <w:sz w:val="22"/>
-          <w:szCs w:val="22"/>
-        </w:rPr>
-        <w:t>ex</w:t>
-      </w:r>
-      <w:proofErr w:type="spellEnd"/>
-      <w:r>
-        <w:rPr>
-          <w:rFonts w:ascii="Georgia" w:eastAsia="Georgia" w:hAnsi="Georgia" w:cs="Georgia"/>
-          <w:color w:val="444444"/>
-          <w:sz w:val="22"/>
-          <w:szCs w:val="22"/>
-        </w:rPr>
-        <w:t xml:space="preserve">: Escolha da Tecnologia de Persistência, Estratégia de Comunicação entre </w:t>
-      </w:r>
-      <w:proofErr w:type="spellStart"/>
-      <w:r>
-        <w:rPr>
-          <w:rFonts w:ascii="Georgia" w:eastAsia="Georgia" w:hAnsi="Georgia" w:cs="Georgia"/>
-          <w:color w:val="444444"/>
-          <w:sz w:val="22"/>
-          <w:szCs w:val="22"/>
-        </w:rPr>
-        <w:t>Microsserviços</w:t>
-      </w:r>
-      <w:proofErr w:type="spellEnd"/>
-      <w:r>
-        <w:rPr>
-          <w:rFonts w:ascii="Georgia" w:eastAsia="Georgia" w:hAnsi="Georgia" w:cs="Georgia"/>
-          <w:color w:val="444444"/>
-          <w:sz w:val="22"/>
-          <w:szCs w:val="22"/>
-        </w:rPr>
-        <w:t>) e documente-a como um ADR. Recomendado: Criar o arquivo .</w:t>
-      </w:r>
-      <w:proofErr w:type="spellStart"/>
-      <w:r>
-        <w:rPr>
-          <w:rFonts w:ascii="Georgia" w:eastAsia="Georgia" w:hAnsi="Georgia" w:cs="Georgia"/>
-          <w:color w:val="444444"/>
-          <w:sz w:val="22"/>
-          <w:szCs w:val="22"/>
-        </w:rPr>
-        <w:t>md</w:t>
-      </w:r>
-      <w:proofErr w:type="spellEnd"/>
-      <w:r>
-        <w:rPr>
-          <w:rFonts w:ascii="Georgia" w:eastAsia="Georgia" w:hAnsi="Georgia" w:cs="Georgia"/>
-          <w:color w:val="444444"/>
-          <w:sz w:val="22"/>
-          <w:szCs w:val="22"/>
-        </w:rPr>
-        <w:t xml:space="preserve"> do ADR em /</w:t>
-      </w:r>
-      <w:proofErr w:type="spellStart"/>
-      <w:r>
-        <w:rPr>
-          <w:rFonts w:ascii="Georgia" w:eastAsia="Georgia" w:hAnsi="Georgia" w:cs="Georgia"/>
-          <w:color w:val="444444"/>
-          <w:sz w:val="22"/>
-          <w:szCs w:val="22"/>
-        </w:rPr>
-        <w:t>adrs</w:t>
-      </w:r>
-      <w:proofErr w:type="spellEnd"/>
-      <w:r>
-        <w:rPr>
-          <w:rFonts w:ascii="Georgia" w:eastAsia="Georgia" w:hAnsi="Georgia" w:cs="Georgia"/>
-          <w:color w:val="444444"/>
-          <w:sz w:val="22"/>
-          <w:szCs w:val="22"/>
-        </w:rPr>
-        <w:t xml:space="preserve"> no GitHub e referenciar o link aqui.</w:t>
-      </w:r>
-    </w:p>
-    <w:p>
-      <w:pPr>
-        <w:spacing w:after="16"/>
-      </w:pPr>
-    </w:p>
-    <w:p>
-      <w:pPr>
-        <w:spacing w:after="120" w:line="360" w:lineRule="auto"/>
-        <w:jc w:val="both"/>
-      </w:pPr>
-      <w:r>
-        <w:rPr>
-          <w:rFonts w:ascii="Georgia" w:eastAsia="Georgia" w:hAnsi="Georgia" w:cs="Georgia"/>
-          <w:b/>
-          <w:bCs/>
-          <w:color w:val="000000"/>
-          <w:sz w:val="23"/>
-          <w:szCs w:val="23"/>
-        </w:rPr>
-        <w:t xml:space="preserve">Título: </w:t>
-      </w:r>
-      <w:r>
-        <w:rPr>
-          <w:rFonts w:ascii="Georgia" w:eastAsia="Georgia" w:hAnsi="Georgia" w:cs="Georgia"/>
-          <w:color w:val="000000"/>
-          <w:sz w:val="23"/>
-          <w:szCs w:val="23"/>
-        </w:rPr>
-        <w:t xml:space="preserve">[PENDENTE — </w:t>
-      </w:r>
-      <w:proofErr w:type="spellStart"/>
-      <w:r>
-        <w:rPr>
-          <w:rFonts w:ascii="Georgia" w:eastAsia="Georgia" w:hAnsi="Georgia" w:cs="Georgia"/>
-          <w:color w:val="000000"/>
-          <w:sz w:val="23"/>
-          <w:szCs w:val="23"/>
-        </w:rPr>
-        <w:t>Ex</w:t>
-      </w:r>
-      <w:proofErr w:type="spellEnd"/>
-      <w:r>
-        <w:rPr>
-          <w:rFonts w:ascii="Georgia" w:eastAsia="Georgia" w:hAnsi="Georgia" w:cs="Georgia"/>
-          <w:color w:val="000000"/>
-          <w:sz w:val="23"/>
-          <w:szCs w:val="23"/>
-        </w:rPr>
-        <w:t>: Escolha da Tecnologia de Persistência]</w:t>
-      </w:r>
-    </w:p>
-    <w:p>
-      <w:pPr>
-        <w:spacing w:after="120" w:line="360" w:lineRule="auto"/>
-        <w:jc w:val="both"/>
-      </w:pPr>
-      <w:r>
-        <w:rPr>
-          <w:rFonts w:ascii="Georgia" w:eastAsia="Georgia" w:hAnsi="Georgia" w:cs="Georgia"/>
-          <w:b/>
-          <w:bCs/>
-          <w:color w:val="000000"/>
-          <w:sz w:val="23"/>
-          <w:szCs w:val="23"/>
-        </w:rPr>
-        <w:t xml:space="preserve">Contexto: </w:t>
-      </w:r>
-      <w:r>
-        <w:rPr>
-          <w:rFonts w:ascii="Georgia" w:eastAsia="Georgia" w:hAnsi="Georgia" w:cs="Georgia"/>
-          <w:color w:val="000000"/>
-          <w:sz w:val="23"/>
-          <w:szCs w:val="23"/>
-        </w:rPr>
-        <w:t>[PENDENTE — O problema ou necessidade técnica que levou a essa decisão. Qual era o cenário?]</w:t>
-      </w:r>
-    </w:p>
-    <w:p>
-      <w:pPr>
-        <w:spacing w:after="120" w:line="360" w:lineRule="auto"/>
-        <w:jc w:val="both"/>
-      </w:pPr>
-      <w:r>
-        <w:rPr>
-          <w:rFonts w:ascii="Georgia" w:eastAsia="Georgia" w:hAnsi="Georgia" w:cs="Georgia"/>
-          <w:b/>
-          <w:bCs/>
-          <w:color w:val="000000"/>
-          <w:sz w:val="23"/>
-          <w:szCs w:val="23"/>
-        </w:rPr>
-        <w:t xml:space="preserve">Decisão: </w:t>
-      </w:r>
-      <w:r>
-        <w:rPr>
-          <w:rFonts w:ascii="Georgia" w:eastAsia="Georgia" w:hAnsi="Georgia" w:cs="Georgia"/>
-          <w:color w:val="000000"/>
-          <w:sz w:val="23"/>
-          <w:szCs w:val="23"/>
-        </w:rPr>
-        <w:t>[PENDENTE — O que foi decidido. Qual tecnologia/abordagem foi escolhida?]</w:t>
-      </w:r>
-    </w:p>
-    <w:p>
-      <w:pPr>
-        <w:spacing w:after="120" w:line="360" w:lineRule="auto"/>
-        <w:jc w:val="both"/>
-      </w:pPr>
-      <w:r>
-        <w:rPr>
-          <w:rFonts w:ascii="Georgia" w:eastAsia="Georgia" w:hAnsi="Georgia" w:cs="Georgia"/>
-          <w:b/>
-          <w:bCs/>
-          <w:color w:val="000000"/>
-          <w:sz w:val="23"/>
-          <w:szCs w:val="23"/>
-        </w:rPr>
-        <w:lastRenderedPageBreak/>
-        <w:t xml:space="preserve">Justificativa: </w:t>
-      </w:r>
-      <w:r>
-        <w:rPr>
-          <w:rFonts w:ascii="Georgia" w:eastAsia="Georgia" w:hAnsi="Georgia" w:cs="Georgia"/>
-          <w:color w:val="000000"/>
-          <w:sz w:val="23"/>
-          <w:szCs w:val="23"/>
-        </w:rPr>
-        <w:t>[PENDENTE — Por que esta opção venceu as alternativas? Quais foram os trade-</w:t>
-      </w:r>
-      <w:proofErr w:type="spellStart"/>
-      <w:r>
-        <w:rPr>
-          <w:rFonts w:ascii="Georgia" w:eastAsia="Georgia" w:hAnsi="Georgia" w:cs="Georgia"/>
-          <w:color w:val="000000"/>
-          <w:sz w:val="23"/>
-          <w:szCs w:val="23"/>
-        </w:rPr>
-        <w:t>offs</w:t>
-      </w:r>
-      <w:proofErr w:type="spellEnd"/>
-      <w:r>
-        <w:rPr>
-          <w:rFonts w:ascii="Georgia" w:eastAsia="Georgia" w:hAnsi="Georgia" w:cs="Georgia"/>
-          <w:color w:val="000000"/>
-          <w:sz w:val="23"/>
-          <w:szCs w:val="23"/>
-        </w:rPr>
-        <w:t xml:space="preserve"> considerados? Quais os impactos nos RNFs?]</w:t>
-      </w:r>
-    </w:p>
-    <w:p>
-      <w:pPr>
         <w:sectPr>
-          <w:headerReference w:type="default" r:id="rId13"/>
-          <w:footerReference w:type="default" r:id="rId14"/>
+          <w:headerReference w:type="default" r:id="rId14"/>
+          <w:footerReference w:type="default" r:id="rId15"/>
           <w:pgSz w:w="11906" w:h="16838"/>
           <w:pgMar w:top="1418" w:right="1418" w:bottom="1418" w:left="1701" w:header="708" w:footer="708" w:gutter="0"/>
           <w:cols w:space="720"/>
           <w:docGrid w:linePitch="360"/>
         </w:sectPr>
       </w:pPr>
+      <w:r>
+        <w:t xml:space="preserve">Fonte: Elaborado pelo autor (2026). Disponível em: </w:t>
+      </w:r>
     </w:p>
     <w:p>
       <w:pPr>
@@ -3496,8 +3970,8 @@
     <w:p>
       <w:pPr>
         <w:sectPr>
-          <w:headerReference w:type="default" r:id="rId15"/>
-          <w:footerReference w:type="default" r:id="rId16"/>
+          <w:headerReference w:type="default" r:id="rId16"/>
+          <w:footerReference w:type="default" r:id="rId17"/>
           <w:pgSz w:w="11906" w:h="16838"/>
           <w:pgMar w:top="1418" w:right="1418" w:bottom="1418" w:left="1701" w:header="708" w:footer="708" w:gutter="0"/>
           <w:cols w:space="720"/>
@@ -3707,8 +4181,8 @@
     <w:p>
       <w:pPr>
         <w:sectPr>
-          <w:headerReference w:type="default" r:id="rId17"/>
-          <w:footerReference w:type="default" r:id="rId18"/>
+          <w:headerReference w:type="default" r:id="rId18"/>
+          <w:footerReference w:type="default" r:id="rId19"/>
           <w:pgSz w:w="11906" w:h="16838"/>
           <w:pgMar w:top="1418" w:right="1418" w:bottom="1418" w:left="1701" w:header="708" w:footer="708" w:gutter="0"/>
           <w:cols w:space="720"/>
@@ -4276,8 +4750,8 @@
     <w:p>
       <w:pPr>
         <w:sectPr>
-          <w:headerReference w:type="default" r:id="rId19"/>
-          <w:footerReference w:type="default" r:id="rId20"/>
+          <w:headerReference w:type="default" r:id="rId20"/>
+          <w:footerReference w:type="default" r:id="rId21"/>
           <w:pgSz w:w="11906" w:h="16838"/>
           <w:pgMar w:top="1418" w:right="1418" w:bottom="1418" w:left="1701" w:header="708" w:footer="708" w:gutter="0"/>
           <w:cols w:space="720"/>
@@ -4492,8 +4966,8 @@
       </w:r>
     </w:p>
     <w:sectPr>
-      <w:headerReference w:type="default" r:id="rId21"/>
-      <w:footerReference w:type="default" r:id="rId22"/>
+      <w:headerReference w:type="default" r:id="rId22"/>
+      <w:footerReference w:type="default" r:id="rId23"/>
       <w:pgSz w:w="11906" w:h="16838"/>
       <w:pgMar w:top="1418" w:right="1418" w:bottom="1418" w:left="1701" w:header="708" w:footer="708" w:gutter="0"/>
       <w:cols w:space="720"/>
@@ -5654,6 +6128,1186 @@
 <file path=word/numbering.xml><?xml version="1.0" encoding="utf-8"?>
 <w:numbering xmlns:wpc="http://schemas.microsoft.com/office/word/2010/wordprocessingCanvas" xmlns:cx="http://schemas.microsoft.com/office/drawing/2014/chartex" xmlns:cx1="http://schemas.microsoft.com/office/drawing/2015/9/8/chartex" xmlns:cx2="http://schemas.microsoft.com/office/drawing/2015/10/21/chartex" xmlns:cx3="http://schemas.microsoft.com/office/drawing/2016/5/9/chartex" xmlns:cx4="http://schemas.microsoft.com/office/drawing/2016/5/10/chartex" xmlns:cx5="http://schemas.microsoft.com/office/drawing/2016/5/11/chartex" xmlns:cx6="http://schemas.microsoft.com/office/drawing/2016/5/12/chartex" xmlns:cx7="http://schemas.microsoft.com/office/drawing/2016/5/13/chartex" xmlns:cx8="http://schemas.microsoft.com/office/drawing/2016/5/14/chartex" xmlns:mc="http://schemas.openxmlformats.org/markup-compatibility/2006" xmlns:aink="http://schemas.microsoft.com/office/drawing/2016/ink" xmlns:am3d="http://schemas.microsoft.com/office/drawing/2017/model3d" xmlns:o="urn:schemas-microsoft-com:office:office" xmlns:r="http://schemas.openxmlformats.org/officeDocument/2006/relationships" xmlns:m="http://schemas.openxmlformats.org/officeDocument/2006/math" xmlns:v="urn:schemas-microsoft-com:vml" xmlns:wp14="http://schemas.microsoft.com/office/word/2010/wordprocessingDrawing" xmlns:wp="http://schemas.openxmlformats.org/drawingml/2006/wordprocessingDrawing" xmlns:w10="urn:schemas-microsoft-com:office:word" xmlns:w="http://schemas.openxmlformats.org/wordprocessingml/2006/main" xmlns:w14="http://schemas.microsoft.com/office/word/2010/wordml" xmlns:w15="http://schemas.microsoft.com/office/word/2012/wordml" xmlns:w16cex="http://schemas.microsoft.com/office/word/2018/wordml/cex" xmlns:w16cid="http://schemas.microsoft.com/office/word/2016/wordml/cid" xmlns:w16="http://schemas.microsoft.com/office/word/2018/wordml" xmlns:w16sdtdh="http://schemas.microsoft.com/office/word/2020/wordml/sdtdatahash" xmlns:w16se="http://schemas.microsoft.com/office/word/2015/wordml/symex" xmlns:wpg="http://schemas.microsoft.com/office/word/2010/wordprocessingGroup" xmlns:wpi="http://schemas.microsoft.com/office/word/2010/wordprocessingInk" xmlns:wne="http://schemas.microsoft.com/office/word/2006/wordml" xmlns:wps="http://schemas.microsoft.com/office/word/2010/wordprocessingShape" mc:Ignorable="w14 w15 w16se w16cid w16 w16cex w16sdtdh wp14">
   <w:abstractNum w:abstractNumId="0" w15:restartNumberingAfterBreak="0">
+    <w:nsid w:val="011C4A9D"/>
+    <w:multiLevelType w:val="multilevel"/>
+    <w:tmpl w:val="5454A2D0"/>
+    <w:lvl w:ilvl="0">
+      <w:start w:val="1"/>
+      <w:numFmt w:val="bullet"/>
+      <w:lvlText w:val=""/>
+      <w:lvlJc w:val="left"/>
+      <w:pPr>
+        <w:tabs>
+          <w:tab w:val="num" w:pos="720"/>
+        </w:tabs>
+        <w:ind w:left="720" w:hanging="360"/>
+      </w:pPr>
+      <w:rPr>
+        <w:rFonts w:ascii="Symbol" w:hAnsi="Symbol" w:hint="default"/>
+        <w:sz w:val="20"/>
+      </w:rPr>
+    </w:lvl>
+    <w:lvl w:ilvl="1" w:tentative="1">
+      <w:start w:val="1"/>
+      <w:numFmt w:val="bullet"/>
+      <w:lvlText w:val="o"/>
+      <w:lvlJc w:val="left"/>
+      <w:pPr>
+        <w:tabs>
+          <w:tab w:val="num" w:pos="1440"/>
+        </w:tabs>
+        <w:ind w:left="1440" w:hanging="360"/>
+      </w:pPr>
+      <w:rPr>
+        <w:rFonts w:ascii="Courier New" w:hAnsi="Courier New" w:hint="default"/>
+        <w:sz w:val="20"/>
+      </w:rPr>
+    </w:lvl>
+    <w:lvl w:ilvl="2" w:tentative="1">
+      <w:start w:val="1"/>
+      <w:numFmt w:val="bullet"/>
+      <w:lvlText w:val=""/>
+      <w:lvlJc w:val="left"/>
+      <w:pPr>
+        <w:tabs>
+          <w:tab w:val="num" w:pos="2160"/>
+        </w:tabs>
+        <w:ind w:left="2160" w:hanging="360"/>
+      </w:pPr>
+      <w:rPr>
+        <w:rFonts w:ascii="Wingdings" w:hAnsi="Wingdings" w:hint="default"/>
+        <w:sz w:val="20"/>
+      </w:rPr>
+    </w:lvl>
+    <w:lvl w:ilvl="3" w:tentative="1">
+      <w:start w:val="1"/>
+      <w:numFmt w:val="bullet"/>
+      <w:lvlText w:val=""/>
+      <w:lvlJc w:val="left"/>
+      <w:pPr>
+        <w:tabs>
+          <w:tab w:val="num" w:pos="2880"/>
+        </w:tabs>
+        <w:ind w:left="2880" w:hanging="360"/>
+      </w:pPr>
+      <w:rPr>
+        <w:rFonts w:ascii="Wingdings" w:hAnsi="Wingdings" w:hint="default"/>
+        <w:sz w:val="20"/>
+      </w:rPr>
+    </w:lvl>
+    <w:lvl w:ilvl="4" w:tentative="1">
+      <w:start w:val="1"/>
+      <w:numFmt w:val="bullet"/>
+      <w:lvlText w:val=""/>
+      <w:lvlJc w:val="left"/>
+      <w:pPr>
+        <w:tabs>
+          <w:tab w:val="num" w:pos="3600"/>
+        </w:tabs>
+        <w:ind w:left="3600" w:hanging="360"/>
+      </w:pPr>
+      <w:rPr>
+        <w:rFonts w:ascii="Wingdings" w:hAnsi="Wingdings" w:hint="default"/>
+        <w:sz w:val="20"/>
+      </w:rPr>
+    </w:lvl>
+    <w:lvl w:ilvl="5" w:tentative="1">
+      <w:start w:val="1"/>
+      <w:numFmt w:val="bullet"/>
+      <w:lvlText w:val=""/>
+      <w:lvlJc w:val="left"/>
+      <w:pPr>
+        <w:tabs>
+          <w:tab w:val="num" w:pos="4320"/>
+        </w:tabs>
+        <w:ind w:left="4320" w:hanging="360"/>
+      </w:pPr>
+      <w:rPr>
+        <w:rFonts w:ascii="Wingdings" w:hAnsi="Wingdings" w:hint="default"/>
+        <w:sz w:val="20"/>
+      </w:rPr>
+    </w:lvl>
+    <w:lvl w:ilvl="6" w:tentative="1">
+      <w:start w:val="1"/>
+      <w:numFmt w:val="bullet"/>
+      <w:lvlText w:val=""/>
+      <w:lvlJc w:val="left"/>
+      <w:pPr>
+        <w:tabs>
+          <w:tab w:val="num" w:pos="5040"/>
+        </w:tabs>
+        <w:ind w:left="5040" w:hanging="360"/>
+      </w:pPr>
+      <w:rPr>
+        <w:rFonts w:ascii="Wingdings" w:hAnsi="Wingdings" w:hint="default"/>
+        <w:sz w:val="20"/>
+      </w:rPr>
+    </w:lvl>
+    <w:lvl w:ilvl="7" w:tentative="1">
+      <w:start w:val="1"/>
+      <w:numFmt w:val="bullet"/>
+      <w:lvlText w:val=""/>
+      <w:lvlJc w:val="left"/>
+      <w:pPr>
+        <w:tabs>
+          <w:tab w:val="num" w:pos="5760"/>
+        </w:tabs>
+        <w:ind w:left="5760" w:hanging="360"/>
+      </w:pPr>
+      <w:rPr>
+        <w:rFonts w:ascii="Wingdings" w:hAnsi="Wingdings" w:hint="default"/>
+        <w:sz w:val="20"/>
+      </w:rPr>
+    </w:lvl>
+    <w:lvl w:ilvl="8" w:tentative="1">
+      <w:start w:val="1"/>
+      <w:numFmt w:val="bullet"/>
+      <w:lvlText w:val=""/>
+      <w:lvlJc w:val="left"/>
+      <w:pPr>
+        <w:tabs>
+          <w:tab w:val="num" w:pos="6480"/>
+        </w:tabs>
+        <w:ind w:left="6480" w:hanging="360"/>
+      </w:pPr>
+      <w:rPr>
+        <w:rFonts w:ascii="Wingdings" w:hAnsi="Wingdings" w:hint="default"/>
+        <w:sz w:val="20"/>
+      </w:rPr>
+    </w:lvl>
+  </w:abstractNum>
+  <w:abstractNum w:abstractNumId="1" w15:restartNumberingAfterBreak="0">
+    <w:nsid w:val="14C45940"/>
+    <w:multiLevelType w:val="hybridMultilevel"/>
+    <w:tmpl w:val="67967318"/>
+    <w:lvl w:ilvl="0" w:tplc="04160001">
+      <w:start w:val="1"/>
+      <w:numFmt w:val="bullet"/>
+      <w:lvlText w:val=""/>
+      <w:lvlJc w:val="left"/>
+      <w:pPr>
+        <w:ind w:left="720" w:hanging="360"/>
+      </w:pPr>
+      <w:rPr>
+        <w:rFonts w:ascii="Symbol" w:hAnsi="Symbol" w:hint="default"/>
+      </w:rPr>
+    </w:lvl>
+    <w:lvl w:ilvl="1" w:tplc="04160003" w:tentative="1">
+      <w:start w:val="1"/>
+      <w:numFmt w:val="bullet"/>
+      <w:lvlText w:val="o"/>
+      <w:lvlJc w:val="left"/>
+      <w:pPr>
+        <w:ind w:left="1440" w:hanging="360"/>
+      </w:pPr>
+      <w:rPr>
+        <w:rFonts w:ascii="Courier New" w:hAnsi="Courier New" w:cs="Courier New" w:hint="default"/>
+      </w:rPr>
+    </w:lvl>
+    <w:lvl w:ilvl="2" w:tplc="04160005" w:tentative="1">
+      <w:start w:val="1"/>
+      <w:numFmt w:val="bullet"/>
+      <w:lvlText w:val=""/>
+      <w:lvlJc w:val="left"/>
+      <w:pPr>
+        <w:ind w:left="2160" w:hanging="360"/>
+      </w:pPr>
+      <w:rPr>
+        <w:rFonts w:ascii="Wingdings" w:hAnsi="Wingdings" w:hint="default"/>
+      </w:rPr>
+    </w:lvl>
+    <w:lvl w:ilvl="3" w:tplc="04160001" w:tentative="1">
+      <w:start w:val="1"/>
+      <w:numFmt w:val="bullet"/>
+      <w:lvlText w:val=""/>
+      <w:lvlJc w:val="left"/>
+      <w:pPr>
+        <w:ind w:left="2880" w:hanging="360"/>
+      </w:pPr>
+      <w:rPr>
+        <w:rFonts w:ascii="Symbol" w:hAnsi="Symbol" w:hint="default"/>
+      </w:rPr>
+    </w:lvl>
+    <w:lvl w:ilvl="4" w:tplc="04160003" w:tentative="1">
+      <w:start w:val="1"/>
+      <w:numFmt w:val="bullet"/>
+      <w:lvlText w:val="o"/>
+      <w:lvlJc w:val="left"/>
+      <w:pPr>
+        <w:ind w:left="3600" w:hanging="360"/>
+      </w:pPr>
+      <w:rPr>
+        <w:rFonts w:ascii="Courier New" w:hAnsi="Courier New" w:cs="Courier New" w:hint="default"/>
+      </w:rPr>
+    </w:lvl>
+    <w:lvl w:ilvl="5" w:tplc="04160005" w:tentative="1">
+      <w:start w:val="1"/>
+      <w:numFmt w:val="bullet"/>
+      <w:lvlText w:val=""/>
+      <w:lvlJc w:val="left"/>
+      <w:pPr>
+        <w:ind w:left="4320" w:hanging="360"/>
+      </w:pPr>
+      <w:rPr>
+        <w:rFonts w:ascii="Wingdings" w:hAnsi="Wingdings" w:hint="default"/>
+      </w:rPr>
+    </w:lvl>
+    <w:lvl w:ilvl="6" w:tplc="04160001" w:tentative="1">
+      <w:start w:val="1"/>
+      <w:numFmt w:val="bullet"/>
+      <w:lvlText w:val=""/>
+      <w:lvlJc w:val="left"/>
+      <w:pPr>
+        <w:ind w:left="5040" w:hanging="360"/>
+      </w:pPr>
+      <w:rPr>
+        <w:rFonts w:ascii="Symbol" w:hAnsi="Symbol" w:hint="default"/>
+      </w:rPr>
+    </w:lvl>
+    <w:lvl w:ilvl="7" w:tplc="04160003" w:tentative="1">
+      <w:start w:val="1"/>
+      <w:numFmt w:val="bullet"/>
+      <w:lvlText w:val="o"/>
+      <w:lvlJc w:val="left"/>
+      <w:pPr>
+        <w:ind w:left="5760" w:hanging="360"/>
+      </w:pPr>
+      <w:rPr>
+        <w:rFonts w:ascii="Courier New" w:hAnsi="Courier New" w:cs="Courier New" w:hint="default"/>
+      </w:rPr>
+    </w:lvl>
+    <w:lvl w:ilvl="8" w:tplc="04160005" w:tentative="1">
+      <w:start w:val="1"/>
+      <w:numFmt w:val="bullet"/>
+      <w:lvlText w:val=""/>
+      <w:lvlJc w:val="left"/>
+      <w:pPr>
+        <w:ind w:left="6480" w:hanging="360"/>
+      </w:pPr>
+      <w:rPr>
+        <w:rFonts w:ascii="Wingdings" w:hAnsi="Wingdings" w:hint="default"/>
+      </w:rPr>
+    </w:lvl>
+  </w:abstractNum>
+  <w:abstractNum w:abstractNumId="2" w15:restartNumberingAfterBreak="0">
+    <w:nsid w:val="15A33F4E"/>
+    <w:multiLevelType w:val="hybridMultilevel"/>
+    <w:tmpl w:val="A6FA34B0"/>
+    <w:lvl w:ilvl="0" w:tplc="04160001">
+      <w:start w:val="1"/>
+      <w:numFmt w:val="bullet"/>
+      <w:lvlText w:val=""/>
+      <w:lvlJc w:val="left"/>
+      <w:pPr>
+        <w:ind w:left="720" w:hanging="360"/>
+      </w:pPr>
+      <w:rPr>
+        <w:rFonts w:ascii="Symbol" w:hAnsi="Symbol" w:hint="default"/>
+      </w:rPr>
+    </w:lvl>
+    <w:lvl w:ilvl="1" w:tplc="A6B02B1A">
+      <w:numFmt w:val="decimal"/>
+      <w:lvlText w:val=""/>
+      <w:lvlJc w:val="left"/>
+    </w:lvl>
+    <w:lvl w:ilvl="2" w:tplc="E0104B56">
+      <w:numFmt w:val="decimal"/>
+      <w:lvlText w:val=""/>
+      <w:lvlJc w:val="left"/>
+    </w:lvl>
+    <w:lvl w:ilvl="3" w:tplc="7C86BCDE">
+      <w:numFmt w:val="decimal"/>
+      <w:lvlText w:val=""/>
+      <w:lvlJc w:val="left"/>
+    </w:lvl>
+    <w:lvl w:ilvl="4" w:tplc="4B9E7C1C">
+      <w:numFmt w:val="decimal"/>
+      <w:lvlText w:val=""/>
+      <w:lvlJc w:val="left"/>
+    </w:lvl>
+    <w:lvl w:ilvl="5" w:tplc="B512EBE8">
+      <w:numFmt w:val="decimal"/>
+      <w:lvlText w:val=""/>
+      <w:lvlJc w:val="left"/>
+    </w:lvl>
+    <w:lvl w:ilvl="6" w:tplc="DD1881E2">
+      <w:numFmt w:val="decimal"/>
+      <w:lvlText w:val=""/>
+      <w:lvlJc w:val="left"/>
+    </w:lvl>
+    <w:lvl w:ilvl="7" w:tplc="5E4C232E">
+      <w:numFmt w:val="decimal"/>
+      <w:lvlText w:val=""/>
+      <w:lvlJc w:val="left"/>
+    </w:lvl>
+    <w:lvl w:ilvl="8" w:tplc="EADECD70">
+      <w:numFmt w:val="decimal"/>
+      <w:lvlText w:val=""/>
+      <w:lvlJc w:val="left"/>
+    </w:lvl>
+  </w:abstractNum>
+  <w:abstractNum w:abstractNumId="3" w15:restartNumberingAfterBreak="0">
+    <w:nsid w:val="17BE0021"/>
+    <w:multiLevelType w:val="multilevel"/>
+    <w:tmpl w:val="36723876"/>
+    <w:lvl w:ilvl="0">
+      <w:start w:val="1"/>
+      <w:numFmt w:val="bullet"/>
+      <w:lvlText w:val=""/>
+      <w:lvlJc w:val="left"/>
+      <w:pPr>
+        <w:tabs>
+          <w:tab w:val="num" w:pos="720"/>
+        </w:tabs>
+        <w:ind w:left="720" w:hanging="360"/>
+      </w:pPr>
+      <w:rPr>
+        <w:rFonts w:ascii="Symbol" w:hAnsi="Symbol" w:hint="default"/>
+        <w:sz w:val="20"/>
+      </w:rPr>
+    </w:lvl>
+    <w:lvl w:ilvl="1" w:tentative="1">
+      <w:start w:val="1"/>
+      <w:numFmt w:val="bullet"/>
+      <w:lvlText w:val="o"/>
+      <w:lvlJc w:val="left"/>
+      <w:pPr>
+        <w:tabs>
+          <w:tab w:val="num" w:pos="1440"/>
+        </w:tabs>
+        <w:ind w:left="1440" w:hanging="360"/>
+      </w:pPr>
+      <w:rPr>
+        <w:rFonts w:ascii="Courier New" w:hAnsi="Courier New" w:hint="default"/>
+        <w:sz w:val="20"/>
+      </w:rPr>
+    </w:lvl>
+    <w:lvl w:ilvl="2" w:tentative="1">
+      <w:start w:val="1"/>
+      <w:numFmt w:val="bullet"/>
+      <w:lvlText w:val=""/>
+      <w:lvlJc w:val="left"/>
+      <w:pPr>
+        <w:tabs>
+          <w:tab w:val="num" w:pos="2160"/>
+        </w:tabs>
+        <w:ind w:left="2160" w:hanging="360"/>
+      </w:pPr>
+      <w:rPr>
+        <w:rFonts w:ascii="Wingdings" w:hAnsi="Wingdings" w:hint="default"/>
+        <w:sz w:val="20"/>
+      </w:rPr>
+    </w:lvl>
+    <w:lvl w:ilvl="3" w:tentative="1">
+      <w:start w:val="1"/>
+      <w:numFmt w:val="bullet"/>
+      <w:lvlText w:val=""/>
+      <w:lvlJc w:val="left"/>
+      <w:pPr>
+        <w:tabs>
+          <w:tab w:val="num" w:pos="2880"/>
+        </w:tabs>
+        <w:ind w:left="2880" w:hanging="360"/>
+      </w:pPr>
+      <w:rPr>
+        <w:rFonts w:ascii="Wingdings" w:hAnsi="Wingdings" w:hint="default"/>
+        <w:sz w:val="20"/>
+      </w:rPr>
+    </w:lvl>
+    <w:lvl w:ilvl="4" w:tentative="1">
+      <w:start w:val="1"/>
+      <w:numFmt w:val="bullet"/>
+      <w:lvlText w:val=""/>
+      <w:lvlJc w:val="left"/>
+      <w:pPr>
+        <w:tabs>
+          <w:tab w:val="num" w:pos="3600"/>
+        </w:tabs>
+        <w:ind w:left="3600" w:hanging="360"/>
+      </w:pPr>
+      <w:rPr>
+        <w:rFonts w:ascii="Wingdings" w:hAnsi="Wingdings" w:hint="default"/>
+        <w:sz w:val="20"/>
+      </w:rPr>
+    </w:lvl>
+    <w:lvl w:ilvl="5" w:tentative="1">
+      <w:start w:val="1"/>
+      <w:numFmt w:val="bullet"/>
+      <w:lvlText w:val=""/>
+      <w:lvlJc w:val="left"/>
+      <w:pPr>
+        <w:tabs>
+          <w:tab w:val="num" w:pos="4320"/>
+        </w:tabs>
+        <w:ind w:left="4320" w:hanging="360"/>
+      </w:pPr>
+      <w:rPr>
+        <w:rFonts w:ascii="Wingdings" w:hAnsi="Wingdings" w:hint="default"/>
+        <w:sz w:val="20"/>
+      </w:rPr>
+    </w:lvl>
+    <w:lvl w:ilvl="6" w:tentative="1">
+      <w:start w:val="1"/>
+      <w:numFmt w:val="bullet"/>
+      <w:lvlText w:val=""/>
+      <w:lvlJc w:val="left"/>
+      <w:pPr>
+        <w:tabs>
+          <w:tab w:val="num" w:pos="5040"/>
+        </w:tabs>
+        <w:ind w:left="5040" w:hanging="360"/>
+      </w:pPr>
+      <w:rPr>
+        <w:rFonts w:ascii="Wingdings" w:hAnsi="Wingdings" w:hint="default"/>
+        <w:sz w:val="20"/>
+      </w:rPr>
+    </w:lvl>
+    <w:lvl w:ilvl="7" w:tentative="1">
+      <w:start w:val="1"/>
+      <w:numFmt w:val="bullet"/>
+      <w:lvlText w:val=""/>
+      <w:lvlJc w:val="left"/>
+      <w:pPr>
+        <w:tabs>
+          <w:tab w:val="num" w:pos="5760"/>
+        </w:tabs>
+        <w:ind w:left="5760" w:hanging="360"/>
+      </w:pPr>
+      <w:rPr>
+        <w:rFonts w:ascii="Wingdings" w:hAnsi="Wingdings" w:hint="default"/>
+        <w:sz w:val="20"/>
+      </w:rPr>
+    </w:lvl>
+    <w:lvl w:ilvl="8" w:tentative="1">
+      <w:start w:val="1"/>
+      <w:numFmt w:val="bullet"/>
+      <w:lvlText w:val=""/>
+      <w:lvlJc w:val="left"/>
+      <w:pPr>
+        <w:tabs>
+          <w:tab w:val="num" w:pos="6480"/>
+        </w:tabs>
+        <w:ind w:left="6480" w:hanging="360"/>
+      </w:pPr>
+      <w:rPr>
+        <w:rFonts w:ascii="Wingdings" w:hAnsi="Wingdings" w:hint="default"/>
+        <w:sz w:val="20"/>
+      </w:rPr>
+    </w:lvl>
+  </w:abstractNum>
+  <w:abstractNum w:abstractNumId="4" w15:restartNumberingAfterBreak="0">
+    <w:nsid w:val="1A3C1453"/>
+    <w:multiLevelType w:val="hybridMultilevel"/>
+    <w:tmpl w:val="ACDE320A"/>
+    <w:lvl w:ilvl="0" w:tplc="04160001">
+      <w:start w:val="1"/>
+      <w:numFmt w:val="bullet"/>
+      <w:lvlText w:val=""/>
+      <w:lvlJc w:val="left"/>
+      <w:pPr>
+        <w:ind w:left="1080" w:hanging="360"/>
+      </w:pPr>
+      <w:rPr>
+        <w:rFonts w:ascii="Symbol" w:hAnsi="Symbol" w:hint="default"/>
+      </w:rPr>
+    </w:lvl>
+    <w:lvl w:ilvl="1" w:tplc="04160003" w:tentative="1">
+      <w:start w:val="1"/>
+      <w:numFmt w:val="bullet"/>
+      <w:lvlText w:val="o"/>
+      <w:lvlJc w:val="left"/>
+      <w:pPr>
+        <w:ind w:left="1800" w:hanging="360"/>
+      </w:pPr>
+      <w:rPr>
+        <w:rFonts w:ascii="Courier New" w:hAnsi="Courier New" w:cs="Courier New" w:hint="default"/>
+      </w:rPr>
+    </w:lvl>
+    <w:lvl w:ilvl="2" w:tplc="04160005" w:tentative="1">
+      <w:start w:val="1"/>
+      <w:numFmt w:val="bullet"/>
+      <w:lvlText w:val=""/>
+      <w:lvlJc w:val="left"/>
+      <w:pPr>
+        <w:ind w:left="2520" w:hanging="360"/>
+      </w:pPr>
+      <w:rPr>
+        <w:rFonts w:ascii="Wingdings" w:hAnsi="Wingdings" w:hint="default"/>
+      </w:rPr>
+    </w:lvl>
+    <w:lvl w:ilvl="3" w:tplc="04160001" w:tentative="1">
+      <w:start w:val="1"/>
+      <w:numFmt w:val="bullet"/>
+      <w:lvlText w:val=""/>
+      <w:lvlJc w:val="left"/>
+      <w:pPr>
+        <w:ind w:left="3240" w:hanging="360"/>
+      </w:pPr>
+      <w:rPr>
+        <w:rFonts w:ascii="Symbol" w:hAnsi="Symbol" w:hint="default"/>
+      </w:rPr>
+    </w:lvl>
+    <w:lvl w:ilvl="4" w:tplc="04160003" w:tentative="1">
+      <w:start w:val="1"/>
+      <w:numFmt w:val="bullet"/>
+      <w:lvlText w:val="o"/>
+      <w:lvlJc w:val="left"/>
+      <w:pPr>
+        <w:ind w:left="3960" w:hanging="360"/>
+      </w:pPr>
+      <w:rPr>
+        <w:rFonts w:ascii="Courier New" w:hAnsi="Courier New" w:cs="Courier New" w:hint="default"/>
+      </w:rPr>
+    </w:lvl>
+    <w:lvl w:ilvl="5" w:tplc="04160005" w:tentative="1">
+      <w:start w:val="1"/>
+      <w:numFmt w:val="bullet"/>
+      <w:lvlText w:val=""/>
+      <w:lvlJc w:val="left"/>
+      <w:pPr>
+        <w:ind w:left="4680" w:hanging="360"/>
+      </w:pPr>
+      <w:rPr>
+        <w:rFonts w:ascii="Wingdings" w:hAnsi="Wingdings" w:hint="default"/>
+      </w:rPr>
+    </w:lvl>
+    <w:lvl w:ilvl="6" w:tplc="04160001" w:tentative="1">
+      <w:start w:val="1"/>
+      <w:numFmt w:val="bullet"/>
+      <w:lvlText w:val=""/>
+      <w:lvlJc w:val="left"/>
+      <w:pPr>
+        <w:ind w:left="5400" w:hanging="360"/>
+      </w:pPr>
+      <w:rPr>
+        <w:rFonts w:ascii="Symbol" w:hAnsi="Symbol" w:hint="default"/>
+      </w:rPr>
+    </w:lvl>
+    <w:lvl w:ilvl="7" w:tplc="04160003" w:tentative="1">
+      <w:start w:val="1"/>
+      <w:numFmt w:val="bullet"/>
+      <w:lvlText w:val="o"/>
+      <w:lvlJc w:val="left"/>
+      <w:pPr>
+        <w:ind w:left="6120" w:hanging="360"/>
+      </w:pPr>
+      <w:rPr>
+        <w:rFonts w:ascii="Courier New" w:hAnsi="Courier New" w:cs="Courier New" w:hint="default"/>
+      </w:rPr>
+    </w:lvl>
+    <w:lvl w:ilvl="8" w:tplc="04160005" w:tentative="1">
+      <w:start w:val="1"/>
+      <w:numFmt w:val="bullet"/>
+      <w:lvlText w:val=""/>
+      <w:lvlJc w:val="left"/>
+      <w:pPr>
+        <w:ind w:left="6840" w:hanging="360"/>
+      </w:pPr>
+      <w:rPr>
+        <w:rFonts w:ascii="Wingdings" w:hAnsi="Wingdings" w:hint="default"/>
+      </w:rPr>
+    </w:lvl>
+  </w:abstractNum>
+  <w:abstractNum w:abstractNumId="5" w15:restartNumberingAfterBreak="0">
+    <w:nsid w:val="1D6316BE"/>
+    <w:multiLevelType w:val="hybridMultilevel"/>
+    <w:tmpl w:val="50788FDE"/>
+    <w:lvl w:ilvl="0" w:tplc="04160001">
+      <w:start w:val="1"/>
+      <w:numFmt w:val="bullet"/>
+      <w:lvlText w:val=""/>
+      <w:lvlJc w:val="left"/>
+      <w:pPr>
+        <w:ind w:left="720" w:hanging="360"/>
+      </w:pPr>
+      <w:rPr>
+        <w:rFonts w:ascii="Symbol" w:hAnsi="Symbol" w:hint="default"/>
+      </w:rPr>
+    </w:lvl>
+    <w:lvl w:ilvl="1" w:tplc="04160003" w:tentative="1">
+      <w:start w:val="1"/>
+      <w:numFmt w:val="bullet"/>
+      <w:lvlText w:val="o"/>
+      <w:lvlJc w:val="left"/>
+      <w:pPr>
+        <w:ind w:left="1440" w:hanging="360"/>
+      </w:pPr>
+      <w:rPr>
+        <w:rFonts w:ascii="Courier New" w:hAnsi="Courier New" w:cs="Courier New" w:hint="default"/>
+      </w:rPr>
+    </w:lvl>
+    <w:lvl w:ilvl="2" w:tplc="04160005" w:tentative="1">
+      <w:start w:val="1"/>
+      <w:numFmt w:val="bullet"/>
+      <w:lvlText w:val=""/>
+      <w:lvlJc w:val="left"/>
+      <w:pPr>
+        <w:ind w:left="2160" w:hanging="360"/>
+      </w:pPr>
+      <w:rPr>
+        <w:rFonts w:ascii="Wingdings" w:hAnsi="Wingdings" w:hint="default"/>
+      </w:rPr>
+    </w:lvl>
+    <w:lvl w:ilvl="3" w:tplc="04160001" w:tentative="1">
+      <w:start w:val="1"/>
+      <w:numFmt w:val="bullet"/>
+      <w:lvlText w:val=""/>
+      <w:lvlJc w:val="left"/>
+      <w:pPr>
+        <w:ind w:left="2880" w:hanging="360"/>
+      </w:pPr>
+      <w:rPr>
+        <w:rFonts w:ascii="Symbol" w:hAnsi="Symbol" w:hint="default"/>
+      </w:rPr>
+    </w:lvl>
+    <w:lvl w:ilvl="4" w:tplc="04160003" w:tentative="1">
+      <w:start w:val="1"/>
+      <w:numFmt w:val="bullet"/>
+      <w:lvlText w:val="o"/>
+      <w:lvlJc w:val="left"/>
+      <w:pPr>
+        <w:ind w:left="3600" w:hanging="360"/>
+      </w:pPr>
+      <w:rPr>
+        <w:rFonts w:ascii="Courier New" w:hAnsi="Courier New" w:cs="Courier New" w:hint="default"/>
+      </w:rPr>
+    </w:lvl>
+    <w:lvl w:ilvl="5" w:tplc="04160005" w:tentative="1">
+      <w:start w:val="1"/>
+      <w:numFmt w:val="bullet"/>
+      <w:lvlText w:val=""/>
+      <w:lvlJc w:val="left"/>
+      <w:pPr>
+        <w:ind w:left="4320" w:hanging="360"/>
+      </w:pPr>
+      <w:rPr>
+        <w:rFonts w:ascii="Wingdings" w:hAnsi="Wingdings" w:hint="default"/>
+      </w:rPr>
+    </w:lvl>
+    <w:lvl w:ilvl="6" w:tplc="04160001" w:tentative="1">
+      <w:start w:val="1"/>
+      <w:numFmt w:val="bullet"/>
+      <w:lvlText w:val=""/>
+      <w:lvlJc w:val="left"/>
+      <w:pPr>
+        <w:ind w:left="5040" w:hanging="360"/>
+      </w:pPr>
+      <w:rPr>
+        <w:rFonts w:ascii="Symbol" w:hAnsi="Symbol" w:hint="default"/>
+      </w:rPr>
+    </w:lvl>
+    <w:lvl w:ilvl="7" w:tplc="04160003" w:tentative="1">
+      <w:start w:val="1"/>
+      <w:numFmt w:val="bullet"/>
+      <w:lvlText w:val="o"/>
+      <w:lvlJc w:val="left"/>
+      <w:pPr>
+        <w:ind w:left="5760" w:hanging="360"/>
+      </w:pPr>
+      <w:rPr>
+        <w:rFonts w:ascii="Courier New" w:hAnsi="Courier New" w:cs="Courier New" w:hint="default"/>
+      </w:rPr>
+    </w:lvl>
+    <w:lvl w:ilvl="8" w:tplc="04160005" w:tentative="1">
+      <w:start w:val="1"/>
+      <w:numFmt w:val="bullet"/>
+      <w:lvlText w:val=""/>
+      <w:lvlJc w:val="left"/>
+      <w:pPr>
+        <w:ind w:left="6480" w:hanging="360"/>
+      </w:pPr>
+      <w:rPr>
+        <w:rFonts w:ascii="Wingdings" w:hAnsi="Wingdings" w:hint="default"/>
+      </w:rPr>
+    </w:lvl>
+  </w:abstractNum>
+  <w:abstractNum w:abstractNumId="6" w15:restartNumberingAfterBreak="0">
+    <w:nsid w:val="2AF10860"/>
+    <w:multiLevelType w:val="hybridMultilevel"/>
+    <w:tmpl w:val="DD9414C8"/>
+    <w:lvl w:ilvl="0" w:tplc="04160001">
+      <w:start w:val="1"/>
+      <w:numFmt w:val="bullet"/>
+      <w:lvlText w:val=""/>
+      <w:lvlJc w:val="left"/>
+      <w:pPr>
+        <w:ind w:left="720" w:hanging="360"/>
+      </w:pPr>
+      <w:rPr>
+        <w:rFonts w:ascii="Symbol" w:hAnsi="Symbol" w:hint="default"/>
+      </w:rPr>
+    </w:lvl>
+    <w:lvl w:ilvl="1" w:tplc="A6B02B1A">
+      <w:numFmt w:val="decimal"/>
+      <w:lvlText w:val=""/>
+      <w:lvlJc w:val="left"/>
+    </w:lvl>
+    <w:lvl w:ilvl="2" w:tplc="E0104B56">
+      <w:numFmt w:val="decimal"/>
+      <w:lvlText w:val=""/>
+      <w:lvlJc w:val="left"/>
+    </w:lvl>
+    <w:lvl w:ilvl="3" w:tplc="7C86BCDE">
+      <w:numFmt w:val="decimal"/>
+      <w:lvlText w:val=""/>
+      <w:lvlJc w:val="left"/>
+    </w:lvl>
+    <w:lvl w:ilvl="4" w:tplc="4B9E7C1C">
+      <w:numFmt w:val="decimal"/>
+      <w:lvlText w:val=""/>
+      <w:lvlJc w:val="left"/>
+    </w:lvl>
+    <w:lvl w:ilvl="5" w:tplc="B512EBE8">
+      <w:numFmt w:val="decimal"/>
+      <w:lvlText w:val=""/>
+      <w:lvlJc w:val="left"/>
+    </w:lvl>
+    <w:lvl w:ilvl="6" w:tplc="DD1881E2">
+      <w:numFmt w:val="decimal"/>
+      <w:lvlText w:val=""/>
+      <w:lvlJc w:val="left"/>
+    </w:lvl>
+    <w:lvl w:ilvl="7" w:tplc="5E4C232E">
+      <w:numFmt w:val="decimal"/>
+      <w:lvlText w:val=""/>
+      <w:lvlJc w:val="left"/>
+    </w:lvl>
+    <w:lvl w:ilvl="8" w:tplc="EADECD70">
+      <w:numFmt w:val="decimal"/>
+      <w:lvlText w:val=""/>
+      <w:lvlJc w:val="left"/>
+    </w:lvl>
+  </w:abstractNum>
+  <w:abstractNum w:abstractNumId="7" w15:restartNumberingAfterBreak="0">
+    <w:nsid w:val="304205FE"/>
+    <w:multiLevelType w:val="hybridMultilevel"/>
+    <w:tmpl w:val="3640863E"/>
+    <w:lvl w:ilvl="0" w:tplc="58B8018C">
+      <w:start w:val="1"/>
+      <w:numFmt w:val="bullet"/>
+      <w:lvlText w:val="•"/>
+      <w:lvlJc w:val="left"/>
+      <w:pPr>
+        <w:ind w:left="1080" w:hanging="360"/>
+      </w:pPr>
+    </w:lvl>
+    <w:lvl w:ilvl="1" w:tplc="04160003" w:tentative="1">
+      <w:start w:val="1"/>
+      <w:numFmt w:val="bullet"/>
+      <w:lvlText w:val="o"/>
+      <w:lvlJc w:val="left"/>
+      <w:pPr>
+        <w:ind w:left="1800" w:hanging="360"/>
+      </w:pPr>
+      <w:rPr>
+        <w:rFonts w:ascii="Courier New" w:hAnsi="Courier New" w:cs="Courier New" w:hint="default"/>
+      </w:rPr>
+    </w:lvl>
+    <w:lvl w:ilvl="2" w:tplc="04160005" w:tentative="1">
+      <w:start w:val="1"/>
+      <w:numFmt w:val="bullet"/>
+      <w:lvlText w:val=""/>
+      <w:lvlJc w:val="left"/>
+      <w:pPr>
+        <w:ind w:left="2520" w:hanging="360"/>
+      </w:pPr>
+      <w:rPr>
+        <w:rFonts w:ascii="Wingdings" w:hAnsi="Wingdings" w:hint="default"/>
+      </w:rPr>
+    </w:lvl>
+    <w:lvl w:ilvl="3" w:tplc="04160001" w:tentative="1">
+      <w:start w:val="1"/>
+      <w:numFmt w:val="bullet"/>
+      <w:lvlText w:val=""/>
+      <w:lvlJc w:val="left"/>
+      <w:pPr>
+        <w:ind w:left="3240" w:hanging="360"/>
+      </w:pPr>
+      <w:rPr>
+        <w:rFonts w:ascii="Symbol" w:hAnsi="Symbol" w:hint="default"/>
+      </w:rPr>
+    </w:lvl>
+    <w:lvl w:ilvl="4" w:tplc="04160003" w:tentative="1">
+      <w:start w:val="1"/>
+      <w:numFmt w:val="bullet"/>
+      <w:lvlText w:val="o"/>
+      <w:lvlJc w:val="left"/>
+      <w:pPr>
+        <w:ind w:left="3960" w:hanging="360"/>
+      </w:pPr>
+      <w:rPr>
+        <w:rFonts w:ascii="Courier New" w:hAnsi="Courier New" w:cs="Courier New" w:hint="default"/>
+      </w:rPr>
+    </w:lvl>
+    <w:lvl w:ilvl="5" w:tplc="04160005" w:tentative="1">
+      <w:start w:val="1"/>
+      <w:numFmt w:val="bullet"/>
+      <w:lvlText w:val=""/>
+      <w:lvlJc w:val="left"/>
+      <w:pPr>
+        <w:ind w:left="4680" w:hanging="360"/>
+      </w:pPr>
+      <w:rPr>
+        <w:rFonts w:ascii="Wingdings" w:hAnsi="Wingdings" w:hint="default"/>
+      </w:rPr>
+    </w:lvl>
+    <w:lvl w:ilvl="6" w:tplc="04160001" w:tentative="1">
+      <w:start w:val="1"/>
+      <w:numFmt w:val="bullet"/>
+      <w:lvlText w:val=""/>
+      <w:lvlJc w:val="left"/>
+      <w:pPr>
+        <w:ind w:left="5400" w:hanging="360"/>
+      </w:pPr>
+      <w:rPr>
+        <w:rFonts w:ascii="Symbol" w:hAnsi="Symbol" w:hint="default"/>
+      </w:rPr>
+    </w:lvl>
+    <w:lvl w:ilvl="7" w:tplc="04160003" w:tentative="1">
+      <w:start w:val="1"/>
+      <w:numFmt w:val="bullet"/>
+      <w:lvlText w:val="o"/>
+      <w:lvlJc w:val="left"/>
+      <w:pPr>
+        <w:ind w:left="6120" w:hanging="360"/>
+      </w:pPr>
+      <w:rPr>
+        <w:rFonts w:ascii="Courier New" w:hAnsi="Courier New" w:cs="Courier New" w:hint="default"/>
+      </w:rPr>
+    </w:lvl>
+    <w:lvl w:ilvl="8" w:tplc="04160005" w:tentative="1">
+      <w:start w:val="1"/>
+      <w:numFmt w:val="bullet"/>
+      <w:lvlText w:val=""/>
+      <w:lvlJc w:val="left"/>
+      <w:pPr>
+        <w:ind w:left="6840" w:hanging="360"/>
+      </w:pPr>
+      <w:rPr>
+        <w:rFonts w:ascii="Wingdings" w:hAnsi="Wingdings" w:hint="default"/>
+      </w:rPr>
+    </w:lvl>
+  </w:abstractNum>
+  <w:abstractNum w:abstractNumId="8" w15:restartNumberingAfterBreak="0">
+    <w:nsid w:val="3A434E23"/>
+    <w:multiLevelType w:val="hybridMultilevel"/>
+    <w:tmpl w:val="9D40509A"/>
+    <w:lvl w:ilvl="0" w:tplc="04160001">
+      <w:start w:val="1"/>
+      <w:numFmt w:val="bullet"/>
+      <w:lvlText w:val=""/>
+      <w:lvlJc w:val="left"/>
+      <w:pPr>
+        <w:ind w:left="720" w:hanging="360"/>
+      </w:pPr>
+      <w:rPr>
+        <w:rFonts w:ascii="Symbol" w:hAnsi="Symbol" w:hint="default"/>
+      </w:rPr>
+    </w:lvl>
+    <w:lvl w:ilvl="1" w:tplc="A6B02B1A">
+      <w:numFmt w:val="decimal"/>
+      <w:lvlText w:val=""/>
+      <w:lvlJc w:val="left"/>
+    </w:lvl>
+    <w:lvl w:ilvl="2" w:tplc="E0104B56">
+      <w:numFmt w:val="decimal"/>
+      <w:lvlText w:val=""/>
+      <w:lvlJc w:val="left"/>
+    </w:lvl>
+    <w:lvl w:ilvl="3" w:tplc="7C86BCDE">
+      <w:numFmt w:val="decimal"/>
+      <w:lvlText w:val=""/>
+      <w:lvlJc w:val="left"/>
+    </w:lvl>
+    <w:lvl w:ilvl="4" w:tplc="4B9E7C1C">
+      <w:numFmt w:val="decimal"/>
+      <w:lvlText w:val=""/>
+      <w:lvlJc w:val="left"/>
+    </w:lvl>
+    <w:lvl w:ilvl="5" w:tplc="B512EBE8">
+      <w:numFmt w:val="decimal"/>
+      <w:lvlText w:val=""/>
+      <w:lvlJc w:val="left"/>
+    </w:lvl>
+    <w:lvl w:ilvl="6" w:tplc="DD1881E2">
+      <w:numFmt w:val="decimal"/>
+      <w:lvlText w:val=""/>
+      <w:lvlJc w:val="left"/>
+    </w:lvl>
+    <w:lvl w:ilvl="7" w:tplc="5E4C232E">
+      <w:numFmt w:val="decimal"/>
+      <w:lvlText w:val=""/>
+      <w:lvlJc w:val="left"/>
+    </w:lvl>
+    <w:lvl w:ilvl="8" w:tplc="EADECD70">
+      <w:numFmt w:val="decimal"/>
+      <w:lvlText w:val=""/>
+      <w:lvlJc w:val="left"/>
+    </w:lvl>
+  </w:abstractNum>
+  <w:abstractNum w:abstractNumId="9" w15:restartNumberingAfterBreak="0">
+    <w:nsid w:val="3BA556F1"/>
+    <w:multiLevelType w:val="hybridMultilevel"/>
+    <w:tmpl w:val="31A85800"/>
+    <w:lvl w:ilvl="0" w:tplc="04160001">
+      <w:start w:val="1"/>
+      <w:numFmt w:val="bullet"/>
+      <w:lvlText w:val=""/>
+      <w:lvlJc w:val="left"/>
+      <w:pPr>
+        <w:ind w:left="720" w:hanging="360"/>
+      </w:pPr>
+      <w:rPr>
+        <w:rFonts w:ascii="Symbol" w:hAnsi="Symbol" w:hint="default"/>
+      </w:rPr>
+    </w:lvl>
+    <w:lvl w:ilvl="1" w:tplc="04160003" w:tentative="1">
+      <w:start w:val="1"/>
+      <w:numFmt w:val="bullet"/>
+      <w:lvlText w:val="o"/>
+      <w:lvlJc w:val="left"/>
+      <w:pPr>
+        <w:ind w:left="1440" w:hanging="360"/>
+      </w:pPr>
+      <w:rPr>
+        <w:rFonts w:ascii="Courier New" w:hAnsi="Courier New" w:cs="Courier New" w:hint="default"/>
+      </w:rPr>
+    </w:lvl>
+    <w:lvl w:ilvl="2" w:tplc="04160005" w:tentative="1">
+      <w:start w:val="1"/>
+      <w:numFmt w:val="bullet"/>
+      <w:lvlText w:val=""/>
+      <w:lvlJc w:val="left"/>
+      <w:pPr>
+        <w:ind w:left="2160" w:hanging="360"/>
+      </w:pPr>
+      <w:rPr>
+        <w:rFonts w:ascii="Wingdings" w:hAnsi="Wingdings" w:hint="default"/>
+      </w:rPr>
+    </w:lvl>
+    <w:lvl w:ilvl="3" w:tplc="04160001" w:tentative="1">
+      <w:start w:val="1"/>
+      <w:numFmt w:val="bullet"/>
+      <w:lvlText w:val=""/>
+      <w:lvlJc w:val="left"/>
+      <w:pPr>
+        <w:ind w:left="2880" w:hanging="360"/>
+      </w:pPr>
+      <w:rPr>
+        <w:rFonts w:ascii="Symbol" w:hAnsi="Symbol" w:hint="default"/>
+      </w:rPr>
+    </w:lvl>
+    <w:lvl w:ilvl="4" w:tplc="04160003" w:tentative="1">
+      <w:start w:val="1"/>
+      <w:numFmt w:val="bullet"/>
+      <w:lvlText w:val="o"/>
+      <w:lvlJc w:val="left"/>
+      <w:pPr>
+        <w:ind w:left="3600" w:hanging="360"/>
+      </w:pPr>
+      <w:rPr>
+        <w:rFonts w:ascii="Courier New" w:hAnsi="Courier New" w:cs="Courier New" w:hint="default"/>
+      </w:rPr>
+    </w:lvl>
+    <w:lvl w:ilvl="5" w:tplc="04160005" w:tentative="1">
+      <w:start w:val="1"/>
+      <w:numFmt w:val="bullet"/>
+      <w:lvlText w:val=""/>
+      <w:lvlJc w:val="left"/>
+      <w:pPr>
+        <w:ind w:left="4320" w:hanging="360"/>
+      </w:pPr>
+      <w:rPr>
+        <w:rFonts w:ascii="Wingdings" w:hAnsi="Wingdings" w:hint="default"/>
+      </w:rPr>
+    </w:lvl>
+    <w:lvl w:ilvl="6" w:tplc="04160001" w:tentative="1">
+      <w:start w:val="1"/>
+      <w:numFmt w:val="bullet"/>
+      <w:lvlText w:val=""/>
+      <w:lvlJc w:val="left"/>
+      <w:pPr>
+        <w:ind w:left="5040" w:hanging="360"/>
+      </w:pPr>
+      <w:rPr>
+        <w:rFonts w:ascii="Symbol" w:hAnsi="Symbol" w:hint="default"/>
+      </w:rPr>
+    </w:lvl>
+    <w:lvl w:ilvl="7" w:tplc="04160003" w:tentative="1">
+      <w:start w:val="1"/>
+      <w:numFmt w:val="bullet"/>
+      <w:lvlText w:val="o"/>
+      <w:lvlJc w:val="left"/>
+      <w:pPr>
+        <w:ind w:left="5760" w:hanging="360"/>
+      </w:pPr>
+      <w:rPr>
+        <w:rFonts w:ascii="Courier New" w:hAnsi="Courier New" w:cs="Courier New" w:hint="default"/>
+      </w:rPr>
+    </w:lvl>
+    <w:lvl w:ilvl="8" w:tplc="04160005" w:tentative="1">
+      <w:start w:val="1"/>
+      <w:numFmt w:val="bullet"/>
+      <w:lvlText w:val=""/>
+      <w:lvlJc w:val="left"/>
+      <w:pPr>
+        <w:ind w:left="6480" w:hanging="360"/>
+      </w:pPr>
+      <w:rPr>
+        <w:rFonts w:ascii="Wingdings" w:hAnsi="Wingdings" w:hint="default"/>
+      </w:rPr>
+    </w:lvl>
+  </w:abstractNum>
+  <w:abstractNum w:abstractNumId="10" w15:restartNumberingAfterBreak="0">
+    <w:nsid w:val="46586C8C"/>
+    <w:multiLevelType w:val="multilevel"/>
+    <w:tmpl w:val="0D1645E2"/>
+    <w:lvl w:ilvl="0">
+      <w:start w:val="1"/>
+      <w:numFmt w:val="bullet"/>
+      <w:lvlText w:val=""/>
+      <w:lvlJc w:val="left"/>
+      <w:pPr>
+        <w:tabs>
+          <w:tab w:val="num" w:pos="720"/>
+        </w:tabs>
+        <w:ind w:left="720" w:hanging="360"/>
+      </w:pPr>
+      <w:rPr>
+        <w:rFonts w:ascii="Symbol" w:hAnsi="Symbol" w:hint="default"/>
+        <w:sz w:val="20"/>
+      </w:rPr>
+    </w:lvl>
+    <w:lvl w:ilvl="1" w:tentative="1">
+      <w:start w:val="1"/>
+      <w:numFmt w:val="bullet"/>
+      <w:lvlText w:val="o"/>
+      <w:lvlJc w:val="left"/>
+      <w:pPr>
+        <w:tabs>
+          <w:tab w:val="num" w:pos="1440"/>
+        </w:tabs>
+        <w:ind w:left="1440" w:hanging="360"/>
+      </w:pPr>
+      <w:rPr>
+        <w:rFonts w:ascii="Courier New" w:hAnsi="Courier New" w:hint="default"/>
+        <w:sz w:val="20"/>
+      </w:rPr>
+    </w:lvl>
+    <w:lvl w:ilvl="2" w:tentative="1">
+      <w:start w:val="1"/>
+      <w:numFmt w:val="bullet"/>
+      <w:lvlText w:val=""/>
+      <w:lvlJc w:val="left"/>
+      <w:pPr>
+        <w:tabs>
+          <w:tab w:val="num" w:pos="2160"/>
+        </w:tabs>
+        <w:ind w:left="2160" w:hanging="360"/>
+      </w:pPr>
+      <w:rPr>
+        <w:rFonts w:ascii="Wingdings" w:hAnsi="Wingdings" w:hint="default"/>
+        <w:sz w:val="20"/>
+      </w:rPr>
+    </w:lvl>
+    <w:lvl w:ilvl="3" w:tentative="1">
+      <w:start w:val="1"/>
+      <w:numFmt w:val="bullet"/>
+      <w:lvlText w:val=""/>
+      <w:lvlJc w:val="left"/>
+      <w:pPr>
+        <w:tabs>
+          <w:tab w:val="num" w:pos="2880"/>
+        </w:tabs>
+        <w:ind w:left="2880" w:hanging="360"/>
+      </w:pPr>
+      <w:rPr>
+        <w:rFonts w:ascii="Wingdings" w:hAnsi="Wingdings" w:hint="default"/>
+        <w:sz w:val="20"/>
+      </w:rPr>
+    </w:lvl>
+    <w:lvl w:ilvl="4" w:tentative="1">
+      <w:start w:val="1"/>
+      <w:numFmt w:val="bullet"/>
+      <w:lvlText w:val=""/>
+      <w:lvlJc w:val="left"/>
+      <w:pPr>
+        <w:tabs>
+          <w:tab w:val="num" w:pos="3600"/>
+        </w:tabs>
+        <w:ind w:left="3600" w:hanging="360"/>
+      </w:pPr>
+      <w:rPr>
+        <w:rFonts w:ascii="Wingdings" w:hAnsi="Wingdings" w:hint="default"/>
+        <w:sz w:val="20"/>
+      </w:rPr>
+    </w:lvl>
+    <w:lvl w:ilvl="5" w:tentative="1">
+      <w:start w:val="1"/>
+      <w:numFmt w:val="bullet"/>
+      <w:lvlText w:val=""/>
+      <w:lvlJc w:val="left"/>
+      <w:pPr>
+        <w:tabs>
+          <w:tab w:val="num" w:pos="4320"/>
+        </w:tabs>
+        <w:ind w:left="4320" w:hanging="360"/>
+      </w:pPr>
+      <w:rPr>
+        <w:rFonts w:ascii="Wingdings" w:hAnsi="Wingdings" w:hint="default"/>
+        <w:sz w:val="20"/>
+      </w:rPr>
+    </w:lvl>
+    <w:lvl w:ilvl="6" w:tentative="1">
+      <w:start w:val="1"/>
+      <w:numFmt w:val="bullet"/>
+      <w:lvlText w:val=""/>
+      <w:lvlJc w:val="left"/>
+      <w:pPr>
+        <w:tabs>
+          <w:tab w:val="num" w:pos="5040"/>
+        </w:tabs>
+        <w:ind w:left="5040" w:hanging="360"/>
+      </w:pPr>
+      <w:rPr>
+        <w:rFonts w:ascii="Wingdings" w:hAnsi="Wingdings" w:hint="default"/>
+        <w:sz w:val="20"/>
+      </w:rPr>
+    </w:lvl>
+    <w:lvl w:ilvl="7" w:tentative="1">
+      <w:start w:val="1"/>
+      <w:numFmt w:val="bullet"/>
+      <w:lvlText w:val=""/>
+      <w:lvlJc w:val="left"/>
+      <w:pPr>
+        <w:tabs>
+          <w:tab w:val="num" w:pos="5760"/>
+        </w:tabs>
+        <w:ind w:left="5760" w:hanging="360"/>
+      </w:pPr>
+      <w:rPr>
+        <w:rFonts w:ascii="Wingdings" w:hAnsi="Wingdings" w:hint="default"/>
+        <w:sz w:val="20"/>
+      </w:rPr>
+    </w:lvl>
+    <w:lvl w:ilvl="8" w:tentative="1">
+      <w:start w:val="1"/>
+      <w:numFmt w:val="bullet"/>
+      <w:lvlText w:val=""/>
+      <w:lvlJc w:val="left"/>
+      <w:pPr>
+        <w:tabs>
+          <w:tab w:val="num" w:pos="6480"/>
+        </w:tabs>
+        <w:ind w:left="6480" w:hanging="360"/>
+      </w:pPr>
+      <w:rPr>
+        <w:rFonts w:ascii="Wingdings" w:hAnsi="Wingdings" w:hint="default"/>
+        <w:sz w:val="20"/>
+      </w:rPr>
+    </w:lvl>
+  </w:abstractNum>
+  <w:abstractNum w:abstractNumId="11" w15:restartNumberingAfterBreak="0">
     <w:nsid w:val="49575430"/>
     <w:multiLevelType w:val="hybridMultilevel"/>
     <w:tmpl w:val="05168A9E"/>
@@ -5707,7 +7361,7 @@
       <w:lvlJc w:val="left"/>
     </w:lvl>
   </w:abstractNum>
-  <w:abstractNum w:abstractNumId="1" w15:restartNumberingAfterBreak="0">
+  <w:abstractNum w:abstractNumId="12" w15:restartNumberingAfterBreak="0">
     <w:nsid w:val="4FC7509E"/>
     <w:multiLevelType w:val="hybridMultilevel"/>
     <w:tmpl w:val="230E3B7C"/>
@@ -5793,17 +7447,1209 @@
       </w:pPr>
     </w:lvl>
   </w:abstractNum>
+  <w:abstractNum w:abstractNumId="13" w15:restartNumberingAfterBreak="0">
+    <w:nsid w:val="543258C6"/>
+    <w:multiLevelType w:val="multilevel"/>
+    <w:tmpl w:val="D3EC8BA6"/>
+    <w:lvl w:ilvl="0">
+      <w:start w:val="1"/>
+      <w:numFmt w:val="bullet"/>
+      <w:lvlText w:val=""/>
+      <w:lvlJc w:val="left"/>
+      <w:pPr>
+        <w:tabs>
+          <w:tab w:val="num" w:pos="720"/>
+        </w:tabs>
+        <w:ind w:left="720" w:hanging="360"/>
+      </w:pPr>
+      <w:rPr>
+        <w:rFonts w:ascii="Symbol" w:hAnsi="Symbol" w:hint="default"/>
+        <w:sz w:val="20"/>
+      </w:rPr>
+    </w:lvl>
+    <w:lvl w:ilvl="1" w:tentative="1">
+      <w:start w:val="1"/>
+      <w:numFmt w:val="bullet"/>
+      <w:lvlText w:val="o"/>
+      <w:lvlJc w:val="left"/>
+      <w:pPr>
+        <w:tabs>
+          <w:tab w:val="num" w:pos="1440"/>
+        </w:tabs>
+        <w:ind w:left="1440" w:hanging="360"/>
+      </w:pPr>
+      <w:rPr>
+        <w:rFonts w:ascii="Courier New" w:hAnsi="Courier New" w:hint="default"/>
+        <w:sz w:val="20"/>
+      </w:rPr>
+    </w:lvl>
+    <w:lvl w:ilvl="2" w:tentative="1">
+      <w:start w:val="1"/>
+      <w:numFmt w:val="bullet"/>
+      <w:lvlText w:val=""/>
+      <w:lvlJc w:val="left"/>
+      <w:pPr>
+        <w:tabs>
+          <w:tab w:val="num" w:pos="2160"/>
+        </w:tabs>
+        <w:ind w:left="2160" w:hanging="360"/>
+      </w:pPr>
+      <w:rPr>
+        <w:rFonts w:ascii="Wingdings" w:hAnsi="Wingdings" w:hint="default"/>
+        <w:sz w:val="20"/>
+      </w:rPr>
+    </w:lvl>
+    <w:lvl w:ilvl="3" w:tentative="1">
+      <w:start w:val="1"/>
+      <w:numFmt w:val="bullet"/>
+      <w:lvlText w:val=""/>
+      <w:lvlJc w:val="left"/>
+      <w:pPr>
+        <w:tabs>
+          <w:tab w:val="num" w:pos="2880"/>
+        </w:tabs>
+        <w:ind w:left="2880" w:hanging="360"/>
+      </w:pPr>
+      <w:rPr>
+        <w:rFonts w:ascii="Wingdings" w:hAnsi="Wingdings" w:hint="default"/>
+        <w:sz w:val="20"/>
+      </w:rPr>
+    </w:lvl>
+    <w:lvl w:ilvl="4" w:tentative="1">
+      <w:start w:val="1"/>
+      <w:numFmt w:val="bullet"/>
+      <w:lvlText w:val=""/>
+      <w:lvlJc w:val="left"/>
+      <w:pPr>
+        <w:tabs>
+          <w:tab w:val="num" w:pos="3600"/>
+        </w:tabs>
+        <w:ind w:left="3600" w:hanging="360"/>
+      </w:pPr>
+      <w:rPr>
+        <w:rFonts w:ascii="Wingdings" w:hAnsi="Wingdings" w:hint="default"/>
+        <w:sz w:val="20"/>
+      </w:rPr>
+    </w:lvl>
+    <w:lvl w:ilvl="5" w:tentative="1">
+      <w:start w:val="1"/>
+      <w:numFmt w:val="bullet"/>
+      <w:lvlText w:val=""/>
+      <w:lvlJc w:val="left"/>
+      <w:pPr>
+        <w:tabs>
+          <w:tab w:val="num" w:pos="4320"/>
+        </w:tabs>
+        <w:ind w:left="4320" w:hanging="360"/>
+      </w:pPr>
+      <w:rPr>
+        <w:rFonts w:ascii="Wingdings" w:hAnsi="Wingdings" w:hint="default"/>
+        <w:sz w:val="20"/>
+      </w:rPr>
+    </w:lvl>
+    <w:lvl w:ilvl="6" w:tentative="1">
+      <w:start w:val="1"/>
+      <w:numFmt w:val="bullet"/>
+      <w:lvlText w:val=""/>
+      <w:lvlJc w:val="left"/>
+      <w:pPr>
+        <w:tabs>
+          <w:tab w:val="num" w:pos="5040"/>
+        </w:tabs>
+        <w:ind w:left="5040" w:hanging="360"/>
+      </w:pPr>
+      <w:rPr>
+        <w:rFonts w:ascii="Wingdings" w:hAnsi="Wingdings" w:hint="default"/>
+        <w:sz w:val="20"/>
+      </w:rPr>
+    </w:lvl>
+    <w:lvl w:ilvl="7" w:tentative="1">
+      <w:start w:val="1"/>
+      <w:numFmt w:val="bullet"/>
+      <w:lvlText w:val=""/>
+      <w:lvlJc w:val="left"/>
+      <w:pPr>
+        <w:tabs>
+          <w:tab w:val="num" w:pos="5760"/>
+        </w:tabs>
+        <w:ind w:left="5760" w:hanging="360"/>
+      </w:pPr>
+      <w:rPr>
+        <w:rFonts w:ascii="Wingdings" w:hAnsi="Wingdings" w:hint="default"/>
+        <w:sz w:val="20"/>
+      </w:rPr>
+    </w:lvl>
+    <w:lvl w:ilvl="8" w:tentative="1">
+      <w:start w:val="1"/>
+      <w:numFmt w:val="bullet"/>
+      <w:lvlText w:val=""/>
+      <w:lvlJc w:val="left"/>
+      <w:pPr>
+        <w:tabs>
+          <w:tab w:val="num" w:pos="6480"/>
+        </w:tabs>
+        <w:ind w:left="6480" w:hanging="360"/>
+      </w:pPr>
+      <w:rPr>
+        <w:rFonts w:ascii="Wingdings" w:hAnsi="Wingdings" w:hint="default"/>
+        <w:sz w:val="20"/>
+      </w:rPr>
+    </w:lvl>
+  </w:abstractNum>
+  <w:abstractNum w:abstractNumId="14" w15:restartNumberingAfterBreak="0">
+    <w:nsid w:val="56A41A4E"/>
+    <w:multiLevelType w:val="multilevel"/>
+    <w:tmpl w:val="AE408148"/>
+    <w:lvl w:ilvl="0">
+      <w:start w:val="1"/>
+      <w:numFmt w:val="bullet"/>
+      <w:lvlText w:val=""/>
+      <w:lvlJc w:val="left"/>
+      <w:pPr>
+        <w:tabs>
+          <w:tab w:val="num" w:pos="720"/>
+        </w:tabs>
+        <w:ind w:left="720" w:hanging="360"/>
+      </w:pPr>
+      <w:rPr>
+        <w:rFonts w:ascii="Symbol" w:hAnsi="Symbol" w:hint="default"/>
+        <w:sz w:val="20"/>
+      </w:rPr>
+    </w:lvl>
+    <w:lvl w:ilvl="1" w:tentative="1">
+      <w:start w:val="1"/>
+      <w:numFmt w:val="bullet"/>
+      <w:lvlText w:val="o"/>
+      <w:lvlJc w:val="left"/>
+      <w:pPr>
+        <w:tabs>
+          <w:tab w:val="num" w:pos="1440"/>
+        </w:tabs>
+        <w:ind w:left="1440" w:hanging="360"/>
+      </w:pPr>
+      <w:rPr>
+        <w:rFonts w:ascii="Courier New" w:hAnsi="Courier New" w:hint="default"/>
+        <w:sz w:val="20"/>
+      </w:rPr>
+    </w:lvl>
+    <w:lvl w:ilvl="2" w:tentative="1">
+      <w:start w:val="1"/>
+      <w:numFmt w:val="bullet"/>
+      <w:lvlText w:val=""/>
+      <w:lvlJc w:val="left"/>
+      <w:pPr>
+        <w:tabs>
+          <w:tab w:val="num" w:pos="2160"/>
+        </w:tabs>
+        <w:ind w:left="2160" w:hanging="360"/>
+      </w:pPr>
+      <w:rPr>
+        <w:rFonts w:ascii="Wingdings" w:hAnsi="Wingdings" w:hint="default"/>
+        <w:sz w:val="20"/>
+      </w:rPr>
+    </w:lvl>
+    <w:lvl w:ilvl="3" w:tentative="1">
+      <w:start w:val="1"/>
+      <w:numFmt w:val="bullet"/>
+      <w:lvlText w:val=""/>
+      <w:lvlJc w:val="left"/>
+      <w:pPr>
+        <w:tabs>
+          <w:tab w:val="num" w:pos="2880"/>
+        </w:tabs>
+        <w:ind w:left="2880" w:hanging="360"/>
+      </w:pPr>
+      <w:rPr>
+        <w:rFonts w:ascii="Wingdings" w:hAnsi="Wingdings" w:hint="default"/>
+        <w:sz w:val="20"/>
+      </w:rPr>
+    </w:lvl>
+    <w:lvl w:ilvl="4" w:tentative="1">
+      <w:start w:val="1"/>
+      <w:numFmt w:val="bullet"/>
+      <w:lvlText w:val=""/>
+      <w:lvlJc w:val="left"/>
+      <w:pPr>
+        <w:tabs>
+          <w:tab w:val="num" w:pos="3600"/>
+        </w:tabs>
+        <w:ind w:left="3600" w:hanging="360"/>
+      </w:pPr>
+      <w:rPr>
+        <w:rFonts w:ascii="Wingdings" w:hAnsi="Wingdings" w:hint="default"/>
+        <w:sz w:val="20"/>
+      </w:rPr>
+    </w:lvl>
+    <w:lvl w:ilvl="5" w:tentative="1">
+      <w:start w:val="1"/>
+      <w:numFmt w:val="bullet"/>
+      <w:lvlText w:val=""/>
+      <w:lvlJc w:val="left"/>
+      <w:pPr>
+        <w:tabs>
+          <w:tab w:val="num" w:pos="4320"/>
+        </w:tabs>
+        <w:ind w:left="4320" w:hanging="360"/>
+      </w:pPr>
+      <w:rPr>
+        <w:rFonts w:ascii="Wingdings" w:hAnsi="Wingdings" w:hint="default"/>
+        <w:sz w:val="20"/>
+      </w:rPr>
+    </w:lvl>
+    <w:lvl w:ilvl="6" w:tentative="1">
+      <w:start w:val="1"/>
+      <w:numFmt w:val="bullet"/>
+      <w:lvlText w:val=""/>
+      <w:lvlJc w:val="left"/>
+      <w:pPr>
+        <w:tabs>
+          <w:tab w:val="num" w:pos="5040"/>
+        </w:tabs>
+        <w:ind w:left="5040" w:hanging="360"/>
+      </w:pPr>
+      <w:rPr>
+        <w:rFonts w:ascii="Wingdings" w:hAnsi="Wingdings" w:hint="default"/>
+        <w:sz w:val="20"/>
+      </w:rPr>
+    </w:lvl>
+    <w:lvl w:ilvl="7" w:tentative="1">
+      <w:start w:val="1"/>
+      <w:numFmt w:val="bullet"/>
+      <w:lvlText w:val=""/>
+      <w:lvlJc w:val="left"/>
+      <w:pPr>
+        <w:tabs>
+          <w:tab w:val="num" w:pos="5760"/>
+        </w:tabs>
+        <w:ind w:left="5760" w:hanging="360"/>
+      </w:pPr>
+      <w:rPr>
+        <w:rFonts w:ascii="Wingdings" w:hAnsi="Wingdings" w:hint="default"/>
+        <w:sz w:val="20"/>
+      </w:rPr>
+    </w:lvl>
+    <w:lvl w:ilvl="8" w:tentative="1">
+      <w:start w:val="1"/>
+      <w:numFmt w:val="bullet"/>
+      <w:lvlText w:val=""/>
+      <w:lvlJc w:val="left"/>
+      <w:pPr>
+        <w:tabs>
+          <w:tab w:val="num" w:pos="6480"/>
+        </w:tabs>
+        <w:ind w:left="6480" w:hanging="360"/>
+      </w:pPr>
+      <w:rPr>
+        <w:rFonts w:ascii="Wingdings" w:hAnsi="Wingdings" w:hint="default"/>
+        <w:sz w:val="20"/>
+      </w:rPr>
+    </w:lvl>
+  </w:abstractNum>
+  <w:abstractNum w:abstractNumId="15" w15:restartNumberingAfterBreak="0">
+    <w:nsid w:val="5DAA1F63"/>
+    <w:multiLevelType w:val="hybridMultilevel"/>
+    <w:tmpl w:val="75B2B40A"/>
+    <w:lvl w:ilvl="0" w:tplc="04160001">
+      <w:start w:val="1"/>
+      <w:numFmt w:val="bullet"/>
+      <w:lvlText w:val=""/>
+      <w:lvlJc w:val="left"/>
+      <w:pPr>
+        <w:ind w:left="720" w:hanging="360"/>
+      </w:pPr>
+      <w:rPr>
+        <w:rFonts w:ascii="Symbol" w:hAnsi="Symbol" w:hint="default"/>
+      </w:rPr>
+    </w:lvl>
+    <w:lvl w:ilvl="1" w:tplc="04160003" w:tentative="1">
+      <w:start w:val="1"/>
+      <w:numFmt w:val="bullet"/>
+      <w:lvlText w:val="o"/>
+      <w:lvlJc w:val="left"/>
+      <w:pPr>
+        <w:ind w:left="1440" w:hanging="360"/>
+      </w:pPr>
+      <w:rPr>
+        <w:rFonts w:ascii="Courier New" w:hAnsi="Courier New" w:cs="Courier New" w:hint="default"/>
+      </w:rPr>
+    </w:lvl>
+    <w:lvl w:ilvl="2" w:tplc="04160005" w:tentative="1">
+      <w:start w:val="1"/>
+      <w:numFmt w:val="bullet"/>
+      <w:lvlText w:val=""/>
+      <w:lvlJc w:val="left"/>
+      <w:pPr>
+        <w:ind w:left="2160" w:hanging="360"/>
+      </w:pPr>
+      <w:rPr>
+        <w:rFonts w:ascii="Wingdings" w:hAnsi="Wingdings" w:hint="default"/>
+      </w:rPr>
+    </w:lvl>
+    <w:lvl w:ilvl="3" w:tplc="04160001" w:tentative="1">
+      <w:start w:val="1"/>
+      <w:numFmt w:val="bullet"/>
+      <w:lvlText w:val=""/>
+      <w:lvlJc w:val="left"/>
+      <w:pPr>
+        <w:ind w:left="2880" w:hanging="360"/>
+      </w:pPr>
+      <w:rPr>
+        <w:rFonts w:ascii="Symbol" w:hAnsi="Symbol" w:hint="default"/>
+      </w:rPr>
+    </w:lvl>
+    <w:lvl w:ilvl="4" w:tplc="04160003" w:tentative="1">
+      <w:start w:val="1"/>
+      <w:numFmt w:val="bullet"/>
+      <w:lvlText w:val="o"/>
+      <w:lvlJc w:val="left"/>
+      <w:pPr>
+        <w:ind w:left="3600" w:hanging="360"/>
+      </w:pPr>
+      <w:rPr>
+        <w:rFonts w:ascii="Courier New" w:hAnsi="Courier New" w:cs="Courier New" w:hint="default"/>
+      </w:rPr>
+    </w:lvl>
+    <w:lvl w:ilvl="5" w:tplc="04160005" w:tentative="1">
+      <w:start w:val="1"/>
+      <w:numFmt w:val="bullet"/>
+      <w:lvlText w:val=""/>
+      <w:lvlJc w:val="left"/>
+      <w:pPr>
+        <w:ind w:left="4320" w:hanging="360"/>
+      </w:pPr>
+      <w:rPr>
+        <w:rFonts w:ascii="Wingdings" w:hAnsi="Wingdings" w:hint="default"/>
+      </w:rPr>
+    </w:lvl>
+    <w:lvl w:ilvl="6" w:tplc="04160001" w:tentative="1">
+      <w:start w:val="1"/>
+      <w:numFmt w:val="bullet"/>
+      <w:lvlText w:val=""/>
+      <w:lvlJc w:val="left"/>
+      <w:pPr>
+        <w:ind w:left="5040" w:hanging="360"/>
+      </w:pPr>
+      <w:rPr>
+        <w:rFonts w:ascii="Symbol" w:hAnsi="Symbol" w:hint="default"/>
+      </w:rPr>
+    </w:lvl>
+    <w:lvl w:ilvl="7" w:tplc="04160003" w:tentative="1">
+      <w:start w:val="1"/>
+      <w:numFmt w:val="bullet"/>
+      <w:lvlText w:val="o"/>
+      <w:lvlJc w:val="left"/>
+      <w:pPr>
+        <w:ind w:left="5760" w:hanging="360"/>
+      </w:pPr>
+      <w:rPr>
+        <w:rFonts w:ascii="Courier New" w:hAnsi="Courier New" w:cs="Courier New" w:hint="default"/>
+      </w:rPr>
+    </w:lvl>
+    <w:lvl w:ilvl="8" w:tplc="04160005" w:tentative="1">
+      <w:start w:val="1"/>
+      <w:numFmt w:val="bullet"/>
+      <w:lvlText w:val=""/>
+      <w:lvlJc w:val="left"/>
+      <w:pPr>
+        <w:ind w:left="6480" w:hanging="360"/>
+      </w:pPr>
+      <w:rPr>
+        <w:rFonts w:ascii="Wingdings" w:hAnsi="Wingdings" w:hint="default"/>
+      </w:rPr>
+    </w:lvl>
+  </w:abstractNum>
+  <w:abstractNum w:abstractNumId="16" w15:restartNumberingAfterBreak="0">
+    <w:nsid w:val="5DAA7EB3"/>
+    <w:multiLevelType w:val="multilevel"/>
+    <w:tmpl w:val="BD6ED30A"/>
+    <w:lvl w:ilvl="0">
+      <w:start w:val="1"/>
+      <w:numFmt w:val="bullet"/>
+      <w:lvlText w:val=""/>
+      <w:lvlJc w:val="left"/>
+      <w:pPr>
+        <w:tabs>
+          <w:tab w:val="num" w:pos="720"/>
+        </w:tabs>
+        <w:ind w:left="720" w:hanging="360"/>
+      </w:pPr>
+      <w:rPr>
+        <w:rFonts w:ascii="Symbol" w:hAnsi="Symbol" w:hint="default"/>
+        <w:sz w:val="20"/>
+      </w:rPr>
+    </w:lvl>
+    <w:lvl w:ilvl="1" w:tentative="1">
+      <w:start w:val="1"/>
+      <w:numFmt w:val="bullet"/>
+      <w:lvlText w:val="o"/>
+      <w:lvlJc w:val="left"/>
+      <w:pPr>
+        <w:tabs>
+          <w:tab w:val="num" w:pos="1440"/>
+        </w:tabs>
+        <w:ind w:left="1440" w:hanging="360"/>
+      </w:pPr>
+      <w:rPr>
+        <w:rFonts w:ascii="Courier New" w:hAnsi="Courier New" w:hint="default"/>
+        <w:sz w:val="20"/>
+      </w:rPr>
+    </w:lvl>
+    <w:lvl w:ilvl="2" w:tentative="1">
+      <w:start w:val="1"/>
+      <w:numFmt w:val="bullet"/>
+      <w:lvlText w:val=""/>
+      <w:lvlJc w:val="left"/>
+      <w:pPr>
+        <w:tabs>
+          <w:tab w:val="num" w:pos="2160"/>
+        </w:tabs>
+        <w:ind w:left="2160" w:hanging="360"/>
+      </w:pPr>
+      <w:rPr>
+        <w:rFonts w:ascii="Wingdings" w:hAnsi="Wingdings" w:hint="default"/>
+        <w:sz w:val="20"/>
+      </w:rPr>
+    </w:lvl>
+    <w:lvl w:ilvl="3" w:tentative="1">
+      <w:start w:val="1"/>
+      <w:numFmt w:val="bullet"/>
+      <w:lvlText w:val=""/>
+      <w:lvlJc w:val="left"/>
+      <w:pPr>
+        <w:tabs>
+          <w:tab w:val="num" w:pos="2880"/>
+        </w:tabs>
+        <w:ind w:left="2880" w:hanging="360"/>
+      </w:pPr>
+      <w:rPr>
+        <w:rFonts w:ascii="Wingdings" w:hAnsi="Wingdings" w:hint="default"/>
+        <w:sz w:val="20"/>
+      </w:rPr>
+    </w:lvl>
+    <w:lvl w:ilvl="4" w:tentative="1">
+      <w:start w:val="1"/>
+      <w:numFmt w:val="bullet"/>
+      <w:lvlText w:val=""/>
+      <w:lvlJc w:val="left"/>
+      <w:pPr>
+        <w:tabs>
+          <w:tab w:val="num" w:pos="3600"/>
+        </w:tabs>
+        <w:ind w:left="3600" w:hanging="360"/>
+      </w:pPr>
+      <w:rPr>
+        <w:rFonts w:ascii="Wingdings" w:hAnsi="Wingdings" w:hint="default"/>
+        <w:sz w:val="20"/>
+      </w:rPr>
+    </w:lvl>
+    <w:lvl w:ilvl="5" w:tentative="1">
+      <w:start w:val="1"/>
+      <w:numFmt w:val="bullet"/>
+      <w:lvlText w:val=""/>
+      <w:lvlJc w:val="left"/>
+      <w:pPr>
+        <w:tabs>
+          <w:tab w:val="num" w:pos="4320"/>
+        </w:tabs>
+        <w:ind w:left="4320" w:hanging="360"/>
+      </w:pPr>
+      <w:rPr>
+        <w:rFonts w:ascii="Wingdings" w:hAnsi="Wingdings" w:hint="default"/>
+        <w:sz w:val="20"/>
+      </w:rPr>
+    </w:lvl>
+    <w:lvl w:ilvl="6" w:tentative="1">
+      <w:start w:val="1"/>
+      <w:numFmt w:val="bullet"/>
+      <w:lvlText w:val=""/>
+      <w:lvlJc w:val="left"/>
+      <w:pPr>
+        <w:tabs>
+          <w:tab w:val="num" w:pos="5040"/>
+        </w:tabs>
+        <w:ind w:left="5040" w:hanging="360"/>
+      </w:pPr>
+      <w:rPr>
+        <w:rFonts w:ascii="Wingdings" w:hAnsi="Wingdings" w:hint="default"/>
+        <w:sz w:val="20"/>
+      </w:rPr>
+    </w:lvl>
+    <w:lvl w:ilvl="7" w:tentative="1">
+      <w:start w:val="1"/>
+      <w:numFmt w:val="bullet"/>
+      <w:lvlText w:val=""/>
+      <w:lvlJc w:val="left"/>
+      <w:pPr>
+        <w:tabs>
+          <w:tab w:val="num" w:pos="5760"/>
+        </w:tabs>
+        <w:ind w:left="5760" w:hanging="360"/>
+      </w:pPr>
+      <w:rPr>
+        <w:rFonts w:ascii="Wingdings" w:hAnsi="Wingdings" w:hint="default"/>
+        <w:sz w:val="20"/>
+      </w:rPr>
+    </w:lvl>
+    <w:lvl w:ilvl="8" w:tentative="1">
+      <w:start w:val="1"/>
+      <w:numFmt w:val="bullet"/>
+      <w:lvlText w:val=""/>
+      <w:lvlJc w:val="left"/>
+      <w:pPr>
+        <w:tabs>
+          <w:tab w:val="num" w:pos="6480"/>
+        </w:tabs>
+        <w:ind w:left="6480" w:hanging="360"/>
+      </w:pPr>
+      <w:rPr>
+        <w:rFonts w:ascii="Wingdings" w:hAnsi="Wingdings" w:hint="default"/>
+        <w:sz w:val="20"/>
+      </w:rPr>
+    </w:lvl>
+  </w:abstractNum>
+  <w:abstractNum w:abstractNumId="17" w15:restartNumberingAfterBreak="0">
+    <w:nsid w:val="63516732"/>
+    <w:multiLevelType w:val="hybridMultilevel"/>
+    <w:tmpl w:val="7AD495B0"/>
+    <w:lvl w:ilvl="0" w:tplc="04160001">
+      <w:start w:val="1"/>
+      <w:numFmt w:val="bullet"/>
+      <w:lvlText w:val=""/>
+      <w:lvlJc w:val="left"/>
+      <w:pPr>
+        <w:ind w:left="1080" w:hanging="360"/>
+      </w:pPr>
+      <w:rPr>
+        <w:rFonts w:ascii="Symbol" w:hAnsi="Symbol" w:hint="default"/>
+      </w:rPr>
+    </w:lvl>
+    <w:lvl w:ilvl="1" w:tplc="04160003" w:tentative="1">
+      <w:start w:val="1"/>
+      <w:numFmt w:val="bullet"/>
+      <w:lvlText w:val="o"/>
+      <w:lvlJc w:val="left"/>
+      <w:pPr>
+        <w:ind w:left="1800" w:hanging="360"/>
+      </w:pPr>
+      <w:rPr>
+        <w:rFonts w:ascii="Courier New" w:hAnsi="Courier New" w:cs="Courier New" w:hint="default"/>
+      </w:rPr>
+    </w:lvl>
+    <w:lvl w:ilvl="2" w:tplc="04160005" w:tentative="1">
+      <w:start w:val="1"/>
+      <w:numFmt w:val="bullet"/>
+      <w:lvlText w:val=""/>
+      <w:lvlJc w:val="left"/>
+      <w:pPr>
+        <w:ind w:left="2520" w:hanging="360"/>
+      </w:pPr>
+      <w:rPr>
+        <w:rFonts w:ascii="Wingdings" w:hAnsi="Wingdings" w:hint="default"/>
+      </w:rPr>
+    </w:lvl>
+    <w:lvl w:ilvl="3" w:tplc="04160001" w:tentative="1">
+      <w:start w:val="1"/>
+      <w:numFmt w:val="bullet"/>
+      <w:lvlText w:val=""/>
+      <w:lvlJc w:val="left"/>
+      <w:pPr>
+        <w:ind w:left="3240" w:hanging="360"/>
+      </w:pPr>
+      <w:rPr>
+        <w:rFonts w:ascii="Symbol" w:hAnsi="Symbol" w:hint="default"/>
+      </w:rPr>
+    </w:lvl>
+    <w:lvl w:ilvl="4" w:tplc="04160003" w:tentative="1">
+      <w:start w:val="1"/>
+      <w:numFmt w:val="bullet"/>
+      <w:lvlText w:val="o"/>
+      <w:lvlJc w:val="left"/>
+      <w:pPr>
+        <w:ind w:left="3960" w:hanging="360"/>
+      </w:pPr>
+      <w:rPr>
+        <w:rFonts w:ascii="Courier New" w:hAnsi="Courier New" w:cs="Courier New" w:hint="default"/>
+      </w:rPr>
+    </w:lvl>
+    <w:lvl w:ilvl="5" w:tplc="04160005" w:tentative="1">
+      <w:start w:val="1"/>
+      <w:numFmt w:val="bullet"/>
+      <w:lvlText w:val=""/>
+      <w:lvlJc w:val="left"/>
+      <w:pPr>
+        <w:ind w:left="4680" w:hanging="360"/>
+      </w:pPr>
+      <w:rPr>
+        <w:rFonts w:ascii="Wingdings" w:hAnsi="Wingdings" w:hint="default"/>
+      </w:rPr>
+    </w:lvl>
+    <w:lvl w:ilvl="6" w:tplc="04160001" w:tentative="1">
+      <w:start w:val="1"/>
+      <w:numFmt w:val="bullet"/>
+      <w:lvlText w:val=""/>
+      <w:lvlJc w:val="left"/>
+      <w:pPr>
+        <w:ind w:left="5400" w:hanging="360"/>
+      </w:pPr>
+      <w:rPr>
+        <w:rFonts w:ascii="Symbol" w:hAnsi="Symbol" w:hint="default"/>
+      </w:rPr>
+    </w:lvl>
+    <w:lvl w:ilvl="7" w:tplc="04160003" w:tentative="1">
+      <w:start w:val="1"/>
+      <w:numFmt w:val="bullet"/>
+      <w:lvlText w:val="o"/>
+      <w:lvlJc w:val="left"/>
+      <w:pPr>
+        <w:ind w:left="6120" w:hanging="360"/>
+      </w:pPr>
+      <w:rPr>
+        <w:rFonts w:ascii="Courier New" w:hAnsi="Courier New" w:cs="Courier New" w:hint="default"/>
+      </w:rPr>
+    </w:lvl>
+    <w:lvl w:ilvl="8" w:tplc="04160005" w:tentative="1">
+      <w:start w:val="1"/>
+      <w:numFmt w:val="bullet"/>
+      <w:lvlText w:val=""/>
+      <w:lvlJc w:val="left"/>
+      <w:pPr>
+        <w:ind w:left="6840" w:hanging="360"/>
+      </w:pPr>
+      <w:rPr>
+        <w:rFonts w:ascii="Wingdings" w:hAnsi="Wingdings" w:hint="default"/>
+      </w:rPr>
+    </w:lvl>
+  </w:abstractNum>
+  <w:abstractNum w:abstractNumId="18" w15:restartNumberingAfterBreak="0">
+    <w:nsid w:val="6A3C5B02"/>
+    <w:multiLevelType w:val="hybridMultilevel"/>
+    <w:tmpl w:val="0D5E4E2A"/>
+    <w:lvl w:ilvl="0" w:tplc="04160001">
+      <w:start w:val="1"/>
+      <w:numFmt w:val="bullet"/>
+      <w:lvlText w:val=""/>
+      <w:lvlJc w:val="left"/>
+      <w:pPr>
+        <w:ind w:left="720" w:hanging="360"/>
+      </w:pPr>
+      <w:rPr>
+        <w:rFonts w:ascii="Symbol" w:hAnsi="Symbol" w:hint="default"/>
+      </w:rPr>
+    </w:lvl>
+    <w:lvl w:ilvl="1" w:tplc="04160003" w:tentative="1">
+      <w:start w:val="1"/>
+      <w:numFmt w:val="bullet"/>
+      <w:lvlText w:val="o"/>
+      <w:lvlJc w:val="left"/>
+      <w:pPr>
+        <w:ind w:left="1440" w:hanging="360"/>
+      </w:pPr>
+      <w:rPr>
+        <w:rFonts w:ascii="Courier New" w:hAnsi="Courier New" w:cs="Courier New" w:hint="default"/>
+      </w:rPr>
+    </w:lvl>
+    <w:lvl w:ilvl="2" w:tplc="04160005" w:tentative="1">
+      <w:start w:val="1"/>
+      <w:numFmt w:val="bullet"/>
+      <w:lvlText w:val=""/>
+      <w:lvlJc w:val="left"/>
+      <w:pPr>
+        <w:ind w:left="2160" w:hanging="360"/>
+      </w:pPr>
+      <w:rPr>
+        <w:rFonts w:ascii="Wingdings" w:hAnsi="Wingdings" w:hint="default"/>
+      </w:rPr>
+    </w:lvl>
+    <w:lvl w:ilvl="3" w:tplc="04160001" w:tentative="1">
+      <w:start w:val="1"/>
+      <w:numFmt w:val="bullet"/>
+      <w:lvlText w:val=""/>
+      <w:lvlJc w:val="left"/>
+      <w:pPr>
+        <w:ind w:left="2880" w:hanging="360"/>
+      </w:pPr>
+      <w:rPr>
+        <w:rFonts w:ascii="Symbol" w:hAnsi="Symbol" w:hint="default"/>
+      </w:rPr>
+    </w:lvl>
+    <w:lvl w:ilvl="4" w:tplc="04160003" w:tentative="1">
+      <w:start w:val="1"/>
+      <w:numFmt w:val="bullet"/>
+      <w:lvlText w:val="o"/>
+      <w:lvlJc w:val="left"/>
+      <w:pPr>
+        <w:ind w:left="3600" w:hanging="360"/>
+      </w:pPr>
+      <w:rPr>
+        <w:rFonts w:ascii="Courier New" w:hAnsi="Courier New" w:cs="Courier New" w:hint="default"/>
+      </w:rPr>
+    </w:lvl>
+    <w:lvl w:ilvl="5" w:tplc="04160005" w:tentative="1">
+      <w:start w:val="1"/>
+      <w:numFmt w:val="bullet"/>
+      <w:lvlText w:val=""/>
+      <w:lvlJc w:val="left"/>
+      <w:pPr>
+        <w:ind w:left="4320" w:hanging="360"/>
+      </w:pPr>
+      <w:rPr>
+        <w:rFonts w:ascii="Wingdings" w:hAnsi="Wingdings" w:hint="default"/>
+      </w:rPr>
+    </w:lvl>
+    <w:lvl w:ilvl="6" w:tplc="04160001" w:tentative="1">
+      <w:start w:val="1"/>
+      <w:numFmt w:val="bullet"/>
+      <w:lvlText w:val=""/>
+      <w:lvlJc w:val="left"/>
+      <w:pPr>
+        <w:ind w:left="5040" w:hanging="360"/>
+      </w:pPr>
+      <w:rPr>
+        <w:rFonts w:ascii="Symbol" w:hAnsi="Symbol" w:hint="default"/>
+      </w:rPr>
+    </w:lvl>
+    <w:lvl w:ilvl="7" w:tplc="04160003" w:tentative="1">
+      <w:start w:val="1"/>
+      <w:numFmt w:val="bullet"/>
+      <w:lvlText w:val="o"/>
+      <w:lvlJc w:val="left"/>
+      <w:pPr>
+        <w:ind w:left="5760" w:hanging="360"/>
+      </w:pPr>
+      <w:rPr>
+        <w:rFonts w:ascii="Courier New" w:hAnsi="Courier New" w:cs="Courier New" w:hint="default"/>
+      </w:rPr>
+    </w:lvl>
+    <w:lvl w:ilvl="8" w:tplc="04160005" w:tentative="1">
+      <w:start w:val="1"/>
+      <w:numFmt w:val="bullet"/>
+      <w:lvlText w:val=""/>
+      <w:lvlJc w:val="left"/>
+      <w:pPr>
+        <w:ind w:left="6480" w:hanging="360"/>
+      </w:pPr>
+      <w:rPr>
+        <w:rFonts w:ascii="Wingdings" w:hAnsi="Wingdings" w:hint="default"/>
+      </w:rPr>
+    </w:lvl>
+  </w:abstractNum>
+  <w:abstractNum w:abstractNumId="19" w15:restartNumberingAfterBreak="0">
+    <w:nsid w:val="754B7DD7"/>
+    <w:multiLevelType w:val="hybridMultilevel"/>
+    <w:tmpl w:val="E4BC955C"/>
+    <w:lvl w:ilvl="0" w:tplc="04160001">
+      <w:start w:val="1"/>
+      <w:numFmt w:val="bullet"/>
+      <w:lvlText w:val=""/>
+      <w:lvlJc w:val="left"/>
+      <w:pPr>
+        <w:ind w:left="1080" w:hanging="360"/>
+      </w:pPr>
+      <w:rPr>
+        <w:rFonts w:ascii="Symbol" w:hAnsi="Symbol" w:hint="default"/>
+      </w:rPr>
+    </w:lvl>
+    <w:lvl w:ilvl="1" w:tplc="04160003" w:tentative="1">
+      <w:start w:val="1"/>
+      <w:numFmt w:val="bullet"/>
+      <w:lvlText w:val="o"/>
+      <w:lvlJc w:val="left"/>
+      <w:pPr>
+        <w:ind w:left="1800" w:hanging="360"/>
+      </w:pPr>
+      <w:rPr>
+        <w:rFonts w:ascii="Courier New" w:hAnsi="Courier New" w:cs="Courier New" w:hint="default"/>
+      </w:rPr>
+    </w:lvl>
+    <w:lvl w:ilvl="2" w:tplc="04160005" w:tentative="1">
+      <w:start w:val="1"/>
+      <w:numFmt w:val="bullet"/>
+      <w:lvlText w:val=""/>
+      <w:lvlJc w:val="left"/>
+      <w:pPr>
+        <w:ind w:left="2520" w:hanging="360"/>
+      </w:pPr>
+      <w:rPr>
+        <w:rFonts w:ascii="Wingdings" w:hAnsi="Wingdings" w:hint="default"/>
+      </w:rPr>
+    </w:lvl>
+    <w:lvl w:ilvl="3" w:tplc="04160001" w:tentative="1">
+      <w:start w:val="1"/>
+      <w:numFmt w:val="bullet"/>
+      <w:lvlText w:val=""/>
+      <w:lvlJc w:val="left"/>
+      <w:pPr>
+        <w:ind w:left="3240" w:hanging="360"/>
+      </w:pPr>
+      <w:rPr>
+        <w:rFonts w:ascii="Symbol" w:hAnsi="Symbol" w:hint="default"/>
+      </w:rPr>
+    </w:lvl>
+    <w:lvl w:ilvl="4" w:tplc="04160003" w:tentative="1">
+      <w:start w:val="1"/>
+      <w:numFmt w:val="bullet"/>
+      <w:lvlText w:val="o"/>
+      <w:lvlJc w:val="left"/>
+      <w:pPr>
+        <w:ind w:left="3960" w:hanging="360"/>
+      </w:pPr>
+      <w:rPr>
+        <w:rFonts w:ascii="Courier New" w:hAnsi="Courier New" w:cs="Courier New" w:hint="default"/>
+      </w:rPr>
+    </w:lvl>
+    <w:lvl w:ilvl="5" w:tplc="04160005" w:tentative="1">
+      <w:start w:val="1"/>
+      <w:numFmt w:val="bullet"/>
+      <w:lvlText w:val=""/>
+      <w:lvlJc w:val="left"/>
+      <w:pPr>
+        <w:ind w:left="4680" w:hanging="360"/>
+      </w:pPr>
+      <w:rPr>
+        <w:rFonts w:ascii="Wingdings" w:hAnsi="Wingdings" w:hint="default"/>
+      </w:rPr>
+    </w:lvl>
+    <w:lvl w:ilvl="6" w:tplc="04160001" w:tentative="1">
+      <w:start w:val="1"/>
+      <w:numFmt w:val="bullet"/>
+      <w:lvlText w:val=""/>
+      <w:lvlJc w:val="left"/>
+      <w:pPr>
+        <w:ind w:left="5400" w:hanging="360"/>
+      </w:pPr>
+      <w:rPr>
+        <w:rFonts w:ascii="Symbol" w:hAnsi="Symbol" w:hint="default"/>
+      </w:rPr>
+    </w:lvl>
+    <w:lvl w:ilvl="7" w:tplc="04160003" w:tentative="1">
+      <w:start w:val="1"/>
+      <w:numFmt w:val="bullet"/>
+      <w:lvlText w:val="o"/>
+      <w:lvlJc w:val="left"/>
+      <w:pPr>
+        <w:ind w:left="6120" w:hanging="360"/>
+      </w:pPr>
+      <w:rPr>
+        <w:rFonts w:ascii="Courier New" w:hAnsi="Courier New" w:cs="Courier New" w:hint="default"/>
+      </w:rPr>
+    </w:lvl>
+    <w:lvl w:ilvl="8" w:tplc="04160005" w:tentative="1">
+      <w:start w:val="1"/>
+      <w:numFmt w:val="bullet"/>
+      <w:lvlText w:val=""/>
+      <w:lvlJc w:val="left"/>
+      <w:pPr>
+        <w:ind w:left="6840" w:hanging="360"/>
+      </w:pPr>
+      <w:rPr>
+        <w:rFonts w:ascii="Wingdings" w:hAnsi="Wingdings" w:hint="default"/>
+      </w:rPr>
+    </w:lvl>
+  </w:abstractNum>
+  <w:abstractNum w:abstractNumId="20" w15:restartNumberingAfterBreak="0">
+    <w:nsid w:val="7AA27076"/>
+    <w:multiLevelType w:val="hybridMultilevel"/>
+    <w:tmpl w:val="8048F14C"/>
+    <w:lvl w:ilvl="0" w:tplc="04160001">
+      <w:start w:val="1"/>
+      <w:numFmt w:val="bullet"/>
+      <w:lvlText w:val=""/>
+      <w:lvlJc w:val="left"/>
+      <w:pPr>
+        <w:ind w:left="720" w:hanging="360"/>
+      </w:pPr>
+      <w:rPr>
+        <w:rFonts w:ascii="Symbol" w:hAnsi="Symbol" w:hint="default"/>
+      </w:rPr>
+    </w:lvl>
+    <w:lvl w:ilvl="1" w:tplc="04160003" w:tentative="1">
+      <w:start w:val="1"/>
+      <w:numFmt w:val="bullet"/>
+      <w:lvlText w:val="o"/>
+      <w:lvlJc w:val="left"/>
+      <w:pPr>
+        <w:ind w:left="1440" w:hanging="360"/>
+      </w:pPr>
+      <w:rPr>
+        <w:rFonts w:ascii="Courier New" w:hAnsi="Courier New" w:cs="Courier New" w:hint="default"/>
+      </w:rPr>
+    </w:lvl>
+    <w:lvl w:ilvl="2" w:tplc="04160005" w:tentative="1">
+      <w:start w:val="1"/>
+      <w:numFmt w:val="bullet"/>
+      <w:lvlText w:val=""/>
+      <w:lvlJc w:val="left"/>
+      <w:pPr>
+        <w:ind w:left="2160" w:hanging="360"/>
+      </w:pPr>
+      <w:rPr>
+        <w:rFonts w:ascii="Wingdings" w:hAnsi="Wingdings" w:hint="default"/>
+      </w:rPr>
+    </w:lvl>
+    <w:lvl w:ilvl="3" w:tplc="04160001" w:tentative="1">
+      <w:start w:val="1"/>
+      <w:numFmt w:val="bullet"/>
+      <w:lvlText w:val=""/>
+      <w:lvlJc w:val="left"/>
+      <w:pPr>
+        <w:ind w:left="2880" w:hanging="360"/>
+      </w:pPr>
+      <w:rPr>
+        <w:rFonts w:ascii="Symbol" w:hAnsi="Symbol" w:hint="default"/>
+      </w:rPr>
+    </w:lvl>
+    <w:lvl w:ilvl="4" w:tplc="04160003" w:tentative="1">
+      <w:start w:val="1"/>
+      <w:numFmt w:val="bullet"/>
+      <w:lvlText w:val="o"/>
+      <w:lvlJc w:val="left"/>
+      <w:pPr>
+        <w:ind w:left="3600" w:hanging="360"/>
+      </w:pPr>
+      <w:rPr>
+        <w:rFonts w:ascii="Courier New" w:hAnsi="Courier New" w:cs="Courier New" w:hint="default"/>
+      </w:rPr>
+    </w:lvl>
+    <w:lvl w:ilvl="5" w:tplc="04160005" w:tentative="1">
+      <w:start w:val="1"/>
+      <w:numFmt w:val="bullet"/>
+      <w:lvlText w:val=""/>
+      <w:lvlJc w:val="left"/>
+      <w:pPr>
+        <w:ind w:left="4320" w:hanging="360"/>
+      </w:pPr>
+      <w:rPr>
+        <w:rFonts w:ascii="Wingdings" w:hAnsi="Wingdings" w:hint="default"/>
+      </w:rPr>
+    </w:lvl>
+    <w:lvl w:ilvl="6" w:tplc="04160001" w:tentative="1">
+      <w:start w:val="1"/>
+      <w:numFmt w:val="bullet"/>
+      <w:lvlText w:val=""/>
+      <w:lvlJc w:val="left"/>
+      <w:pPr>
+        <w:ind w:left="5040" w:hanging="360"/>
+      </w:pPr>
+      <w:rPr>
+        <w:rFonts w:ascii="Symbol" w:hAnsi="Symbol" w:hint="default"/>
+      </w:rPr>
+    </w:lvl>
+    <w:lvl w:ilvl="7" w:tplc="04160003" w:tentative="1">
+      <w:start w:val="1"/>
+      <w:numFmt w:val="bullet"/>
+      <w:lvlText w:val="o"/>
+      <w:lvlJc w:val="left"/>
+      <w:pPr>
+        <w:ind w:left="5760" w:hanging="360"/>
+      </w:pPr>
+      <w:rPr>
+        <w:rFonts w:ascii="Courier New" w:hAnsi="Courier New" w:cs="Courier New" w:hint="default"/>
+      </w:rPr>
+    </w:lvl>
+    <w:lvl w:ilvl="8" w:tplc="04160005" w:tentative="1">
+      <w:start w:val="1"/>
+      <w:numFmt w:val="bullet"/>
+      <w:lvlText w:val=""/>
+      <w:lvlJc w:val="left"/>
+      <w:pPr>
+        <w:ind w:left="6480" w:hanging="360"/>
+      </w:pPr>
+      <w:rPr>
+        <w:rFonts w:ascii="Wingdings" w:hAnsi="Wingdings" w:hint="default"/>
+      </w:rPr>
+    </w:lvl>
+  </w:abstractNum>
+  <w:abstractNum w:abstractNumId="21" w15:restartNumberingAfterBreak="0">
+    <w:nsid w:val="7DF6253A"/>
+    <w:multiLevelType w:val="hybridMultilevel"/>
+    <w:tmpl w:val="9678F6B0"/>
+    <w:lvl w:ilvl="0" w:tplc="04160001">
+      <w:start w:val="1"/>
+      <w:numFmt w:val="bullet"/>
+      <w:lvlText w:val=""/>
+      <w:lvlJc w:val="left"/>
+      <w:pPr>
+        <w:ind w:left="720" w:hanging="360"/>
+      </w:pPr>
+      <w:rPr>
+        <w:rFonts w:ascii="Symbol" w:hAnsi="Symbol" w:hint="default"/>
+      </w:rPr>
+    </w:lvl>
+    <w:lvl w:ilvl="1" w:tplc="A6B02B1A">
+      <w:numFmt w:val="decimal"/>
+      <w:lvlText w:val=""/>
+      <w:lvlJc w:val="left"/>
+    </w:lvl>
+    <w:lvl w:ilvl="2" w:tplc="E0104B56">
+      <w:numFmt w:val="decimal"/>
+      <w:lvlText w:val=""/>
+      <w:lvlJc w:val="left"/>
+    </w:lvl>
+    <w:lvl w:ilvl="3" w:tplc="7C86BCDE">
+      <w:numFmt w:val="decimal"/>
+      <w:lvlText w:val=""/>
+      <w:lvlJc w:val="left"/>
+    </w:lvl>
+    <w:lvl w:ilvl="4" w:tplc="4B9E7C1C">
+      <w:numFmt w:val="decimal"/>
+      <w:lvlText w:val=""/>
+      <w:lvlJc w:val="left"/>
+    </w:lvl>
+    <w:lvl w:ilvl="5" w:tplc="B512EBE8">
+      <w:numFmt w:val="decimal"/>
+      <w:lvlText w:val=""/>
+      <w:lvlJc w:val="left"/>
+    </w:lvl>
+    <w:lvl w:ilvl="6" w:tplc="DD1881E2">
+      <w:numFmt w:val="decimal"/>
+      <w:lvlText w:val=""/>
+      <w:lvlJc w:val="left"/>
+    </w:lvl>
+    <w:lvl w:ilvl="7" w:tplc="5E4C232E">
+      <w:numFmt w:val="decimal"/>
+      <w:lvlText w:val=""/>
+      <w:lvlJc w:val="left"/>
+    </w:lvl>
+    <w:lvl w:ilvl="8" w:tplc="EADECD70">
+      <w:numFmt w:val="decimal"/>
+      <w:lvlText w:val=""/>
+      <w:lvlJc w:val="left"/>
+    </w:lvl>
+  </w:abstractNum>
+  <w:abstractNum w:abstractNumId="22" w15:restartNumberingAfterBreak="0">
+    <w:nsid w:val="7FD60FCC"/>
+    <w:multiLevelType w:val="hybridMultilevel"/>
+    <w:tmpl w:val="77EADC92"/>
+    <w:lvl w:ilvl="0" w:tplc="04160001">
+      <w:start w:val="1"/>
+      <w:numFmt w:val="bullet"/>
+      <w:lvlText w:val=""/>
+      <w:lvlJc w:val="left"/>
+      <w:pPr>
+        <w:ind w:left="720" w:hanging="360"/>
+      </w:pPr>
+      <w:rPr>
+        <w:rFonts w:ascii="Symbol" w:hAnsi="Symbol" w:hint="default"/>
+      </w:rPr>
+    </w:lvl>
+    <w:lvl w:ilvl="1" w:tplc="A6B02B1A">
+      <w:numFmt w:val="decimal"/>
+      <w:lvlText w:val=""/>
+      <w:lvlJc w:val="left"/>
+    </w:lvl>
+    <w:lvl w:ilvl="2" w:tplc="E0104B56">
+      <w:numFmt w:val="decimal"/>
+      <w:lvlText w:val=""/>
+      <w:lvlJc w:val="left"/>
+    </w:lvl>
+    <w:lvl w:ilvl="3" w:tplc="7C86BCDE">
+      <w:numFmt w:val="decimal"/>
+      <w:lvlText w:val=""/>
+      <w:lvlJc w:val="left"/>
+    </w:lvl>
+    <w:lvl w:ilvl="4" w:tplc="4B9E7C1C">
+      <w:numFmt w:val="decimal"/>
+      <w:lvlText w:val=""/>
+      <w:lvlJc w:val="left"/>
+    </w:lvl>
+    <w:lvl w:ilvl="5" w:tplc="B512EBE8">
+      <w:numFmt w:val="decimal"/>
+      <w:lvlText w:val=""/>
+      <w:lvlJc w:val="left"/>
+    </w:lvl>
+    <w:lvl w:ilvl="6" w:tplc="DD1881E2">
+      <w:numFmt w:val="decimal"/>
+      <w:lvlText w:val=""/>
+      <w:lvlJc w:val="left"/>
+    </w:lvl>
+    <w:lvl w:ilvl="7" w:tplc="5E4C232E">
+      <w:numFmt w:val="decimal"/>
+      <w:lvlText w:val=""/>
+      <w:lvlJc w:val="left"/>
+    </w:lvl>
+    <w:lvl w:ilvl="8" w:tplc="EADECD70">
+      <w:numFmt w:val="decimal"/>
+      <w:lvlText w:val=""/>
+      <w:lvlJc w:val="left"/>
+    </w:lvl>
+  </w:abstractNum>
   <w:num w:numId="1">
-    <w:abstractNumId w:val="1"/>
+    <w:abstractNumId w:val="12"/>
     <w:lvlOverride w:ilvl="0">
       <w:startOverride w:val="1"/>
     </w:lvlOverride>
   </w:num>
   <w:num w:numId="2">
-    <w:abstractNumId w:val="0"/>
+    <w:abstractNumId w:val="11"/>
     <w:lvlOverride w:ilvl="0">
       <w:startOverride w:val="1"/>
     </w:lvlOverride>
+  </w:num>
+  <w:num w:numId="3">
+    <w:abstractNumId w:val="9"/>
+  </w:num>
+  <w:num w:numId="4">
+    <w:abstractNumId w:val="16"/>
+  </w:num>
+  <w:num w:numId="5">
+    <w:abstractNumId w:val="14"/>
+  </w:num>
+  <w:num w:numId="6">
+    <w:abstractNumId w:val="3"/>
+  </w:num>
+  <w:num w:numId="7">
+    <w:abstractNumId w:val="13"/>
+  </w:num>
+  <w:num w:numId="8">
+    <w:abstractNumId w:val="0"/>
+  </w:num>
+  <w:num w:numId="9">
+    <w:abstractNumId w:val="10"/>
+  </w:num>
+  <w:num w:numId="10">
+    <w:abstractNumId w:val="5"/>
+  </w:num>
+  <w:num w:numId="11">
+    <w:abstractNumId w:val="1"/>
+  </w:num>
+  <w:num w:numId="12">
+    <w:abstractNumId w:val="18"/>
+  </w:num>
+  <w:num w:numId="13">
+    <w:abstractNumId w:val="19"/>
+  </w:num>
+  <w:num w:numId="14">
+    <w:abstractNumId w:val="20"/>
+  </w:num>
+  <w:num w:numId="15">
+    <w:abstractNumId w:val="15"/>
+  </w:num>
+  <w:num w:numId="16">
+    <w:abstractNumId w:val="11"/>
+  </w:num>
+  <w:num w:numId="17">
+    <w:abstractNumId w:val="7"/>
+  </w:num>
+  <w:num w:numId="18">
+    <w:abstractNumId w:val="6"/>
+  </w:num>
+  <w:num w:numId="19">
+    <w:abstractNumId w:val="17"/>
+  </w:num>
+  <w:num w:numId="20">
+    <w:abstractNumId w:val="2"/>
+  </w:num>
+  <w:num w:numId="21">
+    <w:abstractNumId w:val="4"/>
+  </w:num>
+  <w:num w:numId="22">
+    <w:abstractNumId w:val="8"/>
+  </w:num>
+  <w:num w:numId="23">
+    <w:abstractNumId w:val="21"/>
+  </w:num>
+  <w:num w:numId="24">
+    <w:abstractNumId w:val="22"/>
   </w:num>
 </w:numbering>
 </file>
@@ -6200,6 +9046,7 @@
   <w:style w:type="paragraph" w:default="1" w:styleId="Normal">
     <w:name w:val="Normal"/>
     <w:qFormat/>
+    <w:rsid w:val="00B208B1"/>
   </w:style>
   <w:style w:type="paragraph" w:styleId="Ttulo1">
     <w:name w:val="heading 1"/>
@@ -6394,6 +9241,18 @@
     <w:rPr>
       <w:sz w:val="20"/>
       <w:szCs w:val="20"/>
+    </w:rPr>
+  </w:style>
+  <w:style w:type="paragraph" w:customStyle="1" w:styleId="code-line">
+    <w:name w:val="code-line"/>
+    <w:basedOn w:val="Normal"/>
+    <w:rsid w:val="00B208B1"/>
+    <w:pPr>
+      <w:spacing w:before="100" w:beforeAutospacing="1" w:after="100" w:afterAutospacing="1"/>
+    </w:pPr>
+    <w:rPr>
+      <w:sz w:val="24"/>
+      <w:szCs w:val="24"/>
     </w:rPr>
   </w:style>
 </w:styles>

</xml_diff>

<commit_message>
Inseridos links de Diagrama de Containers e ADR 002
</commit_message>
<xml_diff>
--- a/docs/Documento de Arquitetura - EduVerse.docx
+++ b/docs/Documento de Arquitetura - EduVerse.docx
@@ -2115,6 +2115,9 @@
       <w:r>
         <w:t xml:space="preserve">Fonte: Elaborado pelo autor (2026). Disponível em: </w:t>
       </w:r>
+      <w:r>
+        <w:t>https://github.com/BraionDLucca/Mini-Projeto-O-Arquiteto-Decisor/blob/main/diagrams/C4%20Model/Diagrama%20de%20Containers%20-%20EduVerse.png</w:t>
+      </w:r>
     </w:p>
     <w:p>
       <w:pPr>
@@ -2757,9 +2760,6 @@
           <w:bottom w:val="thick" w:sz="10" w:space="4" w:color="000000"/>
         </w:pBdr>
         <w:spacing w:before="280" w:after="120" w:line="300" w:lineRule="auto"/>
-        <w:rPr>
-          <w:lang w:val="en-US"/>
-        </w:rPr>
       </w:pPr>
       <w:r>
         <w:rPr>
@@ -2767,11 +2767,11 @@
           <w:color w:val="555555"/>
           <w:sz w:val="22"/>
           <w:szCs w:val="22"/>
-          <w:lang w:val="en-US"/>
         </w:rPr>
         <w:lastRenderedPageBreak/>
         <w:t xml:space="preserve">2.3 </w:t>
       </w:r>
+      <w:proofErr w:type="spellStart"/>
       <w:r>
         <w:rPr>
           <w:rFonts w:ascii="Georgia" w:eastAsia="Georgia" w:hAnsi="Georgia" w:cs="Georgia"/>
@@ -2780,17 +2780,49 @@
           <w:color w:val="000000"/>
           <w:sz w:val="24"/>
           <w:szCs w:val="24"/>
-          <w:lang w:val="en-US"/>
-        </w:rPr>
-        <w:t>Architecture Decision Record (ADR) Principal</w:t>
+        </w:rPr>
+        <w:t>Architecture</w:t>
+      </w:r>
+      <w:proofErr w:type="spellEnd"/>
+      <w:r>
+        <w:rPr>
+          <w:rFonts w:ascii="Georgia" w:eastAsia="Georgia" w:hAnsi="Georgia" w:cs="Georgia"/>
+          <w:b/>
+          <w:bCs/>
+          <w:color w:val="000000"/>
+          <w:sz w:val="24"/>
+          <w:szCs w:val="24"/>
+        </w:rPr>
+        <w:t xml:space="preserve"> </w:t>
+      </w:r>
+      <w:proofErr w:type="spellStart"/>
+      <w:r>
+        <w:rPr>
+          <w:rFonts w:ascii="Georgia" w:eastAsia="Georgia" w:hAnsi="Georgia" w:cs="Georgia"/>
+          <w:b/>
+          <w:bCs/>
+          <w:color w:val="000000"/>
+          <w:sz w:val="24"/>
+          <w:szCs w:val="24"/>
+        </w:rPr>
+        <w:t>Decision</w:t>
+      </w:r>
+      <w:proofErr w:type="spellEnd"/>
+      <w:r>
+        <w:rPr>
+          <w:rFonts w:ascii="Georgia" w:eastAsia="Georgia" w:hAnsi="Georgia" w:cs="Georgia"/>
+          <w:b/>
+          <w:bCs/>
+          <w:color w:val="000000"/>
+          <w:sz w:val="24"/>
+          <w:szCs w:val="24"/>
+        </w:rPr>
+        <w:t xml:space="preserve"> Record (ADR) Principal</w:t>
       </w:r>
     </w:p>
     <w:p>
       <w:pPr>
         <w:spacing w:after="80"/>
-        <w:rPr>
-          <w:lang w:val="en-US"/>
-        </w:rPr>
       </w:pPr>
     </w:p>
     <w:p>
@@ -3455,6 +3487,9 @@
       </w:pPr>
       <w:r>
         <w:t xml:space="preserve">Fonte: Elaborado pelo autor (2026). Disponível em: </w:t>
+      </w:r>
+      <w:r>
+        <w:t>https://github.com/BraionDLucca/Mini-Projeto-O-Arquiteto-Decisor/blob/main/adrs/ADR_002.md</w:t>
       </w:r>
     </w:p>
     <w:p>

</xml_diff>